<commit_message>
Website Admin app, step 1: own accounts, Sign In window and main window
- database/008_website_accounts.sql: website_accounts (unique username
  ignoring case) and website_login_logs, separate from the office users.
- src/Company.WebsiteAdmin: a new WinForms app in the solution. It links
  DbSettings, Db, DatabaseSettingsForm, Responsive and RecordForm from the
  office app (one copy each, same per-PC settings).
- WebsiteAuth: same sign-in rules as the office app (5 wrong passwords
  lock, every attempt logged with the PC name).
- Sign In window; full-screen main window with the signed-in name,
  Sign Out and the six website tabs (empty for now).
16/16 checks on the work PC database; guides and testing log updated.

Co-Authored-By: Claude Opus 5.5 <noreply@anthropic.com>
</commit_message>
<xml_diff>
--- a/docs/Database Guide.docx
+++ b/docs/Database Guide.docx
@@ -40,7 +40,7 @@
       <w:pPr>
         <w:pStyle w:val="NormalWeb"/>
         <w:shd w:val="clear" w:color="auto" w:fill="EEF2F8"/>
-        <w:divId w:val="1085299739"/>
+        <w:divId w:val="1682735045"/>
         <w:rPr>
           <w:rFonts w:ascii="Calibri" w:hAnsi="Calibri" w:cs="Calibri"/>
           <w:color w:val="404040"/>
@@ -71,7 +71,7 @@
           <w:sz w:val="22"/>
           <w:szCs w:val="22"/>
         </w:rPr>
-        <w:t xml:space="preserve">, PostgreSQL 18) as of scripts 001-007: </w:t>
+        <w:t xml:space="preserve">, PostgreSQL 18) as of scripts 001-008: </w:t>
       </w:r>
       <w:r>
         <w:rPr>
@@ -81,7 +81,7 @@
           <w:sz w:val="22"/>
           <w:szCs w:val="22"/>
         </w:rPr>
-        <w:t>28 tables</w:t>
+        <w:t>30 tables</w:t>
       </w:r>
       <w:r>
         <w:rPr>
@@ -4922,6 +4922,114 @@
           </w:p>
         </w:tc>
       </w:tr>
+      <w:tr>
+        <w:tc>
+          <w:tcPr>
+            <w:tcW w:w="0" w:type="auto"/>
+            <w:tcBorders>
+              <w:top w:val="single" w:sz="6" w:space="0" w:color="BFBFBF"/>
+              <w:left w:val="single" w:sz="6" w:space="0" w:color="BFBFBF"/>
+              <w:bottom w:val="single" w:sz="6" w:space="0" w:color="BFBFBF"/>
+              <w:right w:val="single" w:sz="6" w:space="0" w:color="BFBFBF"/>
+            </w:tcBorders>
+            <w:tcMar>
+              <w:top w:w="60" w:type="dxa"/>
+              <w:left w:w="120" w:type="dxa"/>
+              <w:bottom w:w="60" w:type="dxa"/>
+              <w:right w:w="120" w:type="dxa"/>
+            </w:tcMar>
+            <w:hideMark/>
+          </w:tcPr>
+          <w:p>
+            <w:pPr>
+              <w:spacing w:before="120" w:after="120"/>
+              <w:rPr>
+                <w:rFonts w:ascii="Calibri" w:eastAsia="Times New Roman" w:hAnsi="Calibri" w:cs="Calibri"/>
+                <w:color w:val="1A1A1A"/>
+                <w:sz w:val="22"/>
+                <w:szCs w:val="22"/>
+              </w:rPr>
+            </w:pPr>
+            <w:r>
+              <w:rPr>
+                <w:rStyle w:val="HTMLCode"/>
+                <w:color w:val="1A1A1A"/>
+              </w:rPr>
+              <w:t>008_website_accounts.sql</w:t>
+            </w:r>
+          </w:p>
+        </w:tc>
+        <w:tc>
+          <w:tcPr>
+            <w:tcW w:w="0" w:type="auto"/>
+            <w:tcBorders>
+              <w:top w:val="single" w:sz="6" w:space="0" w:color="BFBFBF"/>
+              <w:left w:val="single" w:sz="6" w:space="0" w:color="BFBFBF"/>
+              <w:bottom w:val="single" w:sz="6" w:space="0" w:color="BFBFBF"/>
+              <w:right w:val="single" w:sz="6" w:space="0" w:color="BFBFBF"/>
+            </w:tcBorders>
+            <w:tcMar>
+              <w:top w:w="60" w:type="dxa"/>
+              <w:left w:w="120" w:type="dxa"/>
+              <w:bottom w:w="60" w:type="dxa"/>
+              <w:right w:w="120" w:type="dxa"/>
+            </w:tcMar>
+            <w:hideMark/>
+          </w:tcPr>
+          <w:p>
+            <w:pPr>
+              <w:spacing w:before="120" w:after="120"/>
+              <w:rPr>
+                <w:rFonts w:ascii="Calibri" w:eastAsia="Times New Roman" w:hAnsi="Calibri" w:cs="Calibri"/>
+                <w:color w:val="1A1A1A"/>
+                <w:sz w:val="22"/>
+                <w:szCs w:val="22"/>
+              </w:rPr>
+            </w:pPr>
+            <w:r>
+              <w:rPr>
+                <w:rStyle w:val="HTMLCode"/>
+                <w:color w:val="1A1A1A"/>
+              </w:rPr>
+              <w:t>website_accounts</w:t>
+            </w:r>
+            <w:r>
+              <w:rPr>
+                <w:rFonts w:ascii="Calibri" w:eastAsia="Times New Roman" w:hAnsi="Calibri" w:cs="Calibri"/>
+                <w:color w:val="1A1A1A"/>
+                <w:sz w:val="22"/>
+                <w:szCs w:val="22"/>
+              </w:rPr>
+              <w:t xml:space="preserve">, </w:t>
+            </w:r>
+            <w:r>
+              <w:rPr>
+                <w:rStyle w:val="HTMLCode"/>
+                <w:color w:val="1A1A1A"/>
+              </w:rPr>
+              <w:t>website_login_logs</w:t>
+            </w:r>
+            <w:r>
+              <w:rPr>
+                <w:rFonts w:ascii="Calibri" w:eastAsia="Times New Roman" w:hAnsi="Calibri" w:cs="Calibri"/>
+                <w:color w:val="1A1A1A"/>
+                <w:sz w:val="22"/>
+                <w:szCs w:val="22"/>
+              </w:rPr>
+              <w:t xml:space="preserve"> (the separate Website Admin app'</w:t>
+            </w:r>
+            <w:r>
+              <w:rPr>
+                <w:rFonts w:ascii="Calibri" w:eastAsia="Times New Roman" w:hAnsi="Calibri" w:cs="Calibri"/>
+                <w:color w:val="1A1A1A"/>
+                <w:sz w:val="22"/>
+                <w:szCs w:val="22"/>
+              </w:rPr>
+              <w:t>s own accounts)</w:t>
+            </w:r>
+          </w:p>
+        </w:tc>
+      </w:tr>
     </w:tbl>
     <w:p>
       <w:pPr>
@@ -4949,16 +5057,7 @@
           <w:sz w:val="22"/>
           <w:szCs w:val="22"/>
         </w:rPr>
-        <w:t xml:space="preserve"> (double-click) creates the database if it'</w:t>
-      </w:r>
-      <w:r>
-        <w:rPr>
-          <w:rFonts w:ascii="Calibri" w:hAnsi="Calibri" w:cs="Calibri"/>
-          <w:color w:val="1A1A1A"/>
-          <w:sz w:val="22"/>
-          <w:szCs w:val="22"/>
-        </w:rPr>
-        <w:t xml:space="preserve">s missing, then runs every script that hasn't run yet. The table </w:t>
+        <w:t xml:space="preserve"> (double-click) creates the database if it's missing, then runs every script that hasn't run yet. The table </w:t>
       </w:r>
       <w:r>
         <w:rPr>
@@ -5226,7 +5325,7 @@
           <w:szCs w:val="19"/>
           <w:shd w:val="clear" w:color="auto" w:fill="F2F2F2"/>
         </w:rPr>
-        <w:t>|    -&gt; Services (the rules)    |  ----&gt;   |   28 tables      |</w:t>
+        <w:t>|    -&gt; Services (the rules)    |  ----&gt;   |   30 tables      |</w:t>
       </w:r>
     </w:p>
     <w:p>
@@ -5286,7 +5385,16 @@
           <w:szCs w:val="19"/>
           <w:shd w:val="clear" w:color="auto" w:fill="F2F2F2"/>
         </w:rPr>
-        <w:t>+-------------------------------+          +------------------+</w:t>
+        <w:t xml:space="preserve">+-------------------------------+    </w:t>
+      </w:r>
+      <w:r>
+        <w:rPr>
+          <w:color w:val="1A1A1A"/>
+          <w:sz w:val="19"/>
+          <w:szCs w:val="19"/>
+          <w:shd w:val="clear" w:color="auto" w:fill="F2F2F2"/>
+        </w:rPr>
+        <w:t xml:space="preserve">      +------------------+</w:t>
       </w:r>
     </w:p>
     <w:p>
@@ -5320,16 +5428,7 @@
           <w:sz w:val="22"/>
           <w:szCs w:val="22"/>
         </w:rPr>
-        <w:t xml:space="preserve"> </w:t>
-      </w:r>
-      <w:r>
-        <w:rPr>
-          <w:rFonts w:ascii="Calibri" w:eastAsia="Times New Roman" w:hAnsi="Calibri" w:cs="Calibri"/>
-          <w:color w:val="1A1A1A"/>
-          <w:sz w:val="22"/>
-          <w:szCs w:val="22"/>
-        </w:rPr>
-        <w:t xml:space="preserve">translates between database rows and C# objects. A row in </w:t>
+        <w:t xml:space="preserve"> translates between database rows and C# objects. A row in </w:t>
       </w:r>
       <w:r>
         <w:rPr>
@@ -5500,7 +5599,16 @@
           <w:sz w:val="22"/>
           <w:szCs w:val="22"/>
         </w:rPr>
-        <w:t xml:space="preserve"> will never talk to the database directly. It will go through the </w:t>
+        <w:t xml:space="preserve"> </w:t>
+      </w:r>
+      <w:r>
+        <w:rPr>
+          <w:rFonts w:ascii="Calibri" w:eastAsia="Times New Roman" w:hAnsi="Calibri" w:cs="Calibri"/>
+          <w:color w:val="1A1A1A"/>
+          <w:sz w:val="22"/>
+          <w:szCs w:val="22"/>
+        </w:rPr>
+        <w:t xml:space="preserve">will never talk to the database directly. It will go through the </w:t>
       </w:r>
       <w:r>
         <w:rPr>
@@ -6103,16 +6211,7 @@
           <w:sz w:val="22"/>
           <w:szCs w:val="22"/>
         </w:rPr>
-        <w:t xml:space="preserve"> stored inside the database. They'</w:t>
-      </w:r>
-      <w:r>
-        <w:rPr>
-          <w:rFonts w:ascii="Calibri" w:hAnsi="Calibri" w:cs="Calibri"/>
-          <w:color w:val="1A1A1A"/>
-          <w:sz w:val="22"/>
-          <w:szCs w:val="22"/>
-        </w:rPr>
-        <w:t xml:space="preserve">re copied into a storage folder (its location is in </w:t>
+        <w:t xml:space="preserve"> stored inside the database. They're copied into a storage folder (its location is in </w:t>
       </w:r>
       <w:r>
         <w:rPr>
@@ -6213,7 +6312,7 @@
           <w:sz w:val="22"/>
           <w:szCs w:val="22"/>
         </w:rPr>
-        <w:t>28 tables in 7 groups:</w:t>
+        <w:t>30 tables in 8 groups:</w:t>
       </w:r>
     </w:p>
     <w:tbl>
@@ -6228,8 +6327,8 @@
         <w:tblLook w:val="04A0" w:firstRow="1" w:lastRow="0" w:firstColumn="1" w:lastColumn="0" w:noHBand="0" w:noVBand="1"/>
       </w:tblPr>
       <w:tblGrid>
-        <w:gridCol w:w="1639"/>
-        <w:gridCol w:w="7705"/>
+        <w:gridCol w:w="1809"/>
+        <w:gridCol w:w="7535"/>
       </w:tblGrid>
       <w:tr>
         <w:trPr>
@@ -7135,6 +7234,98 @@
                 <w:sz w:val="22"/>
                 <w:szCs w:val="22"/>
               </w:rPr>
+              <w:t>Website Admin app</w:t>
+            </w:r>
+          </w:p>
+        </w:tc>
+        <w:tc>
+          <w:tcPr>
+            <w:tcW w:w="0" w:type="auto"/>
+            <w:tcBorders>
+              <w:top w:val="single" w:sz="6" w:space="0" w:color="BFBFBF"/>
+              <w:left w:val="single" w:sz="6" w:space="0" w:color="BFBFBF"/>
+              <w:bottom w:val="single" w:sz="6" w:space="0" w:color="BFBFBF"/>
+              <w:right w:val="single" w:sz="6" w:space="0" w:color="BFBFBF"/>
+            </w:tcBorders>
+            <w:tcMar>
+              <w:top w:w="60" w:type="dxa"/>
+              <w:left w:w="120" w:type="dxa"/>
+              <w:bottom w:w="60" w:type="dxa"/>
+              <w:right w:w="120" w:type="dxa"/>
+            </w:tcMar>
+            <w:hideMark/>
+          </w:tcPr>
+          <w:p>
+            <w:pPr>
+              <w:spacing w:before="120" w:after="120"/>
+              <w:rPr>
+                <w:rFonts w:ascii="Calibri" w:eastAsia="Times New Roman" w:hAnsi="Calibri" w:cs="Calibri"/>
+                <w:color w:val="1A1A1A"/>
+                <w:sz w:val="22"/>
+                <w:szCs w:val="22"/>
+              </w:rPr>
+            </w:pPr>
+            <w:r>
+              <w:rPr>
+                <w:rStyle w:val="HTMLCode"/>
+                <w:color w:val="1A1A1A"/>
+              </w:rPr>
+              <w:t>website_accounts</w:t>
+            </w:r>
+            <w:r>
+              <w:rPr>
+                <w:rFonts w:ascii="Calibri" w:eastAsia="Times New Roman" w:hAnsi="Calibri" w:cs="Calibri"/>
+                <w:color w:val="1A1A1A"/>
+                <w:sz w:val="22"/>
+                <w:szCs w:val="22"/>
+              </w:rPr>
+              <w:t xml:space="preserve">, </w:t>
+            </w:r>
+            <w:r>
+              <w:rPr>
+                <w:rStyle w:val="HTMLCode"/>
+                <w:color w:val="1A1A1A"/>
+              </w:rPr>
+              <w:t>website_login_logs</w:t>
+            </w:r>
+          </w:p>
+        </w:tc>
+      </w:tr>
+      <w:tr>
+        <w:tc>
+          <w:tcPr>
+            <w:tcW w:w="0" w:type="auto"/>
+            <w:tcBorders>
+              <w:top w:val="single" w:sz="6" w:space="0" w:color="BFBFBF"/>
+              <w:left w:val="single" w:sz="6" w:space="0" w:color="BFBFBF"/>
+              <w:bottom w:val="single" w:sz="6" w:space="0" w:color="BFBFBF"/>
+              <w:right w:val="single" w:sz="6" w:space="0" w:color="BFBFBF"/>
+            </w:tcBorders>
+            <w:tcMar>
+              <w:top w:w="60" w:type="dxa"/>
+              <w:left w:w="120" w:type="dxa"/>
+              <w:bottom w:w="60" w:type="dxa"/>
+              <w:right w:w="120" w:type="dxa"/>
+            </w:tcMar>
+            <w:hideMark/>
+          </w:tcPr>
+          <w:p>
+            <w:pPr>
+              <w:spacing w:before="120" w:after="120"/>
+              <w:rPr>
+                <w:rFonts w:ascii="Calibri" w:eastAsia="Times New Roman" w:hAnsi="Calibri" w:cs="Calibri"/>
+                <w:color w:val="1A1A1A"/>
+                <w:sz w:val="22"/>
+                <w:szCs w:val="22"/>
+              </w:rPr>
+            </w:pPr>
+            <w:r>
+              <w:rPr>
+                <w:rFonts w:ascii="Calibri" w:eastAsia="Times New Roman" w:hAnsi="Calibri" w:cs="Calibri"/>
+                <w:color w:val="1A1A1A"/>
+                <w:sz w:val="22"/>
+                <w:szCs w:val="22"/>
+              </w:rPr>
               <w:t>System</w:t>
             </w:r>
           </w:p>
@@ -7249,48 +7440,48 @@
           <w:szCs w:val="19"/>
           <w:shd w:val="clear" w:color="auto" w:fill="F2F2F2"/>
         </w:rPr>
-        <w:t xml:space="preserve">                         +-----------+</w:t>
-      </w:r>
-    </w:p>
-    <w:p>
-      <w:pPr>
-        <w:pStyle w:val="HTMLPreformatted"/>
+        <w:t xml:space="preserve">   </w:t>
+      </w:r>
+      <w:r>
         <w:rPr>
           <w:color w:val="1A1A1A"/>
           <w:sz w:val="19"/>
           <w:szCs w:val="19"/>
           <w:shd w:val="clear" w:color="auto" w:fill="F2F2F2"/>
         </w:rPr>
-      </w:pPr>
-      <w:r>
+        <w:t xml:space="preserve">                      +-----------+</w:t>
+      </w:r>
+    </w:p>
+    <w:p>
+      <w:pPr>
+        <w:pStyle w:val="HTMLPreformatted"/>
         <w:rPr>
           <w:color w:val="1A1A1A"/>
           <w:sz w:val="19"/>
           <w:szCs w:val="19"/>
           <w:shd w:val="clear" w:color="auto" w:fill="F2F2F2"/>
         </w:rPr>
-        <w:t xml:space="preserve">   material_usages ----&gt; |           | &lt;---- receipts</w:t>
-      </w:r>
-    </w:p>
-    <w:p>
-      <w:pPr>
-        <w:pStyle w:val="HTMLPreformatted"/>
+      </w:pPr>
+      <w:r>
         <w:rPr>
           <w:color w:val="1A1A1A"/>
           <w:sz w:val="19"/>
           <w:szCs w:val="19"/>
           <w:shd w:val="clear" w:color="auto" w:fill="F2F2F2"/>
         </w:rPr>
-      </w:pPr>
-      <w:r>
+        <w:t xml:space="preserve">   material_usages ----&gt; |           | &lt;---- receipts</w:t>
+      </w:r>
+    </w:p>
+    <w:p>
+      <w:pPr>
+        <w:pStyle w:val="HTMLPreformatted"/>
         <w:rPr>
           <w:color w:val="1A1A1A"/>
           <w:sz w:val="19"/>
           <w:szCs w:val="19"/>
           <w:shd w:val="clear" w:color="auto" w:fill="F2F2F2"/>
         </w:rPr>
-        <w:t xml:space="preserve">   </w:t>
-      </w:r>
+      </w:pPr>
       <w:r>
         <w:rPr>
           <w:color w:val="1A1A1A"/>
@@ -7298,7 +7489,7 @@
           <w:szCs w:val="19"/>
           <w:shd w:val="clear" w:color="auto" w:fill="F2F2F2"/>
         </w:rPr>
-        <w:t>sub_jobs -----------&gt; | projects  | &lt;---- change_orders</w:t>
+        <w:t xml:space="preserve">   sub_jobs -----------&gt; | projects  | &lt;---- change_orders</w:t>
       </w:r>
     </w:p>
     <w:p>
@@ -8375,16 +8566,7 @@
                 <w:sz w:val="22"/>
                 <w:szCs w:val="22"/>
               </w:rPr>
-              <w:t xml:space="preserve">Admins' </w:t>
-            </w:r>
-            <w:r>
-              <w:rPr>
-                <w:rFonts w:ascii="Calibri" w:eastAsia="Times New Roman" w:hAnsi="Calibri" w:cs="Calibri"/>
-                <w:color w:val="1A1A1A"/>
-                <w:sz w:val="22"/>
-                <w:szCs w:val="22"/>
-              </w:rPr>
-              <w:t>password recovery; the answer is scrambled like a password</w:t>
+              <w:t>Admins' password recovery; the answer is scrambled like a password</w:t>
             </w:r>
           </w:p>
         </w:tc>
@@ -8527,7 +8709,16 @@
           <w:sz w:val="22"/>
           <w:szCs w:val="22"/>
         </w:rPr>
-        <w:t xml:space="preserve">One row per sign-in, sign-out, idle sign-out, failed attempt, lock, unlock, password change or password request: </w:t>
+        <w:t>One row per sign-in, sign-out, idle sign</w:t>
+      </w:r>
+      <w:r>
+        <w:rPr>
+          <w:rFonts w:ascii="Calibri" w:hAnsi="Calibri" w:cs="Calibri"/>
+          <w:color w:val="1A1A1A"/>
+          <w:sz w:val="22"/>
+          <w:szCs w:val="22"/>
+        </w:rPr>
+        <w:t xml:space="preserve">-out, failed attempt, lock, unlock, password change or password request: </w:t>
       </w:r>
       <w:r>
         <w:rPr>
@@ -8591,16 +8782,7 @@
           <w:sz w:val="22"/>
           <w:szCs w:val="22"/>
         </w:rPr>
-        <w:t>,</w:t>
-      </w:r>
-      <w:r>
-        <w:rPr>
-          <w:rFonts w:ascii="Calibri" w:hAnsi="Calibri" w:cs="Calibri"/>
-          <w:color w:val="1A1A1A"/>
-          <w:sz w:val="22"/>
-          <w:szCs w:val="22"/>
-        </w:rPr>
-        <w:t xml:space="preserve"> </w:t>
+        <w:t xml:space="preserve">, </w:t>
       </w:r>
       <w:r>
         <w:rPr>
@@ -8633,6 +8815,235 @@
           <w:szCs w:val="22"/>
         </w:rPr>
         <w:t>. The Dashboard's Log History reads this table.</w:t>
+      </w:r>
+    </w:p>
+    <w:p>
+      <w:pPr>
+        <w:pStyle w:val="Heading2"/>
+        <w:rPr>
+          <w:rFonts w:ascii="Calibri" w:eastAsia="Times New Roman" w:hAnsi="Calibri" w:cs="Calibri"/>
+        </w:rPr>
+      </w:pPr>
+      <w:r>
+        <w:rPr>
+          <w:rFonts w:ascii="Calibri" w:eastAsia="Times New Roman" w:hAnsi="Calibri" w:cs="Calibri"/>
+        </w:rPr>
+        <w:t>website_accounts and website_login_logs: the Website Admin app's own sign-in</w:t>
+      </w:r>
+    </w:p>
+    <w:p>
+      <w:pPr>
+        <w:pStyle w:val="NormalWeb"/>
+        <w:rPr>
+          <w:rFonts w:ascii="Calibri" w:hAnsi="Calibri" w:cs="Calibri"/>
+          <w:color w:val="1A1A1A"/>
+          <w:sz w:val="22"/>
+          <w:szCs w:val="22"/>
+        </w:rPr>
+      </w:pPr>
+      <w:r>
+        <w:rPr>
+          <w:rFonts w:ascii="Calibri" w:hAnsi="Calibri" w:cs="Calibri"/>
+          <w:color w:val="1A1A1A"/>
+          <w:sz w:val="22"/>
+          <w:szCs w:val="22"/>
+        </w:rPr>
+        <w:t xml:space="preserve">The separate Website Admin app has its </w:t>
+      </w:r>
+      <w:r>
+        <w:rPr>
+          <w:rStyle w:val="Strong"/>
+          <w:rFonts w:ascii="Calibri" w:hAnsi="Calibri" w:cs="Calibri"/>
+          <w:color w:val="1A1A1A"/>
+          <w:sz w:val="22"/>
+          <w:szCs w:val="22"/>
+        </w:rPr>
+        <w:t>own</w:t>
+      </w:r>
+      <w:r>
+        <w:rPr>
+          <w:rFonts w:ascii="Calibri" w:hAnsi="Calibri" w:cs="Calibri"/>
+          <w:color w:val="1A1A1A"/>
+          <w:sz w:val="22"/>
+          <w:szCs w:val="22"/>
+        </w:rPr>
+        <w:t xml:space="preserve"> accounts, not the office app's </w:t>
+      </w:r>
+      <w:r>
+        <w:rPr>
+          <w:rStyle w:val="HTMLCode"/>
+          <w:color w:val="1A1A1A"/>
+        </w:rPr>
+        <w:t>users</w:t>
+      </w:r>
+      <w:r>
+        <w:rPr>
+          <w:rFonts w:ascii="Calibri" w:hAnsi="Calibri" w:cs="Calibri"/>
+          <w:color w:val="1A1A1A"/>
+          <w:sz w:val="22"/>
+          <w:szCs w:val="22"/>
+        </w:rPr>
+        <w:t xml:space="preserve">. </w:t>
+      </w:r>
+      <w:r>
+        <w:rPr>
+          <w:rStyle w:val="HTMLCode"/>
+          <w:color w:val="1A1A1A"/>
+        </w:rPr>
+        <w:t>website_accounts</w:t>
+      </w:r>
+      <w:r>
+        <w:rPr>
+          <w:rFonts w:ascii="Calibri" w:hAnsi="Calibri" w:cs="Calibri"/>
+          <w:color w:val="1A1A1A"/>
+          <w:sz w:val="22"/>
+          <w:szCs w:val="22"/>
+        </w:rPr>
+        <w:t xml:space="preserve"> holds </w:t>
+      </w:r>
+      <w:r>
+        <w:rPr>
+          <w:rStyle w:val="HTMLCode"/>
+          <w:color w:val="1A1A1A"/>
+        </w:rPr>
+        <w:t>username</w:t>
+      </w:r>
+      <w:r>
+        <w:rPr>
+          <w:rFonts w:ascii="Calibri" w:hAnsi="Calibri" w:cs="Calibri"/>
+          <w:color w:val="1A1A1A"/>
+          <w:sz w:val="22"/>
+          <w:szCs w:val="22"/>
+        </w:rPr>
+        <w:t xml:space="preserve"> (unique ignoring capital letters, through a unique index on </w:t>
+      </w:r>
+      <w:r>
+        <w:rPr>
+          <w:rStyle w:val="HTMLCode"/>
+          <w:color w:val="1A1A1A"/>
+        </w:rPr>
+        <w:t>LOWER(username)</w:t>
+      </w:r>
+      <w:r>
+        <w:rPr>
+          <w:rFonts w:ascii="Calibri" w:hAnsi="Calibri" w:cs="Calibri"/>
+          <w:color w:val="1A1A1A"/>
+          <w:sz w:val="22"/>
+          <w:szCs w:val="22"/>
+        </w:rPr>
+        <w:t xml:space="preserve">), </w:t>
+      </w:r>
+      <w:r>
+        <w:rPr>
+          <w:rStyle w:val="HTMLCode"/>
+          <w:color w:val="1A1A1A"/>
+        </w:rPr>
+        <w:t>password_hash</w:t>
+      </w:r>
+      <w:r>
+        <w:rPr>
+          <w:rFonts w:ascii="Calibri" w:hAnsi="Calibri" w:cs="Calibri"/>
+          <w:color w:val="1A1A1A"/>
+          <w:sz w:val="22"/>
+          <w:szCs w:val="22"/>
+        </w:rPr>
+        <w:t xml:space="preserve"> (bcrypt), </w:t>
+      </w:r>
+      <w:r>
+        <w:rPr>
+          <w:rStyle w:val="HTMLCode"/>
+          <w:color w:val="1A1A1A"/>
+        </w:rPr>
+        <w:t>full_name</w:t>
+      </w:r>
+      <w:r>
+        <w:rPr>
+          <w:rFonts w:ascii="Calibri" w:hAnsi="Calibri" w:cs="Calibri"/>
+          <w:color w:val="1A1A1A"/>
+          <w:sz w:val="22"/>
+          <w:szCs w:val="22"/>
+        </w:rPr>
+        <w:t xml:space="preserve">, </w:t>
+      </w:r>
+      <w:r>
+        <w:rPr>
+          <w:rStyle w:val="HTMLCode"/>
+          <w:color w:val="1A1A1A"/>
+        </w:rPr>
+        <w:t>status</w:t>
+      </w:r>
+      <w:r>
+        <w:rPr>
+          <w:rFonts w:ascii="Calibri" w:hAnsi="Calibri" w:cs="Calibri"/>
+          <w:color w:val="1A1A1A"/>
+          <w:sz w:val="22"/>
+          <w:szCs w:val="22"/>
+        </w:rPr>
+        <w:t xml:space="preserve"> (Active / Locked / Disabled), </w:t>
+      </w:r>
+      <w:r>
+        <w:rPr>
+          <w:rStyle w:val="HTMLCode"/>
+          <w:color w:val="1A1A1A"/>
+        </w:rPr>
+        <w:t>failed_login_count</w:t>
+      </w:r>
+      <w:r>
+        <w:rPr>
+          <w:rFonts w:ascii="Calibri" w:hAnsi="Calibri" w:cs="Calibri"/>
+          <w:color w:val="1A1A1A"/>
+          <w:sz w:val="22"/>
+          <w:szCs w:val="22"/>
+        </w:rPr>
+        <w:t xml:space="preserve">, </w:t>
+      </w:r>
+      <w:r>
+        <w:rPr>
+          <w:rStyle w:val="HTMLCode"/>
+          <w:color w:val="1A1A1A"/>
+        </w:rPr>
+        <w:t>last_login_at</w:t>
+      </w:r>
+      <w:r>
+        <w:rPr>
+          <w:rFonts w:ascii="Calibri" w:hAnsi="Calibri" w:cs="Calibri"/>
+          <w:color w:val="1A1A1A"/>
+          <w:sz w:val="22"/>
+          <w:szCs w:val="22"/>
+        </w:rPr>
+        <w:t xml:space="preserve">. </w:t>
+      </w:r>
+      <w:r>
+        <w:rPr>
+          <w:rStyle w:val="HTMLCode"/>
+          <w:color w:val="1A1A1A"/>
+        </w:rPr>
+        <w:t>website_login_logs</w:t>
+      </w:r>
+      <w:r>
+        <w:rPr>
+          <w:rFonts w:ascii="Calibri" w:hAnsi="Calibri" w:cs="Calibri"/>
+          <w:color w:val="1A1A1A"/>
+          <w:sz w:val="22"/>
+          <w:szCs w:val="22"/>
+        </w:rPr>
+        <w:t xml:space="preserve"> is its sign-in diary, built like </w:t>
+      </w:r>
+      <w:r>
+        <w:rPr>
+          <w:rStyle w:val="HTMLCode"/>
+          <w:color w:val="1A1A1A"/>
+        </w:rPr>
+        <w:t>login_logs</w:t>
+      </w:r>
+      <w:r>
+        <w:rPr>
+          <w:rFonts w:ascii="Calibri" w:hAnsi="Calibri" w:cs="Calibri"/>
+          <w:color w:val="1A1A1A"/>
+          <w:sz w:val="22"/>
+          <w:szCs w:val="22"/>
+        </w:rPr>
+        <w:t>. Nothing links the two account tables, so an office login can't sign in to the Website Admin app.</w:t>
       </w:r>
     </w:p>
     <w:p>
@@ -9420,7 +9831,16 @@
           <w:sz w:val="22"/>
           <w:szCs w:val="22"/>
         </w:rPr>
-        <w:t xml:space="preserve"> (yes/no), </w:t>
+        <w:t xml:space="preserve"> </w:t>
+      </w:r>
+      <w:r>
+        <w:rPr>
+          <w:rFonts w:ascii="Calibri" w:hAnsi="Calibri" w:cs="Calibri"/>
+          <w:color w:val="1A1A1A"/>
+          <w:sz w:val="22"/>
+          <w:szCs w:val="22"/>
+        </w:rPr>
+        <w:t xml:space="preserve">(yes/no), </w:t>
       </w:r>
       <w:r>
         <w:rPr>
@@ -9557,25 +9977,7 @@
           <w:sz w:val="22"/>
           <w:szCs w:val="22"/>
         </w:rPr>
-        <w:t xml:space="preserve"> </w:t>
-      </w:r>
-      <w:r>
-        <w:rPr>
-          <w:rFonts w:ascii="Calibri" w:hAnsi="Calibri" w:cs="Calibri"/>
-          <w:color w:val="1A1A1A"/>
-          <w:sz w:val="22"/>
-          <w:szCs w:val="22"/>
-        </w:rPr>
-        <w:t>→ employees,</w:t>
-      </w:r>
-      <w:r>
-        <w:rPr>
-          <w:rFonts w:ascii="Calibri" w:hAnsi="Calibri" w:cs="Calibri"/>
-          <w:color w:val="1A1A1A"/>
-          <w:sz w:val="22"/>
-          <w:szCs w:val="22"/>
-        </w:rPr>
-        <w:t xml:space="preserve"> </w:t>
+        <w:t xml:space="preserve"> → employees, </w:t>
       </w:r>
       <w:r>
         <w:rPr>
@@ -9890,16 +10292,7 @@
           <w:szCs w:val="19"/>
           <w:shd w:val="clear" w:color="auto" w:fill="F2F2F2"/>
         </w:rPr>
-        <w:t xml:space="preserve">   |---- quotes ----&gt; materials &lt;</w:t>
-      </w:r>
-      <w:r>
-        <w:rPr>
-          <w:color w:val="1A1A1A"/>
-          <w:sz w:val="19"/>
-          <w:szCs w:val="19"/>
-          <w:shd w:val="clear" w:color="auto" w:fill="F2F2F2"/>
-        </w:rPr>
-        <w:t>---- material_usages ----&gt; projects</w:t>
+        <w:t xml:space="preserve">   |---- quotes ----&gt; materials &lt;---- material_usages ----&gt; projects</w:t>
       </w:r>
     </w:p>
     <w:p>
@@ -11373,7 +11766,16 @@
                 <w:sz w:val="22"/>
                 <w:szCs w:val="22"/>
               </w:rPr>
-              <w:t xml:space="preserve"> (Preventive / Repair), work done, </w:t>
+              <w:t xml:space="preserve"> </w:t>
+            </w:r>
+            <w:r>
+              <w:rPr>
+                <w:rFonts w:ascii="Calibri" w:eastAsia="Times New Roman" w:hAnsi="Calibri" w:cs="Calibri"/>
+                <w:color w:val="1A1A1A"/>
+                <w:sz w:val="22"/>
+                <w:szCs w:val="22"/>
+              </w:rPr>
+              <w:t xml:space="preserve">(Preventive / Repair), work done, </w:t>
             </w:r>
             <w:r>
               <w:rPr>
@@ -11657,68 +12059,68 @@
           <w:szCs w:val="19"/>
           <w:shd w:val="clear" w:color="auto" w:fill="F2F2F2"/>
         </w:rPr>
-        <w:t xml:space="preserve">   sub_jobs ----&gt; projects</w:t>
-      </w:r>
-    </w:p>
-    <w:p>
-      <w:pPr>
-        <w:pStyle w:val="HTMLPreformatted"/>
+        <w:t xml:space="preserve">   sub_jobs ----&gt; </w:t>
+      </w:r>
+      <w:r>
         <w:rPr>
           <w:color w:val="1A1A1A"/>
           <w:sz w:val="19"/>
           <w:szCs w:val="19"/>
           <w:shd w:val="clear" w:color="auto" w:fill="F2F2F2"/>
         </w:rPr>
-      </w:pPr>
-      <w:r>
+        <w:t>projects</w:t>
+      </w:r>
+    </w:p>
+    <w:p>
+      <w:pPr>
+        <w:pStyle w:val="HTMLPreformatted"/>
         <w:rPr>
           <w:color w:val="1A1A1A"/>
           <w:sz w:val="19"/>
           <w:szCs w:val="19"/>
           <w:shd w:val="clear" w:color="auto" w:fill="F2F2F2"/>
         </w:rPr>
-        <w:t xml:space="preserve">      ^</w:t>
-      </w:r>
-    </w:p>
-    <w:p>
-      <w:pPr>
-        <w:pStyle w:val="HTMLPreformatted"/>
+      </w:pPr>
+      <w:r>
         <w:rPr>
           <w:color w:val="1A1A1A"/>
           <w:sz w:val="19"/>
           <w:szCs w:val="19"/>
           <w:shd w:val="clear" w:color="auto" w:fill="F2F2F2"/>
         </w:rPr>
-      </w:pPr>
-      <w:r>
+        <w:t xml:space="preserve">      ^</w:t>
+      </w:r>
+    </w:p>
+    <w:p>
+      <w:pPr>
+        <w:pStyle w:val="HTMLPreformatted"/>
         <w:rPr>
           <w:color w:val="1A1A1A"/>
           <w:sz w:val="19"/>
           <w:szCs w:val="19"/>
           <w:shd w:val="clear" w:color="auto" w:fill="F2F2F2"/>
         </w:rPr>
-        <w:t xml:space="preserve">      |--- sub_job_stages &lt;--- sub_vouchers &lt;--- sub_payouts</w:t>
-      </w:r>
-    </w:p>
-    <w:p>
-      <w:pPr>
-        <w:pStyle w:val="HTMLPreformatted"/>
+      </w:pPr>
+      <w:r>
         <w:rPr>
           <w:color w:val="1A1A1A"/>
           <w:sz w:val="19"/>
           <w:szCs w:val="19"/>
           <w:shd w:val="clear" w:color="auto" w:fill="F2F2F2"/>
         </w:rPr>
-      </w:pPr>
-      <w:r>
+        <w:t xml:space="preserve">      |--- sub_job_stages &lt;--- sub_vouchers &lt;--- sub_payouts</w:t>
+      </w:r>
+    </w:p>
+    <w:p>
+      <w:pPr>
+        <w:pStyle w:val="HTMLPreformatted"/>
         <w:rPr>
           <w:color w:val="1A1A1A"/>
           <w:sz w:val="19"/>
           <w:szCs w:val="19"/>
           <w:shd w:val="clear" w:color="auto" w:fill="F2F2F2"/>
         </w:rPr>
-        <w:t xml:space="preserve">  </w:t>
-      </w:r>
+      </w:pPr>
       <w:r>
         <w:rPr>
           <w:color w:val="1A1A1A"/>
@@ -11726,7 +12128,7 @@
           <w:szCs w:val="19"/>
           <w:shd w:val="clear" w:color="auto" w:fill="F2F2F2"/>
         </w:rPr>
-        <w:t xml:space="preserve">    |--- sub_job_documents       |</w:t>
+        <w:t xml:space="preserve">      |--- sub_job_documents       |</w:t>
       </w:r>
     </w:p>
     <w:p>
@@ -13490,7 +13892,16 @@
           <w:sz w:val="22"/>
           <w:szCs w:val="22"/>
         </w:rPr>
-        <w:t xml:space="preserve"> The Receipt Vault reads delivery receipts straight from </w:t>
+        <w:t xml:space="preserve"> </w:t>
+      </w:r>
+      <w:r>
+        <w:rPr>
+          <w:rFonts w:ascii="Calibri" w:hAnsi="Calibri" w:cs="Calibri"/>
+          <w:color w:val="1A1A1A"/>
+          <w:sz w:val="22"/>
+          <w:szCs w:val="22"/>
+        </w:rPr>
+        <w:t xml:space="preserve">The Receipt Vault reads delivery receipts straight from </w:t>
       </w:r>
       <w:r>
         <w:rPr>
@@ -13506,16 +13917,7 @@
           <w:sz w:val="22"/>
           <w:szCs w:val="22"/>
         </w:rPr>
-        <w:t xml:space="preserve"> and shows them as "Stock purchase"</w:t>
-      </w:r>
-      <w:r>
-        <w:rPr>
-          <w:rFonts w:ascii="Calibri" w:hAnsi="Calibri" w:cs="Calibri"/>
-          <w:color w:val="1A1A1A"/>
-          <w:sz w:val="22"/>
-          <w:szCs w:val="22"/>
-        </w:rPr>
-        <w:t>. Storing them once means they can never be counted twice.</w:t>
+        <w:t xml:space="preserve"> and shows them as "Stock purchase". Storing them once means they can never be counted twice.</w:t>
       </w:r>
     </w:p>
     <w:p>
@@ -14740,28 +15142,28 @@
           <w:szCs w:val="19"/>
           <w:shd w:val="clear" w:color="auto" w:fill="F2F2F2"/>
         </w:rPr>
-        <w:t xml:space="preserve">                 WHERE r.project_id = p.project_id AND r.status = 'Approved'), 0)</w:t>
-      </w:r>
-    </w:p>
-    <w:p>
-      <w:pPr>
-        <w:pStyle w:val="HTMLPreformatted"/>
+        <w:t xml:space="preserve">                 </w:t>
+      </w:r>
+      <w:r>
         <w:rPr>
           <w:color w:val="1A1A1A"/>
           <w:sz w:val="19"/>
           <w:szCs w:val="19"/>
           <w:shd w:val="clear" w:color="auto" w:fill="F2F2F2"/>
         </w:rPr>
-      </w:pPr>
-      <w:r>
+        <w:t>WHERE r.project_id = p.project_id AND r.status = 'Approved'), 0)</w:t>
+      </w:r>
+    </w:p>
+    <w:p>
+      <w:pPr>
+        <w:pStyle w:val="HTMLPreformatted"/>
         <w:rPr>
           <w:color w:val="1A1A1A"/>
           <w:sz w:val="19"/>
           <w:szCs w:val="19"/>
           <w:shd w:val="clear" w:color="auto" w:fill="F2F2F2"/>
         </w:rPr>
-        <w:t xml:space="preserve">     </w:t>
-      </w:r>
+      </w:pPr>
       <w:r>
         <w:rPr>
           <w:color w:val="1A1A1A"/>
@@ -14769,7 +15171,7 @@
           <w:szCs w:val="19"/>
           <w:shd w:val="clear" w:color="auto" w:fill="F2F2F2"/>
         </w:rPr>
-        <w:t>+ COALESCE((SELECT SUM(o.amount) FROM sub_payouts o JOIN sub_jobs j ON j.job_id = o.job_id</w:t>
+        <w:t xml:space="preserve">     + COALESCE((SELECT SUM(o.amount) FROM sub_payouts o JOIN sub_jobs j ON j.job_id = o.job_id</w:t>
       </w:r>
     </w:p>
     <w:p>
@@ -15663,16 +16065,7 @@
           <w:sz w:val="22"/>
           <w:szCs w:val="22"/>
         </w:rPr>
-        <w:t xml:space="preserve"> </w:t>
-      </w:r>
-      <w:r>
-        <w:rPr>
-          <w:rFonts w:ascii="Calibri" w:eastAsia="Times New Roman" w:hAnsi="Calibri" w:cs="Calibri"/>
-          <w:color w:val="1A1A1A"/>
-          <w:sz w:val="22"/>
-          <w:szCs w:val="22"/>
-        </w:rPr>
-        <w:t>process (0, the Desktop Management Supersystem), surrounded by the outside world: the Admin user, employees, the biometrics device, clients, subcontractors, suppliers/vendors, external accounting and the website system.</w:t>
+        <w:t xml:space="preserve"> process (0, the Desktop Management Supersystem), surrounded by the outside world: the Admin user, employees, the biometrics device, clients, subcontractors, suppliers/vendors, external accounting and the website system.</w:t>
       </w:r>
     </w:p>
     <w:p>
@@ -16283,16 +16676,7 @@
                 <w:sz w:val="22"/>
                 <w:szCs w:val="22"/>
               </w:rPr>
-              <w:t xml:space="preserve">Subcontractor &amp; </w:t>
-            </w:r>
-            <w:r>
-              <w:rPr>
-                <w:rFonts w:ascii="Calibri" w:eastAsia="Times New Roman" w:hAnsi="Calibri" w:cs="Calibri"/>
-                <w:color w:val="1A1A1A"/>
-                <w:sz w:val="22"/>
-                <w:szCs w:val="22"/>
-              </w:rPr>
-              <w:t>Vendor Management</w:t>
+              <w:t>Subcontractor &amp; Vendor Management</w:t>
             </w:r>
           </w:p>
         </w:tc>
@@ -18193,16 +18577,7 @@
                 <w:sz w:val="22"/>
                 <w:szCs w:val="22"/>
               </w:rPr>
-              <w:t xml:space="preserve"> </w:t>
-            </w:r>
-            <w:r>
-              <w:rPr>
-                <w:rFonts w:ascii="Calibri" w:eastAsia="Times New Roman" w:hAnsi="Calibri" w:cs="Calibri"/>
-                <w:color w:val="1A1A1A"/>
-                <w:sz w:val="22"/>
-                <w:szCs w:val="22"/>
-              </w:rPr>
-              <w:t xml:space="preserve">(+ delivery receipts read from </w:t>
+              <w:t xml:space="preserve"> (+ delivery receipts read from </w:t>
             </w:r>
             <w:r>
               <w:rPr>
@@ -18521,16 +18896,16 @@
           <w:sz w:val="22"/>
           <w:szCs w:val="22"/>
         </w:rPr>
-        <w:t xml:space="preserve"> the DFD was drawn before some decisions were made. Site deployment tracking and subcontractor ratings were dropped, and the DFD's "approved / pending / denied" account statuses became A</w:t>
-      </w:r>
-      <w:r>
-        <w:rPr>
-          <w:rFonts w:ascii="Calibri" w:hAnsi="Calibri" w:cs="Calibri"/>
-          <w:color w:val="1A1A1A"/>
-          <w:sz w:val="22"/>
-          <w:szCs w:val="22"/>
-        </w:rPr>
-        <w:t>ctive / Locked / Disabled. If the DFD is used for a presentation, update those parts so it matches.</w:t>
+        <w:t xml:space="preserve"> the DFD was drawn before some decisions were made. Site deployment tracking and subcontractor ratings were dropped, and the DFD's "approved / pending / denied" </w:t>
+      </w:r>
+      <w:r>
+        <w:rPr>
+          <w:rFonts w:ascii="Calibri" w:hAnsi="Calibri" w:cs="Calibri"/>
+          <w:color w:val="1A1A1A"/>
+          <w:sz w:val="22"/>
+          <w:szCs w:val="22"/>
+        </w:rPr>
+        <w:t>account statuses became Active / Locked / Disabled. If the DFD is used for a presentation, update those parts so it matches.</w:t>
       </w:r>
     </w:p>
     <w:p>
@@ -18966,17 +19341,7 @@
           <w:sz w:val="22"/>
           <w:szCs w:val="22"/>
         </w:rPr>
-        <w:t xml:space="preserve">Servers &gt; </w:t>
-      </w:r>
-      <w:r>
-        <w:rPr>
-          <w:rStyle w:val="Strong"/>
-          <w:rFonts w:ascii="Calibri" w:eastAsia="Times New Roman" w:hAnsi="Calibri" w:cs="Calibri"/>
-          <w:color w:val="1A1A1A"/>
-          <w:sz w:val="22"/>
-          <w:szCs w:val="22"/>
-        </w:rPr>
-        <w:t>PostgreSQL 18 &gt; Databases &gt; construction_db</w:t>
+        <w:t>Servers &gt; PostgreSQL 18 &gt; Databases &gt; construction_db</w:t>
       </w:r>
       <w:r>
         <w:rPr>
@@ -19079,7 +19444,7 @@
         <w:pStyle w:val="NormalWeb"/>
         <w:shd w:val="clear" w:color="auto" w:fill="EEF2F8"/>
         <w:ind w:right="720"/>
-        <w:divId w:val="1179659722"/>
+        <w:divId w:val="1396926525"/>
         <w:rPr>
           <w:rFonts w:ascii="Calibri" w:hAnsi="Calibri" w:cs="Calibri"/>
           <w:color w:val="404040"/>
@@ -22287,122 +22652,9 @@
 <file path=word/numbering.xml><?xml version="1.0" encoding="utf-8"?>
 <w:numbering xmlns:wpc="http://schemas.microsoft.com/office/word/2010/wordprocessingCanvas" xmlns:cx="http://schemas.microsoft.com/office/drawing/2014/chartex" xmlns:cx1="http://schemas.microsoft.com/office/drawing/2015/9/8/chartex" xmlns:cx2="http://schemas.microsoft.com/office/drawing/2015/10/21/chartex" xmlns:cx3="http://schemas.microsoft.com/office/drawing/2016/5/9/chartex" xmlns:cx4="http://schemas.microsoft.com/office/drawing/2016/5/10/chartex" xmlns:cx5="http://schemas.microsoft.com/office/drawing/2016/5/11/chartex" xmlns:cx6="http://schemas.microsoft.com/office/drawing/2016/5/12/chartex" xmlns:cx7="http://schemas.microsoft.com/office/drawing/2016/5/13/chartex" xmlns:cx8="http://schemas.microsoft.com/office/drawing/2016/5/14/chartex" xmlns:mc="http://schemas.openxmlformats.org/markup-compatibility/2006" xmlns:aink="http://schemas.microsoft.com/office/drawing/2016/ink" xmlns:am3d="http://schemas.microsoft.com/office/drawing/2017/model3d" xmlns:o="urn:schemas-microsoft-com:office:office" xmlns:oel="http://schemas.microsoft.com/office/2019/extlst" xmlns:r="http://schemas.openxmlformats.org/officeDocument/2006/relationships" xmlns:m="http://schemas.openxmlformats.org/officeDocument/2006/math" xmlns:v="urn:schemas-microsoft-com:vml" xmlns:wp14="http://schemas.microsoft.com/office/word/2010/wordprocessingDrawing" xmlns:wp="http://schemas.openxmlformats.org/drawingml/2006/wordprocessingDrawing" xmlns:w10="urn:schemas-microsoft-com:office:word" xmlns:w="http://schemas.openxmlformats.org/wordprocessingml/2006/main" xmlns:w14="http://schemas.microsoft.com/office/word/2010/wordml" xmlns:w15="http://schemas.microsoft.com/office/word/2012/wordml" xmlns:w16cex="http://schemas.microsoft.com/office/word/2018/wordml/cex" xmlns:w16cid="http://schemas.microsoft.com/office/word/2016/wordml/cid" xmlns:w16="http://schemas.microsoft.com/office/word/2018/wordml" xmlns:w16du="http://schemas.microsoft.com/office/word/2023/wordml/word16du" xmlns:w16sdtdh="http://schemas.microsoft.com/office/word/2020/wordml/sdtdatahash" xmlns:w16sdtfl="http://schemas.microsoft.com/office/word/2024/wordml/sdtformatlock" xmlns:w16se="http://schemas.microsoft.com/office/word/2015/wordml/symex" xmlns:wpg="http://schemas.microsoft.com/office/word/2010/wordprocessingGroup" xmlns:wpi="http://schemas.microsoft.com/office/word/2010/wordprocessingInk" xmlns:wne="http://schemas.microsoft.com/office/word/2006/wordml" xmlns:wps="http://schemas.microsoft.com/office/word/2010/wordprocessingShape" mc:Ignorable="w14 w15 w16se w16cid w16 w16cex w16sdtdh w16sdtfl w16du wp14">
   <w:abstractNum w:abstractNumId="0" w15:restartNumberingAfterBreak="0">
-    <w:nsid w:val="0F0F6489"/>
+    <w:nsid w:val="00E511C9"/>
     <w:multiLevelType w:val="multilevel"/>
-    <w:tmpl w:val="755A70EA"/>
-    <w:lvl w:ilvl="0">
-      <w:start w:val="1"/>
-      <w:numFmt w:val="decimal"/>
-      <w:lvlText w:val="%1."/>
-      <w:lvlJc w:val="left"/>
-      <w:pPr>
-        <w:tabs>
-          <w:tab w:val="num" w:pos="720"/>
-        </w:tabs>
-        <w:ind w:left="720" w:hanging="360"/>
-      </w:pPr>
-    </w:lvl>
-    <w:lvl w:ilvl="1" w:tentative="1">
-      <w:start w:val="1"/>
-      <w:numFmt w:val="decimal"/>
-      <w:lvlText w:val="%2."/>
-      <w:lvlJc w:val="left"/>
-      <w:pPr>
-        <w:tabs>
-          <w:tab w:val="num" w:pos="1440"/>
-        </w:tabs>
-        <w:ind w:left="1440" w:hanging="360"/>
-      </w:pPr>
-    </w:lvl>
-    <w:lvl w:ilvl="2" w:tentative="1">
-      <w:start w:val="1"/>
-      <w:numFmt w:val="decimal"/>
-      <w:lvlText w:val="%3."/>
-      <w:lvlJc w:val="left"/>
-      <w:pPr>
-        <w:tabs>
-          <w:tab w:val="num" w:pos="2160"/>
-        </w:tabs>
-        <w:ind w:left="2160" w:hanging="360"/>
-      </w:pPr>
-    </w:lvl>
-    <w:lvl w:ilvl="3" w:tentative="1">
-      <w:start w:val="1"/>
-      <w:numFmt w:val="decimal"/>
-      <w:lvlText w:val="%4."/>
-      <w:lvlJc w:val="left"/>
-      <w:pPr>
-        <w:tabs>
-          <w:tab w:val="num" w:pos="2880"/>
-        </w:tabs>
-        <w:ind w:left="2880" w:hanging="360"/>
-      </w:pPr>
-    </w:lvl>
-    <w:lvl w:ilvl="4" w:tentative="1">
-      <w:start w:val="1"/>
-      <w:numFmt w:val="decimal"/>
-      <w:lvlText w:val="%5."/>
-      <w:lvlJc w:val="left"/>
-      <w:pPr>
-        <w:tabs>
-          <w:tab w:val="num" w:pos="3600"/>
-        </w:tabs>
-        <w:ind w:left="3600" w:hanging="360"/>
-      </w:pPr>
-    </w:lvl>
-    <w:lvl w:ilvl="5" w:tentative="1">
-      <w:start w:val="1"/>
-      <w:numFmt w:val="decimal"/>
-      <w:lvlText w:val="%6."/>
-      <w:lvlJc w:val="left"/>
-      <w:pPr>
-        <w:tabs>
-          <w:tab w:val="num" w:pos="4320"/>
-        </w:tabs>
-        <w:ind w:left="4320" w:hanging="360"/>
-      </w:pPr>
-    </w:lvl>
-    <w:lvl w:ilvl="6" w:tentative="1">
-      <w:start w:val="1"/>
-      <w:numFmt w:val="decimal"/>
-      <w:lvlText w:val="%7."/>
-      <w:lvlJc w:val="left"/>
-      <w:pPr>
-        <w:tabs>
-          <w:tab w:val="num" w:pos="5040"/>
-        </w:tabs>
-        <w:ind w:left="5040" w:hanging="360"/>
-      </w:pPr>
-    </w:lvl>
-    <w:lvl w:ilvl="7" w:tentative="1">
-      <w:start w:val="1"/>
-      <w:numFmt w:val="decimal"/>
-      <w:lvlText w:val="%8."/>
-      <w:lvlJc w:val="left"/>
-      <w:pPr>
-        <w:tabs>
-          <w:tab w:val="num" w:pos="5760"/>
-        </w:tabs>
-        <w:ind w:left="5760" w:hanging="360"/>
-      </w:pPr>
-    </w:lvl>
-    <w:lvl w:ilvl="8" w:tentative="1">
-      <w:start w:val="1"/>
-      <w:numFmt w:val="decimal"/>
-      <w:lvlText w:val="%9."/>
-      <w:lvlJc w:val="left"/>
-      <w:pPr>
-        <w:tabs>
-          <w:tab w:val="num" w:pos="6480"/>
-        </w:tabs>
-        <w:ind w:left="6480" w:hanging="360"/>
-      </w:pPr>
-    </w:lvl>
-  </w:abstractNum>
-  <w:abstractNum w:abstractNumId="1" w15:restartNumberingAfterBreak="0">
-    <w:nsid w:val="149A081A"/>
-    <w:multiLevelType w:val="multilevel"/>
-    <w:tmpl w:val="1C320FB4"/>
+    <w:tmpl w:val="17A2F810"/>
     <w:lvl w:ilvl="0">
       <w:start w:val="1"/>
       <w:numFmt w:val="bullet"/>
@@ -22548,10 +22800,123 @@
       </w:rPr>
     </w:lvl>
   </w:abstractNum>
+  <w:abstractNum w:abstractNumId="1" w15:restartNumberingAfterBreak="0">
+    <w:nsid w:val="01A422B0"/>
+    <w:multiLevelType w:val="multilevel"/>
+    <w:tmpl w:val="EE36128C"/>
+    <w:lvl w:ilvl="0">
+      <w:start w:val="1"/>
+      <w:numFmt w:val="decimal"/>
+      <w:lvlText w:val="%1."/>
+      <w:lvlJc w:val="left"/>
+      <w:pPr>
+        <w:tabs>
+          <w:tab w:val="num" w:pos="720"/>
+        </w:tabs>
+        <w:ind w:left="720" w:hanging="360"/>
+      </w:pPr>
+    </w:lvl>
+    <w:lvl w:ilvl="1" w:tentative="1">
+      <w:start w:val="1"/>
+      <w:numFmt w:val="decimal"/>
+      <w:lvlText w:val="%2."/>
+      <w:lvlJc w:val="left"/>
+      <w:pPr>
+        <w:tabs>
+          <w:tab w:val="num" w:pos="1440"/>
+        </w:tabs>
+        <w:ind w:left="1440" w:hanging="360"/>
+      </w:pPr>
+    </w:lvl>
+    <w:lvl w:ilvl="2" w:tentative="1">
+      <w:start w:val="1"/>
+      <w:numFmt w:val="decimal"/>
+      <w:lvlText w:val="%3."/>
+      <w:lvlJc w:val="left"/>
+      <w:pPr>
+        <w:tabs>
+          <w:tab w:val="num" w:pos="2160"/>
+        </w:tabs>
+        <w:ind w:left="2160" w:hanging="360"/>
+      </w:pPr>
+    </w:lvl>
+    <w:lvl w:ilvl="3" w:tentative="1">
+      <w:start w:val="1"/>
+      <w:numFmt w:val="decimal"/>
+      <w:lvlText w:val="%4."/>
+      <w:lvlJc w:val="left"/>
+      <w:pPr>
+        <w:tabs>
+          <w:tab w:val="num" w:pos="2880"/>
+        </w:tabs>
+        <w:ind w:left="2880" w:hanging="360"/>
+      </w:pPr>
+    </w:lvl>
+    <w:lvl w:ilvl="4" w:tentative="1">
+      <w:start w:val="1"/>
+      <w:numFmt w:val="decimal"/>
+      <w:lvlText w:val="%5."/>
+      <w:lvlJc w:val="left"/>
+      <w:pPr>
+        <w:tabs>
+          <w:tab w:val="num" w:pos="3600"/>
+        </w:tabs>
+        <w:ind w:left="3600" w:hanging="360"/>
+      </w:pPr>
+    </w:lvl>
+    <w:lvl w:ilvl="5" w:tentative="1">
+      <w:start w:val="1"/>
+      <w:numFmt w:val="decimal"/>
+      <w:lvlText w:val="%6."/>
+      <w:lvlJc w:val="left"/>
+      <w:pPr>
+        <w:tabs>
+          <w:tab w:val="num" w:pos="4320"/>
+        </w:tabs>
+        <w:ind w:left="4320" w:hanging="360"/>
+      </w:pPr>
+    </w:lvl>
+    <w:lvl w:ilvl="6" w:tentative="1">
+      <w:start w:val="1"/>
+      <w:numFmt w:val="decimal"/>
+      <w:lvlText w:val="%7."/>
+      <w:lvlJc w:val="left"/>
+      <w:pPr>
+        <w:tabs>
+          <w:tab w:val="num" w:pos="5040"/>
+        </w:tabs>
+        <w:ind w:left="5040" w:hanging="360"/>
+      </w:pPr>
+    </w:lvl>
+    <w:lvl w:ilvl="7" w:tentative="1">
+      <w:start w:val="1"/>
+      <w:numFmt w:val="decimal"/>
+      <w:lvlText w:val="%8."/>
+      <w:lvlJc w:val="left"/>
+      <w:pPr>
+        <w:tabs>
+          <w:tab w:val="num" w:pos="5760"/>
+        </w:tabs>
+        <w:ind w:left="5760" w:hanging="360"/>
+      </w:pPr>
+    </w:lvl>
+    <w:lvl w:ilvl="8" w:tentative="1">
+      <w:start w:val="1"/>
+      <w:numFmt w:val="decimal"/>
+      <w:lvlText w:val="%9."/>
+      <w:lvlJc w:val="left"/>
+      <w:pPr>
+        <w:tabs>
+          <w:tab w:val="num" w:pos="6480"/>
+        </w:tabs>
+        <w:ind w:left="6480" w:hanging="360"/>
+      </w:pPr>
+    </w:lvl>
+  </w:abstractNum>
   <w:abstractNum w:abstractNumId="2" w15:restartNumberingAfterBreak="0">
-    <w:nsid w:val="169044DF"/>
+    <w:nsid w:val="2B6034B0"/>
     <w:multiLevelType w:val="multilevel"/>
-    <w:tmpl w:val="BD0C2C8A"/>
+    <w:tmpl w:val="EE4A1CDA"/>
     <w:lvl w:ilvl="0">
       <w:start w:val="1"/>
       <w:numFmt w:val="bullet"/>
@@ -22698,9 +23063,9 @@
     </w:lvl>
   </w:abstractNum>
   <w:abstractNum w:abstractNumId="3" w15:restartNumberingAfterBreak="0">
-    <w:nsid w:val="219F0710"/>
+    <w:nsid w:val="3E3D5F93"/>
     <w:multiLevelType w:val="multilevel"/>
-    <w:tmpl w:val="B8EA9564"/>
+    <w:tmpl w:val="C2FE36D2"/>
     <w:lvl w:ilvl="0">
       <w:start w:val="1"/>
       <w:numFmt w:val="bullet"/>
@@ -22847,9 +23212,9 @@
     </w:lvl>
   </w:abstractNum>
   <w:abstractNum w:abstractNumId="4" w15:restartNumberingAfterBreak="0">
-    <w:nsid w:val="24EC2A79"/>
+    <w:nsid w:val="3FBB2234"/>
     <w:multiLevelType w:val="multilevel"/>
-    <w:tmpl w:val="2EDAED32"/>
+    <w:tmpl w:val="9B823562"/>
     <w:lvl w:ilvl="0">
       <w:start w:val="1"/>
       <w:numFmt w:val="bullet"/>
@@ -22996,9 +23361,9 @@
     </w:lvl>
   </w:abstractNum>
   <w:abstractNum w:abstractNumId="5" w15:restartNumberingAfterBreak="0">
-    <w:nsid w:val="432241E0"/>
+    <w:nsid w:val="48CF0044"/>
     <w:multiLevelType w:val="multilevel"/>
-    <w:tmpl w:val="D396CE46"/>
+    <w:tmpl w:val="8EDE3DF2"/>
     <w:lvl w:ilvl="0">
       <w:start w:val="1"/>
       <w:numFmt w:val="bullet"/>
@@ -23145,9 +23510,9 @@
     </w:lvl>
   </w:abstractNum>
   <w:abstractNum w:abstractNumId="6" w15:restartNumberingAfterBreak="0">
-    <w:nsid w:val="556129C9"/>
+    <w:nsid w:val="62CC7B08"/>
     <w:multiLevelType w:val="multilevel"/>
-    <w:tmpl w:val="7514F206"/>
+    <w:tmpl w:val="48925A1C"/>
     <w:lvl w:ilvl="0">
       <w:start w:val="1"/>
       <w:numFmt w:val="bullet"/>
@@ -23294,9 +23659,9 @@
     </w:lvl>
   </w:abstractNum>
   <w:abstractNum w:abstractNumId="7" w15:restartNumberingAfterBreak="0">
-    <w:nsid w:val="58F85B11"/>
+    <w:nsid w:val="68013C3B"/>
     <w:multiLevelType w:val="multilevel"/>
-    <w:tmpl w:val="ED6A8EA2"/>
+    <w:tmpl w:val="B796A41E"/>
     <w:lvl w:ilvl="0">
       <w:start w:val="1"/>
       <w:numFmt w:val="bullet"/>
@@ -23443,9 +23808,9 @@
     </w:lvl>
   </w:abstractNum>
   <w:abstractNum w:abstractNumId="8" w15:restartNumberingAfterBreak="0">
-    <w:nsid w:val="6F611953"/>
+    <w:nsid w:val="70AA7FAF"/>
     <w:multiLevelType w:val="multilevel"/>
-    <w:tmpl w:val="5BD6AEFA"/>
+    <w:tmpl w:val="871A72EE"/>
     <w:lvl w:ilvl="0">
       <w:start w:val="1"/>
       <w:numFmt w:val="decimal"/>
@@ -23556,9 +23921,9 @@
     </w:lvl>
   </w:abstractNum>
   <w:abstractNum w:abstractNumId="9" w15:restartNumberingAfterBreak="0">
-    <w:nsid w:val="77F94C5B"/>
+    <w:nsid w:val="739C792F"/>
     <w:multiLevelType w:val="multilevel"/>
-    <w:tmpl w:val="2884BBFC"/>
+    <w:tmpl w:val="87DEBB7A"/>
     <w:lvl w:ilvl="0">
       <w:start w:val="1"/>
       <w:numFmt w:val="bullet"/>
@@ -23704,35 +24069,35 @@
       </w:rPr>
     </w:lvl>
   </w:abstractNum>
-  <w:num w:numId="1" w16cid:durableId="1398238971">
+  <w:num w:numId="1" w16cid:durableId="1637838624">
+    <w:abstractNumId w:val="5"/>
+  </w:num>
+  <w:num w:numId="2" w16cid:durableId="1396508823">
     <w:abstractNumId w:val="3"/>
   </w:num>
-  <w:num w:numId="2" w16cid:durableId="1939360823">
-    <w:abstractNumId w:val="5"/>
+  <w:num w:numId="3" w16cid:durableId="1678120112">
+    <w:abstractNumId w:val="9"/>
   </w:num>
-  <w:num w:numId="3" w16cid:durableId="973372249">
-    <w:abstractNumId w:val="7"/>
+  <w:num w:numId="4" w16cid:durableId="84083089">
+    <w:abstractNumId w:val="0"/>
   </w:num>
-  <w:num w:numId="4" w16cid:durableId="1064109692">
+  <w:num w:numId="5" w16cid:durableId="1063985751">
     <w:abstractNumId w:val="6"/>
   </w:num>
-  <w:num w:numId="5" w16cid:durableId="147937556">
+  <w:num w:numId="6" w16cid:durableId="778305600">
     <w:abstractNumId w:val="2"/>
   </w:num>
-  <w:num w:numId="6" w16cid:durableId="597831302">
-    <w:abstractNumId w:val="9"/>
+  <w:num w:numId="7" w16cid:durableId="919868030">
+    <w:abstractNumId w:val="4"/>
   </w:num>
-  <w:num w:numId="7" w16cid:durableId="1999963912">
+  <w:num w:numId="8" w16cid:durableId="1413046571">
+    <w:abstractNumId w:val="8"/>
+  </w:num>
+  <w:num w:numId="9" w16cid:durableId="1675380529">
     <w:abstractNumId w:val="1"/>
   </w:num>
-  <w:num w:numId="8" w16cid:durableId="342098003">
-    <w:abstractNumId w:val="8"/>
-  </w:num>
-  <w:num w:numId="9" w16cid:durableId="411050527">
-    <w:abstractNumId w:val="0"/>
-  </w:num>
-  <w:num w:numId="10" w16cid:durableId="247734426">
-    <w:abstractNumId w:val="4"/>
+  <w:num w:numId="10" w16cid:durableId="1341931686">
+    <w:abstractNumId w:val="7"/>
   </w:num>
 </w:numbering>
 </file>

</xml_diff>

<commit_message>
Website Admin app, step 2: main accounts and the Accounts tab
Owner decision: only a main Website Admin account manages the others.
- database/009_website_main_account.sql: is_main; the oldest existing
  account becomes main if none is.
- Services/WebsiteAccounts: create, edit, set password (also unlocks),
  unlock, disable, enable; every action re-checks an active main account;
  no self-disable or self-un-main; last active main protected.
- Accounts tab (main accounts only) with the RecordForm pattern: Create
  Account pop-up, no auto-select, Yes/No list of changes; Set New Password
  window with Generate and Copy.
- Password and username rules moved to Company.Shared/AccountRules, used
  by both apps.
22/22 checks on the work PC database; guides and testing log updated.

Co-Authored-By: Claude Opus 5.5 <noreply@anthropic.com>
</commit_message>
<xml_diff>
--- a/docs/Database Guide.docx
+++ b/docs/Database Guide.docx
@@ -40,7 +40,7 @@
       <w:pPr>
         <w:pStyle w:val="NormalWeb"/>
         <w:shd w:val="clear" w:color="auto" w:fill="EEF2F8"/>
-        <w:divId w:val="1682735045"/>
+        <w:divId w:val="1343166945"/>
         <w:rPr>
           <w:rFonts w:ascii="Calibri" w:hAnsi="Calibri" w:cs="Calibri"/>
           <w:color w:val="404040"/>
@@ -71,7 +71,7 @@
           <w:sz w:val="22"/>
           <w:szCs w:val="22"/>
         </w:rPr>
-        <w:t xml:space="preserve">, PostgreSQL 18) as of scripts 001-008: </w:t>
+        <w:t xml:space="preserve">, PostgreSQL 18) as of scripts 001-009: </w:t>
       </w:r>
       <w:r>
         <w:rPr>
@@ -5030,6 +5030,114 @@
           </w:p>
         </w:tc>
       </w:tr>
+      <w:tr>
+        <w:tc>
+          <w:tcPr>
+            <w:tcW w:w="0" w:type="auto"/>
+            <w:tcBorders>
+              <w:top w:val="single" w:sz="6" w:space="0" w:color="BFBFBF"/>
+              <w:left w:val="single" w:sz="6" w:space="0" w:color="BFBFBF"/>
+              <w:bottom w:val="single" w:sz="6" w:space="0" w:color="BFBFBF"/>
+              <w:right w:val="single" w:sz="6" w:space="0" w:color="BFBFBF"/>
+            </w:tcBorders>
+            <w:tcMar>
+              <w:top w:w="60" w:type="dxa"/>
+              <w:left w:w="120" w:type="dxa"/>
+              <w:bottom w:w="60" w:type="dxa"/>
+              <w:right w:w="120" w:type="dxa"/>
+            </w:tcMar>
+            <w:hideMark/>
+          </w:tcPr>
+          <w:p>
+            <w:pPr>
+              <w:spacing w:before="120" w:after="120"/>
+              <w:rPr>
+                <w:rFonts w:ascii="Calibri" w:eastAsia="Times New Roman" w:hAnsi="Calibri" w:cs="Calibri"/>
+                <w:color w:val="1A1A1A"/>
+                <w:sz w:val="22"/>
+                <w:szCs w:val="22"/>
+              </w:rPr>
+            </w:pPr>
+            <w:r>
+              <w:rPr>
+                <w:rStyle w:val="HTMLCode"/>
+                <w:color w:val="1A1A1A"/>
+              </w:rPr>
+              <w:t>009_website_main_account.sql</w:t>
+            </w:r>
+          </w:p>
+        </w:tc>
+        <w:tc>
+          <w:tcPr>
+            <w:tcW w:w="0" w:type="auto"/>
+            <w:tcBorders>
+              <w:top w:val="single" w:sz="6" w:space="0" w:color="BFBFBF"/>
+              <w:left w:val="single" w:sz="6" w:space="0" w:color="BFBFBF"/>
+              <w:bottom w:val="single" w:sz="6" w:space="0" w:color="BFBFBF"/>
+              <w:right w:val="single" w:sz="6" w:space="0" w:color="BFBFBF"/>
+            </w:tcBorders>
+            <w:tcMar>
+              <w:top w:w="60" w:type="dxa"/>
+              <w:left w:w="120" w:type="dxa"/>
+              <w:bottom w:w="60" w:type="dxa"/>
+              <w:right w:w="120" w:type="dxa"/>
+            </w:tcMar>
+            <w:hideMark/>
+          </w:tcPr>
+          <w:p>
+            <w:pPr>
+              <w:spacing w:before="120" w:after="120"/>
+              <w:rPr>
+                <w:rFonts w:ascii="Calibri" w:eastAsia="Times New Roman" w:hAnsi="Calibri" w:cs="Calibri"/>
+                <w:color w:val="1A1A1A"/>
+                <w:sz w:val="22"/>
+                <w:szCs w:val="22"/>
+              </w:rPr>
+            </w:pPr>
+            <w:r>
+              <w:rPr>
+                <w:rFonts w:ascii="Calibri" w:eastAsia="Times New Roman" w:hAnsi="Calibri" w:cs="Calibri"/>
+                <w:color w:val="1A1A1A"/>
+                <w:sz w:val="22"/>
+                <w:szCs w:val="22"/>
+              </w:rPr>
+              <w:t xml:space="preserve">the </w:t>
+            </w:r>
+            <w:r>
+              <w:rPr>
+                <w:rStyle w:val="HTMLCode"/>
+                <w:color w:val="1A1A1A"/>
+              </w:rPr>
+              <w:t>is_main</w:t>
+            </w:r>
+            <w:r>
+              <w:rPr>
+                <w:rFonts w:ascii="Calibri" w:eastAsia="Times New Roman" w:hAnsi="Calibri" w:cs="Calibri"/>
+                <w:color w:val="1A1A1A"/>
+                <w:sz w:val="22"/>
+                <w:szCs w:val="22"/>
+              </w:rPr>
+              <w:t xml:space="preserve"> column on </w:t>
+            </w:r>
+            <w:r>
+              <w:rPr>
+                <w:rStyle w:val="HTMLCode"/>
+                <w:color w:val="1A1A1A"/>
+              </w:rPr>
+              <w:t>website_accounts</w:t>
+            </w:r>
+            <w:r>
+              <w:rPr>
+                <w:rFonts w:ascii="Calibri" w:eastAsia="Times New Roman" w:hAnsi="Calibri" w:cs="Calibri"/>
+                <w:color w:val="1A1A1A"/>
+                <w:sz w:val="22"/>
+                <w:szCs w:val="22"/>
+              </w:rPr>
+              <w:t xml:space="preserve"> (main accounts manage the others)</w:t>
+            </w:r>
+          </w:p>
+        </w:tc>
+      </w:tr>
     </w:tbl>
     <w:p>
       <w:pPr>
@@ -5173,7 +5281,16 @@
           <w:sz w:val="22"/>
           <w:szCs w:val="22"/>
         </w:rPr>
-        <w:t xml:space="preserve"> a script that has run is </w:t>
+        <w:t xml:space="preserve"> </w:t>
+      </w:r>
+      <w:r>
+        <w:rPr>
+          <w:rFonts w:ascii="Calibri" w:hAnsi="Calibri" w:cs="Calibri"/>
+          <w:color w:val="1A1A1A"/>
+          <w:sz w:val="22"/>
+          <w:szCs w:val="22"/>
+        </w:rPr>
+        <w:t xml:space="preserve">a script that has run is </w:t>
       </w:r>
       <w:r>
         <w:rPr>
@@ -5345,48 +5462,48 @@
           <w:szCs w:val="19"/>
           <w:shd w:val="clear" w:color="auto" w:fill="F2F2F2"/>
         </w:rPr>
-        <w:t>|      -&gt; Entity Framework Core | network  |                  |</w:t>
-      </w:r>
-    </w:p>
-    <w:p>
-      <w:pPr>
-        <w:pStyle w:val="HTMLPreformatted"/>
+        <w:t xml:space="preserve">|      -&gt; Entity Framework Core | network  |              </w:t>
+      </w:r>
+      <w:r>
         <w:rPr>
           <w:color w:val="1A1A1A"/>
           <w:sz w:val="19"/>
           <w:szCs w:val="19"/>
           <w:shd w:val="clear" w:color="auto" w:fill="F2F2F2"/>
         </w:rPr>
-      </w:pPr>
-      <w:r>
+        <w:t xml:space="preserve">    |</w:t>
+      </w:r>
+    </w:p>
+    <w:p>
+      <w:pPr>
+        <w:pStyle w:val="HTMLPreformatted"/>
         <w:rPr>
           <w:color w:val="1A1A1A"/>
           <w:sz w:val="19"/>
           <w:szCs w:val="19"/>
           <w:shd w:val="clear" w:color="auto" w:fill="F2F2F2"/>
         </w:rPr>
-        <w:t>|        (C# objects &lt;-&gt; rows)  |  &lt;----   |                  |</w:t>
-      </w:r>
-    </w:p>
-    <w:p>
-      <w:pPr>
-        <w:pStyle w:val="HTMLPreformatted"/>
+      </w:pPr>
+      <w:r>
         <w:rPr>
           <w:color w:val="1A1A1A"/>
           <w:sz w:val="19"/>
           <w:szCs w:val="19"/>
           <w:shd w:val="clear" w:color="auto" w:fill="F2F2F2"/>
         </w:rPr>
-      </w:pPr>
-      <w:r>
+        <w:t>|        (C# objects &lt;-&gt; rows)  |  &lt;----   |                  |</w:t>
+      </w:r>
+    </w:p>
+    <w:p>
+      <w:pPr>
+        <w:pStyle w:val="HTMLPreformatted"/>
         <w:rPr>
           <w:color w:val="1A1A1A"/>
           <w:sz w:val="19"/>
           <w:szCs w:val="19"/>
           <w:shd w:val="clear" w:color="auto" w:fill="F2F2F2"/>
         </w:rPr>
-        <w:t xml:space="preserve">+-------------------------------+    </w:t>
-      </w:r>
+      </w:pPr>
       <w:r>
         <w:rPr>
           <w:color w:val="1A1A1A"/>
@@ -5394,7 +5511,7 @@
           <w:szCs w:val="19"/>
           <w:shd w:val="clear" w:color="auto" w:fill="F2F2F2"/>
         </w:rPr>
-        <w:t xml:space="preserve">      +------------------+</w:t>
+        <w:t>+-------------------------------+          +------------------+</w:t>
       </w:r>
     </w:p>
     <w:p>
@@ -5599,16 +5716,7 @@
           <w:sz w:val="22"/>
           <w:szCs w:val="22"/>
         </w:rPr>
-        <w:t xml:space="preserve"> </w:t>
-      </w:r>
-      <w:r>
-        <w:rPr>
-          <w:rFonts w:ascii="Calibri" w:eastAsia="Times New Roman" w:hAnsi="Calibri" w:cs="Calibri"/>
-          <w:color w:val="1A1A1A"/>
-          <w:sz w:val="22"/>
-          <w:szCs w:val="22"/>
-        </w:rPr>
-        <w:t xml:space="preserve">will never talk to the database directly. It will go through the </w:t>
+        <w:t xml:space="preserve"> will never talk to the database directly. It will go through the </w:t>
       </w:r>
       <w:r>
         <w:rPr>
@@ -6047,7 +6155,16 @@
                 <w:sz w:val="22"/>
                 <w:szCs w:val="22"/>
               </w:rPr>
-              <w:t xml:space="preserve"> of whoever approved or rejected it</w:t>
+              <w:t xml:space="preserve"> </w:t>
+            </w:r>
+            <w:r>
+              <w:rPr>
+                <w:rFonts w:ascii="Calibri" w:eastAsia="Times New Roman" w:hAnsi="Calibri" w:cs="Calibri"/>
+                <w:color w:val="1A1A1A"/>
+                <w:sz w:val="22"/>
+                <w:szCs w:val="22"/>
+              </w:rPr>
+              <w:t>of whoever approved or rejected it</w:t>
             </w:r>
           </w:p>
         </w:tc>
@@ -7440,77 +7557,79 @@
           <w:szCs w:val="19"/>
           <w:shd w:val="clear" w:color="auto" w:fill="F2F2F2"/>
         </w:rPr>
-        <w:t xml:space="preserve">   </w:t>
-      </w:r>
-      <w:r>
+        <w:t xml:space="preserve">                         +-----------+</w:t>
+      </w:r>
+    </w:p>
+    <w:p>
+      <w:pPr>
+        <w:pStyle w:val="HTMLPreformatted"/>
         <w:rPr>
           <w:color w:val="1A1A1A"/>
           <w:sz w:val="19"/>
           <w:szCs w:val="19"/>
           <w:shd w:val="clear" w:color="auto" w:fill="F2F2F2"/>
         </w:rPr>
-        <w:t xml:space="preserve">                      +-----------+</w:t>
-      </w:r>
-    </w:p>
-    <w:p>
-      <w:pPr>
-        <w:pStyle w:val="HTMLPreformatted"/>
+      </w:pPr>
+      <w:r>
         <w:rPr>
           <w:color w:val="1A1A1A"/>
           <w:sz w:val="19"/>
           <w:szCs w:val="19"/>
           <w:shd w:val="clear" w:color="auto" w:fill="F2F2F2"/>
         </w:rPr>
-      </w:pPr>
-      <w:r>
+        <w:t xml:space="preserve">   material_usages ----&gt; |           | &lt;---- receipts</w:t>
+      </w:r>
+    </w:p>
+    <w:p>
+      <w:pPr>
+        <w:pStyle w:val="HTMLPreformatted"/>
         <w:rPr>
           <w:color w:val="1A1A1A"/>
           <w:sz w:val="19"/>
           <w:szCs w:val="19"/>
           <w:shd w:val="clear" w:color="auto" w:fill="F2F2F2"/>
         </w:rPr>
-        <w:t xml:space="preserve">   material_usages ----&gt; |           | &lt;---- receipts</w:t>
-      </w:r>
-    </w:p>
-    <w:p>
-      <w:pPr>
-        <w:pStyle w:val="HTMLPreformatted"/>
+      </w:pPr>
+      <w:r>
         <w:rPr>
           <w:color w:val="1A1A1A"/>
           <w:sz w:val="19"/>
           <w:szCs w:val="19"/>
           <w:shd w:val="clear" w:color="auto" w:fill="F2F2F2"/>
         </w:rPr>
-      </w:pPr>
-      <w:r>
+        <w:t xml:space="preserve">   sub_jobs -----------&gt; | projects  | &lt;---- change_orders</w:t>
+      </w:r>
+    </w:p>
+    <w:p>
+      <w:pPr>
+        <w:pStyle w:val="HTMLPreformatted"/>
         <w:rPr>
           <w:color w:val="1A1A1A"/>
           <w:sz w:val="19"/>
           <w:szCs w:val="19"/>
           <w:shd w:val="clear" w:color="auto" w:fill="F2F2F2"/>
         </w:rPr>
-        <w:t xml:space="preserve">   sub_jobs -----------&gt; | projects  | &lt;---- change_orders</w:t>
-      </w:r>
-    </w:p>
-    <w:p>
-      <w:pPr>
-        <w:pStyle w:val="HTMLPreformatted"/>
+      </w:pPr>
+      <w:r>
         <w:rPr>
           <w:color w:val="1A1A1A"/>
           <w:sz w:val="19"/>
           <w:szCs w:val="19"/>
           <w:shd w:val="clear" w:color="auto" w:fill="F2F2F2"/>
         </w:rPr>
-      </w:pPr>
-      <w:r>
+        <w:t xml:space="preserve">                         +-----------+</w:t>
+      </w:r>
+    </w:p>
+    <w:p>
+      <w:pPr>
+        <w:pStyle w:val="HTMLPreformatted"/>
         <w:rPr>
           <w:color w:val="1A1A1A"/>
           <w:sz w:val="19"/>
           <w:szCs w:val="19"/>
           <w:shd w:val="clear" w:color="auto" w:fill="F2F2F2"/>
         </w:rPr>
-        <w:t xml:space="preserve">                         +-----------+</w:t>
-      </w:r>
+      </w:pPr>
     </w:p>
     <w:p>
       <w:pPr>
@@ -7522,44 +7641,33 @@
           <w:shd w:val="clear" w:color="auto" w:fill="F2F2F2"/>
         </w:rPr>
       </w:pPr>
-    </w:p>
-    <w:p>
-      <w:pPr>
-        <w:pStyle w:val="HTMLPreformatted"/>
+      <w:r>
         <w:rPr>
           <w:color w:val="1A1A1A"/>
           <w:sz w:val="19"/>
           <w:szCs w:val="19"/>
           <w:shd w:val="clear" w:color="auto" w:fill="F2F2F2"/>
         </w:rPr>
-      </w:pPr>
-      <w:r>
+        <w:t xml:space="preserve">   employees &lt;---- users          (a login belongs to an employee)</w:t>
+      </w:r>
+    </w:p>
+    <w:p>
+      <w:pPr>
+        <w:pStyle w:val="HTMLPreformatted"/>
         <w:rPr>
           <w:color w:val="1A1A1A"/>
           <w:sz w:val="19"/>
           <w:szCs w:val="19"/>
           <w:shd w:val="clear" w:color="auto" w:fill="F2F2F2"/>
         </w:rPr>
-        <w:t xml:space="preserve">   employees &lt;---- users          (a login belongs to an employee)</w:t>
-      </w:r>
-    </w:p>
-    <w:p>
-      <w:pPr>
-        <w:pStyle w:val="HTMLPreformatted"/>
+      </w:pPr>
+      <w:r>
         <w:rPr>
           <w:color w:val="1A1A1A"/>
           <w:sz w:val="19"/>
           <w:szCs w:val="19"/>
           <w:shd w:val="clear" w:color="auto" w:fill="F2F2F2"/>
         </w:rPr>
-      </w:pPr>
-      <w:r>
-        <w:rPr>
-          <w:color w:val="1A1A1A"/>
-          <w:sz w:val="19"/>
-          <w:szCs w:val="19"/>
-          <w:shd w:val="clear" w:color="auto" w:fill="F2F2F2"/>
-        </w:rPr>
         <w:t xml:space="preserve">   employees &lt;---- employee_rates (rate history)</w:t>
       </w:r>
     </w:p>
@@ -7632,7 +7740,13 @@
         <w:rPr>
           <w:rFonts w:ascii="Calibri" w:eastAsia="Times New Roman" w:hAnsi="Calibri" w:cs="Calibri"/>
         </w:rPr>
-        <w:t>5. Login &amp; security tables</w:t>
+        <w:t xml:space="preserve">5. Login </w:t>
+      </w:r>
+      <w:r>
+        <w:rPr>
+          <w:rFonts w:ascii="Calibri" w:eastAsia="Times New Roman" w:hAnsi="Calibri" w:cs="Calibri"/>
+        </w:rPr>
+        <w:t>&amp; security tables</w:t>
       </w:r>
     </w:p>
     <w:p>
@@ -8322,7 +8436,16 @@
                 <w:sz w:val="22"/>
                 <w:szCs w:val="22"/>
               </w:rPr>
-              <w:t>HR &amp; Payroll / Inventory / Subcontractors / Receipts; empty for Admins (check rule)</w:t>
+              <w:t xml:space="preserve">HR &amp; </w:t>
+            </w:r>
+            <w:r>
+              <w:rPr>
+                <w:rFonts w:ascii="Calibri" w:eastAsia="Times New Roman" w:hAnsi="Calibri" w:cs="Calibri"/>
+                <w:color w:val="1A1A1A"/>
+                <w:sz w:val="22"/>
+                <w:szCs w:val="22"/>
+              </w:rPr>
+              <w:t>Payroll / Inventory / Subcontractors / Receipts; empty for Admins (check rule)</w:t>
             </w:r>
           </w:p>
         </w:tc>
@@ -8675,7 +8798,16 @@
           <w:sz w:val="22"/>
           <w:szCs w:val="22"/>
         </w:rPr>
-        <w:t xml:space="preserve"> when you sign in, the app scrambles what you typed the same way and compares the two scrambled results. If they match, the password is right. The scrambling can't be reversed.</w:t>
+        <w:t xml:space="preserve"> when you sign in, the app scrambles what you typed the same way and compares the two scrambled r</w:t>
+      </w:r>
+      <w:r>
+        <w:rPr>
+          <w:rFonts w:ascii="Calibri" w:hAnsi="Calibri" w:cs="Calibri"/>
+          <w:color w:val="1A1A1A"/>
+          <w:sz w:val="22"/>
+          <w:szCs w:val="22"/>
+        </w:rPr>
+        <w:t>esults. If they match, the password is right. The scrambling can't be reversed.</w:t>
       </w:r>
     </w:p>
     <w:p>
@@ -8709,16 +8841,7 @@
           <w:sz w:val="22"/>
           <w:szCs w:val="22"/>
         </w:rPr>
-        <w:t>One row per sign-in, sign-out, idle sign</w:t>
-      </w:r>
-      <w:r>
-        <w:rPr>
-          <w:rFonts w:ascii="Calibri" w:hAnsi="Calibri" w:cs="Calibri"/>
-          <w:color w:val="1A1A1A"/>
-          <w:sz w:val="22"/>
-          <w:szCs w:val="22"/>
-        </w:rPr>
-        <w:t xml:space="preserve">-out, failed attempt, lock, unlock, password change or password request: </w:t>
+        <w:t xml:space="preserve">One row per sign-in, sign-out, idle sign-out, failed attempt, lock, unlock, password change or password request: </w:t>
       </w:r>
       <w:r>
         <w:rPr>
@@ -8980,6 +9103,22 @@
           <w:szCs w:val="22"/>
         </w:rPr>
         <w:t xml:space="preserve"> (Active / Locked / Disabled), </w:t>
+      </w:r>
+      <w:r>
+        <w:rPr>
+          <w:rStyle w:val="HTMLCode"/>
+          <w:color w:val="1A1A1A"/>
+        </w:rPr>
+        <w:t>is_main</w:t>
+      </w:r>
+      <w:r>
+        <w:rPr>
+          <w:rFonts w:ascii="Calibri" w:hAnsi="Calibri" w:cs="Calibri"/>
+          <w:color w:val="1A1A1A"/>
+          <w:sz w:val="22"/>
+          <w:szCs w:val="22"/>
+        </w:rPr>
+        <w:t xml:space="preserve"> (a main account manages the others; script 009), </w:t>
       </w:r>
       <w:r>
         <w:rPr>
@@ -9831,16 +9970,7 @@
           <w:sz w:val="22"/>
           <w:szCs w:val="22"/>
         </w:rPr>
-        <w:t xml:space="preserve"> </w:t>
-      </w:r>
-      <w:r>
-        <w:rPr>
-          <w:rFonts w:ascii="Calibri" w:hAnsi="Calibri" w:cs="Calibri"/>
-          <w:color w:val="1A1A1A"/>
-          <w:sz w:val="22"/>
-          <w:szCs w:val="22"/>
-        </w:rPr>
-        <w:t xml:space="preserve">(yes/no), </w:t>
+        <w:t xml:space="preserve"> (yes/no), </w:t>
       </w:r>
       <w:r>
         <w:rPr>
@@ -10039,7 +10169,17 @@
           <w:sz w:val="22"/>
           <w:szCs w:val="22"/>
         </w:rPr>
-        <w:t xml:space="preserve">latest </w:t>
+        <w:t>latest</w:t>
+      </w:r>
+      <w:r>
+        <w:rPr>
+          <w:rStyle w:val="Strong"/>
+          <w:rFonts w:ascii="Calibri" w:hAnsi="Calibri" w:cs="Calibri"/>
+          <w:color w:val="1A1A1A"/>
+          <w:sz w:val="22"/>
+          <w:szCs w:val="22"/>
+        </w:rPr>
+        <w:t xml:space="preserve"> </w:t>
       </w:r>
       <w:r>
         <w:rPr>
@@ -10332,7 +10472,16 @@
           <w:szCs w:val="19"/>
           <w:shd w:val="clear" w:color="auto" w:fill="F2F2F2"/>
         </w:rPr>
-        <w:t xml:space="preserve">   |---- purchases -------|  (purchase.quote_id -&gt; the chosen quote)</w:t>
+        <w:t xml:space="preserve">   |---- purchases -------|  (purchase.quote_id -&gt; </w:t>
+      </w:r>
+      <w:r>
+        <w:rPr>
+          <w:color w:val="1A1A1A"/>
+          <w:sz w:val="19"/>
+          <w:szCs w:val="19"/>
+          <w:shd w:val="clear" w:color="auto" w:fill="F2F2F2"/>
+        </w:rPr>
+        <w:t>the chosen quote)</w:t>
       </w:r>
     </w:p>
     <w:p>
@@ -10962,7 +11111,16 @@
                 <w:sz w:val="22"/>
                 <w:szCs w:val="22"/>
               </w:rPr>
-              <w:t xml:space="preserve"> (VAT / Non-VAT)</w:t>
+              <w:t xml:space="preserve"> </w:t>
+            </w:r>
+            <w:r>
+              <w:rPr>
+                <w:rFonts w:ascii="Calibri" w:eastAsia="Times New Roman" w:hAnsi="Calibri" w:cs="Calibri"/>
+                <w:color w:val="1A1A1A"/>
+                <w:sz w:val="22"/>
+                <w:szCs w:val="22"/>
+              </w:rPr>
+              <w:t>(VAT / Non-VAT)</w:t>
             </w:r>
           </w:p>
         </w:tc>
@@ -11766,16 +11924,7 @@
                 <w:sz w:val="22"/>
                 <w:szCs w:val="22"/>
               </w:rPr>
-              <w:t xml:space="preserve"> </w:t>
-            </w:r>
-            <w:r>
-              <w:rPr>
-                <w:rFonts w:ascii="Calibri" w:eastAsia="Times New Roman" w:hAnsi="Calibri" w:cs="Calibri"/>
-                <w:color w:val="1A1A1A"/>
-                <w:sz w:val="22"/>
-                <w:szCs w:val="22"/>
-              </w:rPr>
-              <w:t xml:space="preserve">(Preventive / Repair), work done, </w:t>
+              <w:t xml:space="preserve"> (Preventive / Repair), work done, </w:t>
             </w:r>
             <w:r>
               <w:rPr>
@@ -12059,16 +12208,7 @@
           <w:szCs w:val="19"/>
           <w:shd w:val="clear" w:color="auto" w:fill="F2F2F2"/>
         </w:rPr>
-        <w:t xml:space="preserve">   sub_jobs ----&gt; </w:t>
-      </w:r>
-      <w:r>
-        <w:rPr>
-          <w:color w:val="1A1A1A"/>
-          <w:sz w:val="19"/>
-          <w:szCs w:val="19"/>
-          <w:shd w:val="clear" w:color="auto" w:fill="F2F2F2"/>
-        </w:rPr>
-        <w:t>projects</w:t>
+        <w:t xml:space="preserve">   sub_jobs ----&gt; projects</w:t>
       </w:r>
     </w:p>
     <w:p>
@@ -13014,7 +13154,16 @@
                 <w:sz w:val="22"/>
                 <w:szCs w:val="22"/>
               </w:rPr>
-              <w:t xml:space="preserve"> (0-100), date, notes, file</w:t>
+              <w:t xml:space="preserve"> </w:t>
+            </w:r>
+            <w:r>
+              <w:rPr>
+                <w:rFonts w:ascii="Calibri" w:eastAsia="Times New Roman" w:hAnsi="Calibri" w:cs="Calibri"/>
+                <w:color w:val="1A1A1A"/>
+                <w:sz w:val="22"/>
+                <w:szCs w:val="22"/>
+              </w:rPr>
+              <w:t>(0-100), date, notes, file</w:t>
             </w:r>
           </w:p>
         </w:tc>
@@ -13892,16 +14041,7 @@
           <w:sz w:val="22"/>
           <w:szCs w:val="22"/>
         </w:rPr>
-        <w:t xml:space="preserve"> </w:t>
-      </w:r>
-      <w:r>
-        <w:rPr>
-          <w:rFonts w:ascii="Calibri" w:hAnsi="Calibri" w:cs="Calibri"/>
-          <w:color w:val="1A1A1A"/>
-          <w:sz w:val="22"/>
-          <w:szCs w:val="22"/>
-        </w:rPr>
-        <w:t xml:space="preserve">The Receipt Vault reads delivery receipts straight from </w:t>
+        <w:t xml:space="preserve"> The Receipt Vault reads delivery receipts straight from </w:t>
       </w:r>
       <w:r>
         <w:rPr>
@@ -14038,7 +14178,16 @@
           <w:sz w:val="22"/>
           <w:szCs w:val="22"/>
         </w:rPr>
-        <w:t xml:space="preserve"> (+/-), signed document, </w:t>
+        <w:t xml:space="preserve"> </w:t>
+      </w:r>
+      <w:r>
+        <w:rPr>
+          <w:rFonts w:ascii="Calibri" w:hAnsi="Calibri" w:cs="Calibri"/>
+          <w:color w:val="1A1A1A"/>
+          <w:sz w:val="22"/>
+          <w:szCs w:val="22"/>
+        </w:rPr>
+        <w:t xml:space="preserve">(+/-), signed document, </w:t>
       </w:r>
       <w:r>
         <w:rPr>
@@ -14638,7 +14787,16 @@
                 <w:sz w:val="22"/>
                 <w:szCs w:val="22"/>
               </w:rPr>
-              <w:t xml:space="preserve"> where Project and Approved</w:t>
+              <w:t xml:space="preserve"> </w:t>
+            </w:r>
+            <w:r>
+              <w:rPr>
+                <w:rFonts w:ascii="Calibri" w:eastAsia="Times New Roman" w:hAnsi="Calibri" w:cs="Calibri"/>
+                <w:color w:val="1A1A1A"/>
+                <w:sz w:val="22"/>
+                <w:szCs w:val="22"/>
+              </w:rPr>
+              <w:t>where Project and Approved</w:t>
             </w:r>
           </w:p>
         </w:tc>
@@ -15062,88 +15220,88 @@
           <w:szCs w:val="19"/>
           <w:shd w:val="clear" w:color="auto" w:fill="F2F2F2"/>
         </w:rPr>
-        <w:t xml:space="preserve">                     WHERE c.project_id = p.project_id AND c.status = 'Approved'), 0) AS revenue,</w:t>
-      </w:r>
-    </w:p>
-    <w:p>
-      <w:pPr>
-        <w:pStyle w:val="HTMLPreformatted"/>
+        <w:t xml:space="preserve">                     </w:t>
+      </w:r>
+      <w:r>
         <w:rPr>
           <w:color w:val="1A1A1A"/>
           <w:sz w:val="19"/>
           <w:szCs w:val="19"/>
           <w:shd w:val="clear" w:color="auto" w:fill="F2F2F2"/>
         </w:rPr>
-      </w:pPr>
-      <w:r>
+        <w:t>WHERE c.project_id = p.project_id AND c.status = 'Approved'), 0) AS revenue,</w:t>
+      </w:r>
+    </w:p>
+    <w:p>
+      <w:pPr>
+        <w:pStyle w:val="HTMLPreformatted"/>
         <w:rPr>
           <w:color w:val="1A1A1A"/>
           <w:sz w:val="19"/>
           <w:szCs w:val="19"/>
           <w:shd w:val="clear" w:color="auto" w:fill="F2F2F2"/>
         </w:rPr>
-        <w:t xml:space="preserve">       COALESCE((SELECT SUM(cost) FROM material_usages u</w:t>
-      </w:r>
-    </w:p>
-    <w:p>
-      <w:pPr>
-        <w:pStyle w:val="HTMLPreformatted"/>
+      </w:pPr>
+      <w:r>
         <w:rPr>
           <w:color w:val="1A1A1A"/>
           <w:sz w:val="19"/>
           <w:szCs w:val="19"/>
           <w:shd w:val="clear" w:color="auto" w:fill="F2F2F2"/>
         </w:rPr>
-      </w:pPr>
-      <w:r>
+        <w:t xml:space="preserve">       COALESCE((SELECT SUM(cost) FROM material_usages u</w:t>
+      </w:r>
+    </w:p>
+    <w:p>
+      <w:pPr>
+        <w:pStyle w:val="HTMLPreformatted"/>
         <w:rPr>
           <w:color w:val="1A1A1A"/>
           <w:sz w:val="19"/>
           <w:szCs w:val="19"/>
           <w:shd w:val="clear" w:color="auto" w:fill="F2F2F2"/>
         </w:rPr>
-        <w:t xml:space="preserve">                 WHERE u.project_id = p.project_id AND u.status = 'Approved'), 0)</w:t>
-      </w:r>
-    </w:p>
-    <w:p>
-      <w:pPr>
-        <w:pStyle w:val="HTMLPreformatted"/>
+      </w:pPr>
+      <w:r>
         <w:rPr>
           <w:color w:val="1A1A1A"/>
           <w:sz w:val="19"/>
           <w:szCs w:val="19"/>
           <w:shd w:val="clear" w:color="auto" w:fill="F2F2F2"/>
         </w:rPr>
-      </w:pPr>
-      <w:r>
+        <w:t xml:space="preserve">                 WHERE u.project_id = p.project_id AND u.status = 'Approved'), 0)</w:t>
+      </w:r>
+    </w:p>
+    <w:p>
+      <w:pPr>
+        <w:pStyle w:val="HTMLPreformatted"/>
         <w:rPr>
           <w:color w:val="1A1A1A"/>
           <w:sz w:val="19"/>
           <w:szCs w:val="19"/>
           <w:shd w:val="clear" w:color="auto" w:fill="F2F2F2"/>
         </w:rPr>
-        <w:t xml:space="preserve">     + COALESCE((SELECT SUM(amount) FROM receipts r</w:t>
-      </w:r>
-    </w:p>
-    <w:p>
-      <w:pPr>
-        <w:pStyle w:val="HTMLPreformatted"/>
+      </w:pPr>
+      <w:r>
         <w:rPr>
           <w:color w:val="1A1A1A"/>
           <w:sz w:val="19"/>
           <w:szCs w:val="19"/>
           <w:shd w:val="clear" w:color="auto" w:fill="F2F2F2"/>
         </w:rPr>
-      </w:pPr>
-      <w:r>
+        <w:t xml:space="preserve">     + COALESCE((SELECT SUM(amount) FROM receipts r</w:t>
+      </w:r>
+    </w:p>
+    <w:p>
+      <w:pPr>
+        <w:pStyle w:val="HTMLPreformatted"/>
         <w:rPr>
           <w:color w:val="1A1A1A"/>
           <w:sz w:val="19"/>
           <w:szCs w:val="19"/>
           <w:shd w:val="clear" w:color="auto" w:fill="F2F2F2"/>
         </w:rPr>
-        <w:t xml:space="preserve">                 </w:t>
-      </w:r>
+      </w:pPr>
       <w:r>
         <w:rPr>
           <w:color w:val="1A1A1A"/>
@@ -15151,7 +15309,7 @@
           <w:szCs w:val="19"/>
           <w:shd w:val="clear" w:color="auto" w:fill="F2F2F2"/>
         </w:rPr>
-        <w:t>WHERE r.project_id = p.project_id AND r.status = 'Approved'), 0)</w:t>
+        <w:t xml:space="preserve">                 WHERE r.project_id = p.project_id AND r.status = 'Approved'), 0)</w:t>
       </w:r>
     </w:p>
     <w:p>
@@ -15191,7 +15349,16 @@
           <w:szCs w:val="19"/>
           <w:shd w:val="clear" w:color="auto" w:fill="F2F2F2"/>
         </w:rPr>
-        <w:t xml:space="preserve">                 WHERE j.project_id = p.project_id), 0) AS expenses</w:t>
+        <w:t xml:space="preserve">                 </w:t>
+      </w:r>
+      <w:r>
+        <w:rPr>
+          <w:color w:val="1A1A1A"/>
+          <w:sz w:val="19"/>
+          <w:szCs w:val="19"/>
+          <w:shd w:val="clear" w:color="auto" w:fill="F2F2F2"/>
+        </w:rPr>
+        <w:t>WHERE j.project_id = p.project_id), 0) AS expenses</w:t>
       </w:r>
     </w:p>
     <w:p>
@@ -16065,7 +16232,16 @@
           <w:sz w:val="22"/>
           <w:szCs w:val="22"/>
         </w:rPr>
-        <w:t xml:space="preserve"> process (0, the Desktop Management Supersystem), surrounded by the outside world: the Admin user, employees, the biometrics device, clients, subcontractors, suppliers/vendors, external accounting and the website system.</w:t>
+        <w:t xml:space="preserve"> </w:t>
+      </w:r>
+      <w:r>
+        <w:rPr>
+          <w:rFonts w:ascii="Calibri" w:eastAsia="Times New Roman" w:hAnsi="Calibri" w:cs="Calibri"/>
+          <w:color w:val="1A1A1A"/>
+          <w:sz w:val="22"/>
+          <w:szCs w:val="22"/>
+        </w:rPr>
+        <w:t>process (0, the Desktop Management Supersystem), surrounded by the outside world: the Admin user, employees, the biometrics device, clients, subcontractors, suppliers/vendors, external accounting and the website system.</w:t>
       </w:r>
     </w:p>
     <w:p>
@@ -16676,7 +16852,16 @@
                 <w:sz w:val="22"/>
                 <w:szCs w:val="22"/>
               </w:rPr>
-              <w:t>Subcontractor &amp; Vendor Management</w:t>
+              <w:t xml:space="preserve">Subcontractor &amp; </w:t>
+            </w:r>
+            <w:r>
+              <w:rPr>
+                <w:rFonts w:ascii="Calibri" w:eastAsia="Times New Roman" w:hAnsi="Calibri" w:cs="Calibri"/>
+                <w:color w:val="1A1A1A"/>
+                <w:sz w:val="22"/>
+                <w:szCs w:val="22"/>
+              </w:rPr>
+              <w:t>Vendor Management</w:t>
             </w:r>
           </w:p>
         </w:tc>
@@ -18577,7 +18762,16 @@
                 <w:sz w:val="22"/>
                 <w:szCs w:val="22"/>
               </w:rPr>
-              <w:t xml:space="preserve"> (+ delivery receipts read from </w:t>
+              <w:t xml:space="preserve"> </w:t>
+            </w:r>
+            <w:r>
+              <w:rPr>
+                <w:rFonts w:ascii="Calibri" w:eastAsia="Times New Roman" w:hAnsi="Calibri" w:cs="Calibri"/>
+                <w:color w:val="1A1A1A"/>
+                <w:sz w:val="22"/>
+                <w:szCs w:val="22"/>
+              </w:rPr>
+              <w:t xml:space="preserve">(+ delivery receipts read from </w:t>
             </w:r>
             <w:r>
               <w:rPr>
@@ -18992,43 +19186,7 @@
           <w:sz w:val="22"/>
           <w:szCs w:val="22"/>
         </w:rPr>
-        <w:t xml:space="preserve"> </w:t>
-      </w:r>
-      <w:r>
-        <w:rPr>
-          <w:rFonts w:ascii="Calibri" w:eastAsia="Times New Roman" w:hAnsi="Calibri" w:cs="Calibri"/>
-          <w:color w:val="1A1A1A"/>
-          <w:sz w:val="22"/>
-          <w:szCs w:val="22"/>
-        </w:rPr>
-        <w:t>→</w:t>
-      </w:r>
-      <w:r>
-        <w:rPr>
-          <w:rFonts w:ascii="Calibri" w:eastAsia="Times New Roman" w:hAnsi="Calibri" w:cs="Calibri"/>
-          <w:color w:val="1A1A1A"/>
-          <w:sz w:val="22"/>
-          <w:szCs w:val="22"/>
-        </w:rPr>
-        <w:t xml:space="preserve"> "material usage entry" </w:t>
-      </w:r>
-      <w:r>
-        <w:rPr>
-          <w:rFonts w:ascii="Calibri" w:eastAsia="Times New Roman" w:hAnsi="Calibri" w:cs="Calibri"/>
-          <w:color w:val="1A1A1A"/>
-          <w:sz w:val="22"/>
-          <w:szCs w:val="22"/>
-        </w:rPr>
-        <w:t>→</w:t>
-      </w:r>
-      <w:r>
-        <w:rPr>
-          <w:rFonts w:ascii="Calibri" w:eastAsia="Times New Roman" w:hAnsi="Calibri" w:cs="Calibri"/>
-          <w:color w:val="1A1A1A"/>
-          <w:sz w:val="22"/>
-          <w:szCs w:val="22"/>
-        </w:rPr>
-        <w:t xml:space="preserve"> </w:t>
+        <w:t xml:space="preserve"> → "material usage entry" → </w:t>
       </w:r>
       <w:r>
         <w:rPr>
@@ -19047,25 +19205,7 @@
           <w:sz w:val="22"/>
           <w:szCs w:val="22"/>
         </w:rPr>
-        <w:t xml:space="preserve"> </w:t>
-      </w:r>
-      <w:r>
-        <w:rPr>
-          <w:rFonts w:ascii="Calibri" w:eastAsia="Times New Roman" w:hAnsi="Calibri" w:cs="Calibri"/>
-          <w:color w:val="1A1A1A"/>
-          <w:sz w:val="22"/>
-          <w:szCs w:val="22"/>
-        </w:rPr>
-        <w:t>→ saved in</w:t>
-      </w:r>
-      <w:r>
-        <w:rPr>
-          <w:rFonts w:ascii="Calibri" w:eastAsia="Times New Roman" w:hAnsi="Calibri" w:cs="Calibri"/>
-          <w:color w:val="1A1A1A"/>
-          <w:sz w:val="22"/>
-          <w:szCs w:val="22"/>
-        </w:rPr>
-        <w:t xml:space="preserve"> </w:t>
+        <w:t xml:space="preserve"> → saved in </w:t>
       </w:r>
       <w:r>
         <w:rPr>
@@ -19134,25 +19274,7 @@
           <w:sz w:val="22"/>
           <w:szCs w:val="22"/>
         </w:rPr>
-        <w:t xml:space="preserve"> </w:t>
-      </w:r>
-      <w:r>
-        <w:rPr>
-          <w:rFonts w:ascii="Calibri" w:eastAsia="Times New Roman" w:hAnsi="Calibri" w:cs="Calibri"/>
-          <w:color w:val="1A1A1A"/>
-          <w:sz w:val="22"/>
-          <w:szCs w:val="22"/>
-        </w:rPr>
-        <w:t>approves →</w:t>
-      </w:r>
-      <w:r>
-        <w:rPr>
-          <w:rFonts w:ascii="Calibri" w:eastAsia="Times New Roman" w:hAnsi="Calibri" w:cs="Calibri"/>
-          <w:color w:val="1A1A1A"/>
-          <w:sz w:val="22"/>
-          <w:szCs w:val="22"/>
-        </w:rPr>
-        <w:t xml:space="preserve"> </w:t>
+        <w:t xml:space="preserve"> approves → </w:t>
       </w:r>
       <w:r>
         <w:rPr>
@@ -19256,25 +19378,7 @@
           <w:sz w:val="22"/>
           <w:szCs w:val="22"/>
         </w:rPr>
-        <w:t xml:space="preserve"> </w:t>
-      </w:r>
-      <w:r>
-        <w:rPr>
-          <w:rFonts w:ascii="Calibri" w:eastAsia="Times New Roman" w:hAnsi="Calibri" w:cs="Calibri"/>
-          <w:color w:val="1A1A1A"/>
-          <w:sz w:val="22"/>
-          <w:szCs w:val="22"/>
-        </w:rPr>
-        <w:t>→ the project</w:t>
-      </w:r>
-      <w:r>
-        <w:rPr>
-          <w:rFonts w:ascii="Calibri" w:eastAsia="Times New Roman" w:hAnsi="Calibri" w:cs="Calibri"/>
-          <w:color w:val="1A1A1A"/>
-          <w:sz w:val="22"/>
-          <w:szCs w:val="22"/>
-        </w:rPr>
-        <w:t>'s expenses now include that cost.</w:t>
+        <w:t xml:space="preserve"> → the project's expenses now include that cost.</w:t>
       </w:r>
     </w:p>
     <w:p>
@@ -19443,8 +19547,7 @@
       <w:pPr>
         <w:pStyle w:val="NormalWeb"/>
         <w:shd w:val="clear" w:color="auto" w:fill="EEF2F8"/>
-        <w:ind w:right="720"/>
-        <w:divId w:val="1396926525"/>
+        <w:divId w:val="1163157627"/>
         <w:rPr>
           <w:rFonts w:ascii="Calibri" w:hAnsi="Calibri" w:cs="Calibri"/>
           <w:color w:val="404040"/>
@@ -22652,9 +22755,9 @@
 <file path=word/numbering.xml><?xml version="1.0" encoding="utf-8"?>
 <w:numbering xmlns:wpc="http://schemas.microsoft.com/office/word/2010/wordprocessingCanvas" xmlns:cx="http://schemas.microsoft.com/office/drawing/2014/chartex" xmlns:cx1="http://schemas.microsoft.com/office/drawing/2015/9/8/chartex" xmlns:cx2="http://schemas.microsoft.com/office/drawing/2015/10/21/chartex" xmlns:cx3="http://schemas.microsoft.com/office/drawing/2016/5/9/chartex" xmlns:cx4="http://schemas.microsoft.com/office/drawing/2016/5/10/chartex" xmlns:cx5="http://schemas.microsoft.com/office/drawing/2016/5/11/chartex" xmlns:cx6="http://schemas.microsoft.com/office/drawing/2016/5/12/chartex" xmlns:cx7="http://schemas.microsoft.com/office/drawing/2016/5/13/chartex" xmlns:cx8="http://schemas.microsoft.com/office/drawing/2016/5/14/chartex" xmlns:mc="http://schemas.openxmlformats.org/markup-compatibility/2006" xmlns:aink="http://schemas.microsoft.com/office/drawing/2016/ink" xmlns:am3d="http://schemas.microsoft.com/office/drawing/2017/model3d" xmlns:o="urn:schemas-microsoft-com:office:office" xmlns:oel="http://schemas.microsoft.com/office/2019/extlst" xmlns:r="http://schemas.openxmlformats.org/officeDocument/2006/relationships" xmlns:m="http://schemas.openxmlformats.org/officeDocument/2006/math" xmlns:v="urn:schemas-microsoft-com:vml" xmlns:wp14="http://schemas.microsoft.com/office/word/2010/wordprocessingDrawing" xmlns:wp="http://schemas.openxmlformats.org/drawingml/2006/wordprocessingDrawing" xmlns:w10="urn:schemas-microsoft-com:office:word" xmlns:w="http://schemas.openxmlformats.org/wordprocessingml/2006/main" xmlns:w14="http://schemas.microsoft.com/office/word/2010/wordml" xmlns:w15="http://schemas.microsoft.com/office/word/2012/wordml" xmlns:w16cex="http://schemas.microsoft.com/office/word/2018/wordml/cex" xmlns:w16cid="http://schemas.microsoft.com/office/word/2016/wordml/cid" xmlns:w16="http://schemas.microsoft.com/office/word/2018/wordml" xmlns:w16du="http://schemas.microsoft.com/office/word/2023/wordml/word16du" xmlns:w16sdtdh="http://schemas.microsoft.com/office/word/2020/wordml/sdtdatahash" xmlns:w16sdtfl="http://schemas.microsoft.com/office/word/2024/wordml/sdtformatlock" xmlns:w16se="http://schemas.microsoft.com/office/word/2015/wordml/symex" xmlns:wpg="http://schemas.microsoft.com/office/word/2010/wordprocessingGroup" xmlns:wpi="http://schemas.microsoft.com/office/word/2010/wordprocessingInk" xmlns:wne="http://schemas.microsoft.com/office/word/2006/wordml" xmlns:wps="http://schemas.microsoft.com/office/word/2010/wordprocessingShape" mc:Ignorable="w14 w15 w16se w16cid w16 w16cex w16sdtdh w16sdtfl w16du wp14">
   <w:abstractNum w:abstractNumId="0" w15:restartNumberingAfterBreak="0">
-    <w:nsid w:val="00E511C9"/>
+    <w:nsid w:val="01A12286"/>
     <w:multiLevelType w:val="multilevel"/>
-    <w:tmpl w:val="17A2F810"/>
+    <w:tmpl w:val="3C60A238"/>
     <w:lvl w:ilvl="0">
       <w:start w:val="1"/>
       <w:numFmt w:val="bullet"/>
@@ -22801,122 +22904,9 @@
     </w:lvl>
   </w:abstractNum>
   <w:abstractNum w:abstractNumId="1" w15:restartNumberingAfterBreak="0">
-    <w:nsid w:val="01A422B0"/>
+    <w:nsid w:val="27756E35"/>
     <w:multiLevelType w:val="multilevel"/>
-    <w:tmpl w:val="EE36128C"/>
-    <w:lvl w:ilvl="0">
-      <w:start w:val="1"/>
-      <w:numFmt w:val="decimal"/>
-      <w:lvlText w:val="%1."/>
-      <w:lvlJc w:val="left"/>
-      <w:pPr>
-        <w:tabs>
-          <w:tab w:val="num" w:pos="720"/>
-        </w:tabs>
-        <w:ind w:left="720" w:hanging="360"/>
-      </w:pPr>
-    </w:lvl>
-    <w:lvl w:ilvl="1" w:tentative="1">
-      <w:start w:val="1"/>
-      <w:numFmt w:val="decimal"/>
-      <w:lvlText w:val="%2."/>
-      <w:lvlJc w:val="left"/>
-      <w:pPr>
-        <w:tabs>
-          <w:tab w:val="num" w:pos="1440"/>
-        </w:tabs>
-        <w:ind w:left="1440" w:hanging="360"/>
-      </w:pPr>
-    </w:lvl>
-    <w:lvl w:ilvl="2" w:tentative="1">
-      <w:start w:val="1"/>
-      <w:numFmt w:val="decimal"/>
-      <w:lvlText w:val="%3."/>
-      <w:lvlJc w:val="left"/>
-      <w:pPr>
-        <w:tabs>
-          <w:tab w:val="num" w:pos="2160"/>
-        </w:tabs>
-        <w:ind w:left="2160" w:hanging="360"/>
-      </w:pPr>
-    </w:lvl>
-    <w:lvl w:ilvl="3" w:tentative="1">
-      <w:start w:val="1"/>
-      <w:numFmt w:val="decimal"/>
-      <w:lvlText w:val="%4."/>
-      <w:lvlJc w:val="left"/>
-      <w:pPr>
-        <w:tabs>
-          <w:tab w:val="num" w:pos="2880"/>
-        </w:tabs>
-        <w:ind w:left="2880" w:hanging="360"/>
-      </w:pPr>
-    </w:lvl>
-    <w:lvl w:ilvl="4" w:tentative="1">
-      <w:start w:val="1"/>
-      <w:numFmt w:val="decimal"/>
-      <w:lvlText w:val="%5."/>
-      <w:lvlJc w:val="left"/>
-      <w:pPr>
-        <w:tabs>
-          <w:tab w:val="num" w:pos="3600"/>
-        </w:tabs>
-        <w:ind w:left="3600" w:hanging="360"/>
-      </w:pPr>
-    </w:lvl>
-    <w:lvl w:ilvl="5" w:tentative="1">
-      <w:start w:val="1"/>
-      <w:numFmt w:val="decimal"/>
-      <w:lvlText w:val="%6."/>
-      <w:lvlJc w:val="left"/>
-      <w:pPr>
-        <w:tabs>
-          <w:tab w:val="num" w:pos="4320"/>
-        </w:tabs>
-        <w:ind w:left="4320" w:hanging="360"/>
-      </w:pPr>
-    </w:lvl>
-    <w:lvl w:ilvl="6" w:tentative="1">
-      <w:start w:val="1"/>
-      <w:numFmt w:val="decimal"/>
-      <w:lvlText w:val="%7."/>
-      <w:lvlJc w:val="left"/>
-      <w:pPr>
-        <w:tabs>
-          <w:tab w:val="num" w:pos="5040"/>
-        </w:tabs>
-        <w:ind w:left="5040" w:hanging="360"/>
-      </w:pPr>
-    </w:lvl>
-    <w:lvl w:ilvl="7" w:tentative="1">
-      <w:start w:val="1"/>
-      <w:numFmt w:val="decimal"/>
-      <w:lvlText w:val="%8."/>
-      <w:lvlJc w:val="left"/>
-      <w:pPr>
-        <w:tabs>
-          <w:tab w:val="num" w:pos="5760"/>
-        </w:tabs>
-        <w:ind w:left="5760" w:hanging="360"/>
-      </w:pPr>
-    </w:lvl>
-    <w:lvl w:ilvl="8" w:tentative="1">
-      <w:start w:val="1"/>
-      <w:numFmt w:val="decimal"/>
-      <w:lvlText w:val="%9."/>
-      <w:lvlJc w:val="left"/>
-      <w:pPr>
-        <w:tabs>
-          <w:tab w:val="num" w:pos="6480"/>
-        </w:tabs>
-        <w:ind w:left="6480" w:hanging="360"/>
-      </w:pPr>
-    </w:lvl>
-  </w:abstractNum>
-  <w:abstractNum w:abstractNumId="2" w15:restartNumberingAfterBreak="0">
-    <w:nsid w:val="2B6034B0"/>
-    <w:multiLevelType w:val="multilevel"/>
-    <w:tmpl w:val="EE4A1CDA"/>
+    <w:tmpl w:val="4C04B986"/>
     <w:lvl w:ilvl="0">
       <w:start w:val="1"/>
       <w:numFmt w:val="bullet"/>
@@ -23062,10 +23052,10 @@
       </w:rPr>
     </w:lvl>
   </w:abstractNum>
-  <w:abstractNum w:abstractNumId="3" w15:restartNumberingAfterBreak="0">
-    <w:nsid w:val="3E3D5F93"/>
+  <w:abstractNum w:abstractNumId="2" w15:restartNumberingAfterBreak="0">
+    <w:nsid w:val="41B917B2"/>
     <w:multiLevelType w:val="multilevel"/>
-    <w:tmpl w:val="C2FE36D2"/>
+    <w:tmpl w:val="86DE734E"/>
     <w:lvl w:ilvl="0">
       <w:start w:val="1"/>
       <w:numFmt w:val="bullet"/>
@@ -23211,10 +23201,10 @@
       </w:rPr>
     </w:lvl>
   </w:abstractNum>
-  <w:abstractNum w:abstractNumId="4" w15:restartNumberingAfterBreak="0">
-    <w:nsid w:val="3FBB2234"/>
+  <w:abstractNum w:abstractNumId="3" w15:restartNumberingAfterBreak="0">
+    <w:nsid w:val="51B95E59"/>
     <w:multiLevelType w:val="multilevel"/>
-    <w:tmpl w:val="9B823562"/>
+    <w:tmpl w:val="464E8F8C"/>
     <w:lvl w:ilvl="0">
       <w:start w:val="1"/>
       <w:numFmt w:val="bullet"/>
@@ -23360,10 +23350,123 @@
       </w:rPr>
     </w:lvl>
   </w:abstractNum>
+  <w:abstractNum w:abstractNumId="4" w15:restartNumberingAfterBreak="0">
+    <w:nsid w:val="529C679F"/>
+    <w:multiLevelType w:val="multilevel"/>
+    <w:tmpl w:val="1B48E008"/>
+    <w:lvl w:ilvl="0">
+      <w:start w:val="1"/>
+      <w:numFmt w:val="decimal"/>
+      <w:lvlText w:val="%1."/>
+      <w:lvlJc w:val="left"/>
+      <w:pPr>
+        <w:tabs>
+          <w:tab w:val="num" w:pos="720"/>
+        </w:tabs>
+        <w:ind w:left="720" w:hanging="360"/>
+      </w:pPr>
+    </w:lvl>
+    <w:lvl w:ilvl="1" w:tentative="1">
+      <w:start w:val="1"/>
+      <w:numFmt w:val="decimal"/>
+      <w:lvlText w:val="%2."/>
+      <w:lvlJc w:val="left"/>
+      <w:pPr>
+        <w:tabs>
+          <w:tab w:val="num" w:pos="1440"/>
+        </w:tabs>
+        <w:ind w:left="1440" w:hanging="360"/>
+      </w:pPr>
+    </w:lvl>
+    <w:lvl w:ilvl="2" w:tentative="1">
+      <w:start w:val="1"/>
+      <w:numFmt w:val="decimal"/>
+      <w:lvlText w:val="%3."/>
+      <w:lvlJc w:val="left"/>
+      <w:pPr>
+        <w:tabs>
+          <w:tab w:val="num" w:pos="2160"/>
+        </w:tabs>
+        <w:ind w:left="2160" w:hanging="360"/>
+      </w:pPr>
+    </w:lvl>
+    <w:lvl w:ilvl="3" w:tentative="1">
+      <w:start w:val="1"/>
+      <w:numFmt w:val="decimal"/>
+      <w:lvlText w:val="%4."/>
+      <w:lvlJc w:val="left"/>
+      <w:pPr>
+        <w:tabs>
+          <w:tab w:val="num" w:pos="2880"/>
+        </w:tabs>
+        <w:ind w:left="2880" w:hanging="360"/>
+      </w:pPr>
+    </w:lvl>
+    <w:lvl w:ilvl="4" w:tentative="1">
+      <w:start w:val="1"/>
+      <w:numFmt w:val="decimal"/>
+      <w:lvlText w:val="%5."/>
+      <w:lvlJc w:val="left"/>
+      <w:pPr>
+        <w:tabs>
+          <w:tab w:val="num" w:pos="3600"/>
+        </w:tabs>
+        <w:ind w:left="3600" w:hanging="360"/>
+      </w:pPr>
+    </w:lvl>
+    <w:lvl w:ilvl="5" w:tentative="1">
+      <w:start w:val="1"/>
+      <w:numFmt w:val="decimal"/>
+      <w:lvlText w:val="%6."/>
+      <w:lvlJc w:val="left"/>
+      <w:pPr>
+        <w:tabs>
+          <w:tab w:val="num" w:pos="4320"/>
+        </w:tabs>
+        <w:ind w:left="4320" w:hanging="360"/>
+      </w:pPr>
+    </w:lvl>
+    <w:lvl w:ilvl="6" w:tentative="1">
+      <w:start w:val="1"/>
+      <w:numFmt w:val="decimal"/>
+      <w:lvlText w:val="%7."/>
+      <w:lvlJc w:val="left"/>
+      <w:pPr>
+        <w:tabs>
+          <w:tab w:val="num" w:pos="5040"/>
+        </w:tabs>
+        <w:ind w:left="5040" w:hanging="360"/>
+      </w:pPr>
+    </w:lvl>
+    <w:lvl w:ilvl="7" w:tentative="1">
+      <w:start w:val="1"/>
+      <w:numFmt w:val="decimal"/>
+      <w:lvlText w:val="%8."/>
+      <w:lvlJc w:val="left"/>
+      <w:pPr>
+        <w:tabs>
+          <w:tab w:val="num" w:pos="5760"/>
+        </w:tabs>
+        <w:ind w:left="5760" w:hanging="360"/>
+      </w:pPr>
+    </w:lvl>
+    <w:lvl w:ilvl="8" w:tentative="1">
+      <w:start w:val="1"/>
+      <w:numFmt w:val="decimal"/>
+      <w:lvlText w:val="%9."/>
+      <w:lvlJc w:val="left"/>
+      <w:pPr>
+        <w:tabs>
+          <w:tab w:val="num" w:pos="6480"/>
+        </w:tabs>
+        <w:ind w:left="6480" w:hanging="360"/>
+      </w:pPr>
+    </w:lvl>
+  </w:abstractNum>
   <w:abstractNum w:abstractNumId="5" w15:restartNumberingAfterBreak="0">
-    <w:nsid w:val="48CF0044"/>
+    <w:nsid w:val="60E90884"/>
     <w:multiLevelType w:val="multilevel"/>
-    <w:tmpl w:val="8EDE3DF2"/>
+    <w:tmpl w:val="A3F802B6"/>
     <w:lvl w:ilvl="0">
       <w:start w:val="1"/>
       <w:numFmt w:val="bullet"/>
@@ -23510,9 +23613,9 @@
     </w:lvl>
   </w:abstractNum>
   <w:abstractNum w:abstractNumId="6" w15:restartNumberingAfterBreak="0">
-    <w:nsid w:val="62CC7B08"/>
+    <w:nsid w:val="6B7A0535"/>
     <w:multiLevelType w:val="multilevel"/>
-    <w:tmpl w:val="48925A1C"/>
+    <w:tmpl w:val="EA0C526A"/>
     <w:lvl w:ilvl="0">
       <w:start w:val="1"/>
       <w:numFmt w:val="bullet"/>
@@ -23659,9 +23762,122 @@
     </w:lvl>
   </w:abstractNum>
   <w:abstractNum w:abstractNumId="7" w15:restartNumberingAfterBreak="0">
-    <w:nsid w:val="68013C3B"/>
+    <w:nsid w:val="6F1717AC"/>
     <w:multiLevelType w:val="multilevel"/>
-    <w:tmpl w:val="B796A41E"/>
+    <w:tmpl w:val="A296C7C4"/>
+    <w:lvl w:ilvl="0">
+      <w:start w:val="1"/>
+      <w:numFmt w:val="decimal"/>
+      <w:lvlText w:val="%1."/>
+      <w:lvlJc w:val="left"/>
+      <w:pPr>
+        <w:tabs>
+          <w:tab w:val="num" w:pos="720"/>
+        </w:tabs>
+        <w:ind w:left="720" w:hanging="360"/>
+      </w:pPr>
+    </w:lvl>
+    <w:lvl w:ilvl="1" w:tentative="1">
+      <w:start w:val="1"/>
+      <w:numFmt w:val="decimal"/>
+      <w:lvlText w:val="%2."/>
+      <w:lvlJc w:val="left"/>
+      <w:pPr>
+        <w:tabs>
+          <w:tab w:val="num" w:pos="1440"/>
+        </w:tabs>
+        <w:ind w:left="1440" w:hanging="360"/>
+      </w:pPr>
+    </w:lvl>
+    <w:lvl w:ilvl="2" w:tentative="1">
+      <w:start w:val="1"/>
+      <w:numFmt w:val="decimal"/>
+      <w:lvlText w:val="%3."/>
+      <w:lvlJc w:val="left"/>
+      <w:pPr>
+        <w:tabs>
+          <w:tab w:val="num" w:pos="2160"/>
+        </w:tabs>
+        <w:ind w:left="2160" w:hanging="360"/>
+      </w:pPr>
+    </w:lvl>
+    <w:lvl w:ilvl="3" w:tentative="1">
+      <w:start w:val="1"/>
+      <w:numFmt w:val="decimal"/>
+      <w:lvlText w:val="%4."/>
+      <w:lvlJc w:val="left"/>
+      <w:pPr>
+        <w:tabs>
+          <w:tab w:val="num" w:pos="2880"/>
+        </w:tabs>
+        <w:ind w:left="2880" w:hanging="360"/>
+      </w:pPr>
+    </w:lvl>
+    <w:lvl w:ilvl="4" w:tentative="1">
+      <w:start w:val="1"/>
+      <w:numFmt w:val="decimal"/>
+      <w:lvlText w:val="%5."/>
+      <w:lvlJc w:val="left"/>
+      <w:pPr>
+        <w:tabs>
+          <w:tab w:val="num" w:pos="3600"/>
+        </w:tabs>
+        <w:ind w:left="3600" w:hanging="360"/>
+      </w:pPr>
+    </w:lvl>
+    <w:lvl w:ilvl="5" w:tentative="1">
+      <w:start w:val="1"/>
+      <w:numFmt w:val="decimal"/>
+      <w:lvlText w:val="%6."/>
+      <w:lvlJc w:val="left"/>
+      <w:pPr>
+        <w:tabs>
+          <w:tab w:val="num" w:pos="4320"/>
+        </w:tabs>
+        <w:ind w:left="4320" w:hanging="360"/>
+      </w:pPr>
+    </w:lvl>
+    <w:lvl w:ilvl="6" w:tentative="1">
+      <w:start w:val="1"/>
+      <w:numFmt w:val="decimal"/>
+      <w:lvlText w:val="%7."/>
+      <w:lvlJc w:val="left"/>
+      <w:pPr>
+        <w:tabs>
+          <w:tab w:val="num" w:pos="5040"/>
+        </w:tabs>
+        <w:ind w:left="5040" w:hanging="360"/>
+      </w:pPr>
+    </w:lvl>
+    <w:lvl w:ilvl="7" w:tentative="1">
+      <w:start w:val="1"/>
+      <w:numFmt w:val="decimal"/>
+      <w:lvlText w:val="%8."/>
+      <w:lvlJc w:val="left"/>
+      <w:pPr>
+        <w:tabs>
+          <w:tab w:val="num" w:pos="5760"/>
+        </w:tabs>
+        <w:ind w:left="5760" w:hanging="360"/>
+      </w:pPr>
+    </w:lvl>
+    <w:lvl w:ilvl="8" w:tentative="1">
+      <w:start w:val="1"/>
+      <w:numFmt w:val="decimal"/>
+      <w:lvlText w:val="%9."/>
+      <w:lvlJc w:val="left"/>
+      <w:pPr>
+        <w:tabs>
+          <w:tab w:val="num" w:pos="6480"/>
+        </w:tabs>
+        <w:ind w:left="6480" w:hanging="360"/>
+      </w:pPr>
+    </w:lvl>
+  </w:abstractNum>
+  <w:abstractNum w:abstractNumId="8" w15:restartNumberingAfterBreak="0">
+    <w:nsid w:val="71ED646C"/>
+    <w:multiLevelType w:val="multilevel"/>
+    <w:tmpl w:val="C1C2A330"/>
     <w:lvl w:ilvl="0">
       <w:start w:val="1"/>
       <w:numFmt w:val="bullet"/>
@@ -23807,123 +24023,10 @@
       </w:rPr>
     </w:lvl>
   </w:abstractNum>
-  <w:abstractNum w:abstractNumId="8" w15:restartNumberingAfterBreak="0">
-    <w:nsid w:val="70AA7FAF"/>
+  <w:abstractNum w:abstractNumId="9" w15:restartNumberingAfterBreak="0">
+    <w:nsid w:val="72560FDA"/>
     <w:multiLevelType w:val="multilevel"/>
-    <w:tmpl w:val="871A72EE"/>
-    <w:lvl w:ilvl="0">
-      <w:start w:val="1"/>
-      <w:numFmt w:val="decimal"/>
-      <w:lvlText w:val="%1."/>
-      <w:lvlJc w:val="left"/>
-      <w:pPr>
-        <w:tabs>
-          <w:tab w:val="num" w:pos="720"/>
-        </w:tabs>
-        <w:ind w:left="720" w:hanging="360"/>
-      </w:pPr>
-    </w:lvl>
-    <w:lvl w:ilvl="1" w:tentative="1">
-      <w:start w:val="1"/>
-      <w:numFmt w:val="decimal"/>
-      <w:lvlText w:val="%2."/>
-      <w:lvlJc w:val="left"/>
-      <w:pPr>
-        <w:tabs>
-          <w:tab w:val="num" w:pos="1440"/>
-        </w:tabs>
-        <w:ind w:left="1440" w:hanging="360"/>
-      </w:pPr>
-    </w:lvl>
-    <w:lvl w:ilvl="2" w:tentative="1">
-      <w:start w:val="1"/>
-      <w:numFmt w:val="decimal"/>
-      <w:lvlText w:val="%3."/>
-      <w:lvlJc w:val="left"/>
-      <w:pPr>
-        <w:tabs>
-          <w:tab w:val="num" w:pos="2160"/>
-        </w:tabs>
-        <w:ind w:left="2160" w:hanging="360"/>
-      </w:pPr>
-    </w:lvl>
-    <w:lvl w:ilvl="3" w:tentative="1">
-      <w:start w:val="1"/>
-      <w:numFmt w:val="decimal"/>
-      <w:lvlText w:val="%4."/>
-      <w:lvlJc w:val="left"/>
-      <w:pPr>
-        <w:tabs>
-          <w:tab w:val="num" w:pos="2880"/>
-        </w:tabs>
-        <w:ind w:left="2880" w:hanging="360"/>
-      </w:pPr>
-    </w:lvl>
-    <w:lvl w:ilvl="4" w:tentative="1">
-      <w:start w:val="1"/>
-      <w:numFmt w:val="decimal"/>
-      <w:lvlText w:val="%5."/>
-      <w:lvlJc w:val="left"/>
-      <w:pPr>
-        <w:tabs>
-          <w:tab w:val="num" w:pos="3600"/>
-        </w:tabs>
-        <w:ind w:left="3600" w:hanging="360"/>
-      </w:pPr>
-    </w:lvl>
-    <w:lvl w:ilvl="5" w:tentative="1">
-      <w:start w:val="1"/>
-      <w:numFmt w:val="decimal"/>
-      <w:lvlText w:val="%6."/>
-      <w:lvlJc w:val="left"/>
-      <w:pPr>
-        <w:tabs>
-          <w:tab w:val="num" w:pos="4320"/>
-        </w:tabs>
-        <w:ind w:left="4320" w:hanging="360"/>
-      </w:pPr>
-    </w:lvl>
-    <w:lvl w:ilvl="6" w:tentative="1">
-      <w:start w:val="1"/>
-      <w:numFmt w:val="decimal"/>
-      <w:lvlText w:val="%7."/>
-      <w:lvlJc w:val="left"/>
-      <w:pPr>
-        <w:tabs>
-          <w:tab w:val="num" w:pos="5040"/>
-        </w:tabs>
-        <w:ind w:left="5040" w:hanging="360"/>
-      </w:pPr>
-    </w:lvl>
-    <w:lvl w:ilvl="7" w:tentative="1">
-      <w:start w:val="1"/>
-      <w:numFmt w:val="decimal"/>
-      <w:lvlText w:val="%8."/>
-      <w:lvlJc w:val="left"/>
-      <w:pPr>
-        <w:tabs>
-          <w:tab w:val="num" w:pos="5760"/>
-        </w:tabs>
-        <w:ind w:left="5760" w:hanging="360"/>
-      </w:pPr>
-    </w:lvl>
-    <w:lvl w:ilvl="8" w:tentative="1">
-      <w:start w:val="1"/>
-      <w:numFmt w:val="decimal"/>
-      <w:lvlText w:val="%9."/>
-      <w:lvlJc w:val="left"/>
-      <w:pPr>
-        <w:tabs>
-          <w:tab w:val="num" w:pos="6480"/>
-        </w:tabs>
-        <w:ind w:left="6480" w:hanging="360"/>
-      </w:pPr>
-    </w:lvl>
-  </w:abstractNum>
-  <w:abstractNum w:abstractNumId="9" w15:restartNumberingAfterBreak="0">
-    <w:nsid w:val="739C792F"/>
-    <w:multiLevelType w:val="multilevel"/>
-    <w:tmpl w:val="87DEBB7A"/>
+    <w:tmpl w:val="BE8C7050"/>
     <w:lvl w:ilvl="0">
       <w:start w:val="1"/>
       <w:numFmt w:val="bullet"/>
@@ -24069,35 +24172,35 @@
       </w:rPr>
     </w:lvl>
   </w:abstractNum>
-  <w:num w:numId="1" w16cid:durableId="1637838624">
+  <w:num w:numId="1" w16cid:durableId="1101535328">
+    <w:abstractNumId w:val="3"/>
+  </w:num>
+  <w:num w:numId="2" w16cid:durableId="834879587">
     <w:abstractNumId w:val="5"/>
   </w:num>
-  <w:num w:numId="2" w16cid:durableId="1396508823">
-    <w:abstractNumId w:val="3"/>
+  <w:num w:numId="3" w16cid:durableId="1936788350">
+    <w:abstractNumId w:val="2"/>
   </w:num>
-  <w:num w:numId="3" w16cid:durableId="1678120112">
+  <w:num w:numId="4" w16cid:durableId="2017730422">
+    <w:abstractNumId w:val="0"/>
+  </w:num>
+  <w:num w:numId="5" w16cid:durableId="2136213845">
+    <w:abstractNumId w:val="6"/>
+  </w:num>
+  <w:num w:numId="6" w16cid:durableId="567811639">
     <w:abstractNumId w:val="9"/>
   </w:num>
-  <w:num w:numId="4" w16cid:durableId="84083089">
-    <w:abstractNumId w:val="0"/>
+  <w:num w:numId="7" w16cid:durableId="2125079033">
+    <w:abstractNumId w:val="1"/>
   </w:num>
-  <w:num w:numId="5" w16cid:durableId="1063985751">
-    <w:abstractNumId w:val="6"/>
+  <w:num w:numId="8" w16cid:durableId="569191835">
+    <w:abstractNumId w:val="7"/>
   </w:num>
-  <w:num w:numId="6" w16cid:durableId="778305600">
-    <w:abstractNumId w:val="2"/>
-  </w:num>
-  <w:num w:numId="7" w16cid:durableId="919868030">
+  <w:num w:numId="9" w16cid:durableId="169174514">
     <w:abstractNumId w:val="4"/>
   </w:num>
-  <w:num w:numId="8" w16cid:durableId="1413046571">
+  <w:num w:numId="10" w16cid:durableId="121193665">
     <w:abstractNumId w:val="8"/>
-  </w:num>
-  <w:num w:numId="9" w16cid:durableId="1675380529">
-    <w:abstractNumId w:val="1"/>
-  </w:num>
-  <w:num w:numId="10" w16cid:durableId="1341931686">
-    <w:abstractNumId w:val="7"/>
   </w:num>
 </w:numbering>
 </file>

</xml_diff>

<commit_message>
Website Admin app, step 3: Inquiries tab; fix lists auto-selecting on hidden tabs
- database/010_inquiries.sql: website Contact form messages (an email or
  a phone is required), status New / Contacted / Closed, internal notes.
- Inquiries tab: counts, status / search / date filters, newest first with
  New in bold, details, Copy Email, follow-up with a Yes/No list of
  changes, Excel export (ExcelExport linked from the office app);
  "Inquiries (N new)" tab title. Any Website Admin account; never deleted.
- Bug found while testing: a list loaded while its tab was hidden selected
  its first row when the tab was first shown, unlocking the form.
  RecordForm.NoAutoSelect fixes it on all 11 list pages (both apps).
18/18 Inquiries checks and 10/10 tab checks on the work PC database;
guides and testing log updated.

Co-Authored-By: Claude Opus 5.5 <noreply@anthropic.com>
</commit_message>
<xml_diff>
--- a/docs/Database Guide.docx
+++ b/docs/Database Guide.docx
@@ -40,7 +40,7 @@
       <w:pPr>
         <w:pStyle w:val="NormalWeb"/>
         <w:shd w:val="clear" w:color="auto" w:fill="EEF2F8"/>
-        <w:divId w:val="1343166945"/>
+        <w:divId w:val="64766106"/>
         <w:rPr>
           <w:rFonts w:ascii="Calibri" w:hAnsi="Calibri" w:cs="Calibri"/>
           <w:color w:val="404040"/>
@@ -71,7 +71,7 @@
           <w:sz w:val="22"/>
           <w:szCs w:val="22"/>
         </w:rPr>
-        <w:t xml:space="preserve">, PostgreSQL 18) as of scripts 001-009: </w:t>
+        <w:t xml:space="preserve">, PostgreSQL 18) as of scripts 001-010: </w:t>
       </w:r>
       <w:r>
         <w:rPr>
@@ -81,7 +81,7 @@
           <w:sz w:val="22"/>
           <w:szCs w:val="22"/>
         </w:rPr>
-        <w:t>30 tables</w:t>
+        <w:t>31 tables</w:t>
       </w:r>
       <w:r>
         <w:rPr>
@@ -5138,6 +5138,89 @@
           </w:p>
         </w:tc>
       </w:tr>
+      <w:tr>
+        <w:tc>
+          <w:tcPr>
+            <w:tcW w:w="0" w:type="auto"/>
+            <w:tcBorders>
+              <w:top w:val="single" w:sz="6" w:space="0" w:color="BFBFBF"/>
+              <w:left w:val="single" w:sz="6" w:space="0" w:color="BFBFBF"/>
+              <w:bottom w:val="single" w:sz="6" w:space="0" w:color="BFBFBF"/>
+              <w:right w:val="single" w:sz="6" w:space="0" w:color="BFBFBF"/>
+            </w:tcBorders>
+            <w:tcMar>
+              <w:top w:w="60" w:type="dxa"/>
+              <w:left w:w="120" w:type="dxa"/>
+              <w:bottom w:w="60" w:type="dxa"/>
+              <w:right w:w="120" w:type="dxa"/>
+            </w:tcMar>
+            <w:hideMark/>
+          </w:tcPr>
+          <w:p>
+            <w:pPr>
+              <w:spacing w:before="120" w:after="120"/>
+              <w:rPr>
+                <w:rFonts w:ascii="Calibri" w:eastAsia="Times New Roman" w:hAnsi="Calibri" w:cs="Calibri"/>
+                <w:color w:val="1A1A1A"/>
+                <w:sz w:val="22"/>
+                <w:szCs w:val="22"/>
+              </w:rPr>
+            </w:pPr>
+            <w:r>
+              <w:rPr>
+                <w:rStyle w:val="HTMLCode"/>
+                <w:color w:val="1A1A1A"/>
+              </w:rPr>
+              <w:t>010_inquiries.sql</w:t>
+            </w:r>
+          </w:p>
+        </w:tc>
+        <w:tc>
+          <w:tcPr>
+            <w:tcW w:w="0" w:type="auto"/>
+            <w:tcBorders>
+              <w:top w:val="single" w:sz="6" w:space="0" w:color="BFBFBF"/>
+              <w:left w:val="single" w:sz="6" w:space="0" w:color="BFBFBF"/>
+              <w:bottom w:val="single" w:sz="6" w:space="0" w:color="BFBFBF"/>
+              <w:right w:val="single" w:sz="6" w:space="0" w:color="BFBFBF"/>
+            </w:tcBorders>
+            <w:tcMar>
+              <w:top w:w="60" w:type="dxa"/>
+              <w:left w:w="120" w:type="dxa"/>
+              <w:bottom w:w="60" w:type="dxa"/>
+              <w:right w:w="120" w:type="dxa"/>
+            </w:tcMar>
+            <w:hideMark/>
+          </w:tcPr>
+          <w:p>
+            <w:pPr>
+              <w:spacing w:before="120" w:after="120"/>
+              <w:rPr>
+                <w:rFonts w:ascii="Calibri" w:eastAsia="Times New Roman" w:hAnsi="Calibri" w:cs="Calibri"/>
+                <w:color w:val="1A1A1A"/>
+                <w:sz w:val="22"/>
+                <w:szCs w:val="22"/>
+              </w:rPr>
+            </w:pPr>
+            <w:r>
+              <w:rPr>
+                <w:rStyle w:val="HTMLCode"/>
+                <w:color w:val="1A1A1A"/>
+              </w:rPr>
+              <w:t>inquiries</w:t>
+            </w:r>
+            <w:r>
+              <w:rPr>
+                <w:rFonts w:ascii="Calibri" w:eastAsia="Times New Roman" w:hAnsi="Calibri" w:cs="Calibri"/>
+                <w:color w:val="1A1A1A"/>
+                <w:sz w:val="22"/>
+                <w:szCs w:val="22"/>
+              </w:rPr>
+              <w:t xml:space="preserve"> (website Contact form messages)</w:t>
+            </w:r>
+          </w:p>
+        </w:tc>
+      </w:tr>
     </w:tbl>
     <w:p>
       <w:pPr>
@@ -5251,7 +5334,16 @@
           <w:sz w:val="22"/>
           <w:szCs w:val="22"/>
         </w:rPr>
-        <w:t xml:space="preserve"> the same database by running them. It's also a written record of every table and why it exists.</w:t>
+        <w:t xml:space="preserve"> the same database by running them. It'</w:t>
+      </w:r>
+      <w:r>
+        <w:rPr>
+          <w:rFonts w:ascii="Calibri" w:hAnsi="Calibri" w:cs="Calibri"/>
+          <w:color w:val="1A1A1A"/>
+          <w:sz w:val="22"/>
+          <w:szCs w:val="22"/>
+        </w:rPr>
+        <w:t>s also a written record of every table and why it exists.</w:t>
       </w:r>
     </w:p>
     <w:p>
@@ -5281,16 +5373,7 @@
           <w:sz w:val="22"/>
           <w:szCs w:val="22"/>
         </w:rPr>
-        <w:t xml:space="preserve"> </w:t>
-      </w:r>
-      <w:r>
-        <w:rPr>
-          <w:rFonts w:ascii="Calibri" w:hAnsi="Calibri" w:cs="Calibri"/>
-          <w:color w:val="1A1A1A"/>
-          <w:sz w:val="22"/>
-          <w:szCs w:val="22"/>
-        </w:rPr>
-        <w:t xml:space="preserve">a script that has run is </w:t>
+        <w:t xml:space="preserve"> a script that has run is </w:t>
       </w:r>
       <w:r>
         <w:rPr>
@@ -5442,28 +5525,28 @@
           <w:szCs w:val="19"/>
           <w:shd w:val="clear" w:color="auto" w:fill="F2F2F2"/>
         </w:rPr>
-        <w:t>|    -&gt; Services (the rules)    |  ----&gt;   |   30 tables      |</w:t>
-      </w:r>
-    </w:p>
-    <w:p>
-      <w:pPr>
-        <w:pStyle w:val="HTMLPreformatted"/>
+        <w:t xml:space="preserve">|    -&gt; Services (the rules)    |  ----&gt;   |   </w:t>
+      </w:r>
+      <w:r>
         <w:rPr>
           <w:color w:val="1A1A1A"/>
           <w:sz w:val="19"/>
           <w:szCs w:val="19"/>
           <w:shd w:val="clear" w:color="auto" w:fill="F2F2F2"/>
         </w:rPr>
-      </w:pPr>
-      <w:r>
+        <w:t>31 tables      |</w:t>
+      </w:r>
+    </w:p>
+    <w:p>
+      <w:pPr>
+        <w:pStyle w:val="HTMLPreformatted"/>
         <w:rPr>
           <w:color w:val="1A1A1A"/>
           <w:sz w:val="19"/>
           <w:szCs w:val="19"/>
           <w:shd w:val="clear" w:color="auto" w:fill="F2F2F2"/>
         </w:rPr>
-        <w:t xml:space="preserve">|      -&gt; Entity Framework Core | network  |              </w:t>
-      </w:r>
+      </w:pPr>
       <w:r>
         <w:rPr>
           <w:color w:val="1A1A1A"/>
@@ -5471,7 +5554,7 @@
           <w:szCs w:val="19"/>
           <w:shd w:val="clear" w:color="auto" w:fill="F2F2F2"/>
         </w:rPr>
-        <w:t xml:space="preserve">    |</w:t>
+        <w:t>|      -&gt; Entity Framework Core | network  |                  |</w:t>
       </w:r>
     </w:p>
     <w:p>
@@ -6155,16 +6238,7 @@
                 <w:sz w:val="22"/>
                 <w:szCs w:val="22"/>
               </w:rPr>
-              <w:t xml:space="preserve"> </w:t>
-            </w:r>
-            <w:r>
-              <w:rPr>
-                <w:rFonts w:ascii="Calibri" w:eastAsia="Times New Roman" w:hAnsi="Calibri" w:cs="Calibri"/>
-                <w:color w:val="1A1A1A"/>
-                <w:sz w:val="22"/>
-                <w:szCs w:val="22"/>
-              </w:rPr>
-              <w:t>of whoever approved or rejected it</w:t>
+              <w:t xml:space="preserve"> of whoever approved or rejected it</w:t>
             </w:r>
           </w:p>
         </w:tc>
@@ -6429,7 +6503,7 @@
           <w:sz w:val="22"/>
           <w:szCs w:val="22"/>
         </w:rPr>
-        <w:t>30 tables in 8 groups:</w:t>
+        <w:t>31 tables in 8 groups:</w:t>
       </w:r>
     </w:p>
     <w:tbl>
@@ -7180,7 +7254,16 @@
                 <w:sz w:val="22"/>
                 <w:szCs w:val="22"/>
               </w:rPr>
-              <w:t xml:space="preserve">, </w:t>
+              <w:t>,</w:t>
+            </w:r>
+            <w:r>
+              <w:rPr>
+                <w:rFonts w:ascii="Calibri" w:eastAsia="Times New Roman" w:hAnsi="Calibri" w:cs="Calibri"/>
+                <w:color w:val="1A1A1A"/>
+                <w:sz w:val="22"/>
+                <w:szCs w:val="22"/>
+              </w:rPr>
+              <w:t xml:space="preserve"> </w:t>
             </w:r>
             <w:r>
               <w:rPr>
@@ -7404,6 +7487,22 @@
                 <w:color w:val="1A1A1A"/>
               </w:rPr>
               <w:t>website_login_logs</w:t>
+            </w:r>
+            <w:r>
+              <w:rPr>
+                <w:rFonts w:ascii="Calibri" w:eastAsia="Times New Roman" w:hAnsi="Calibri" w:cs="Calibri"/>
+                <w:color w:val="1A1A1A"/>
+                <w:sz w:val="22"/>
+                <w:szCs w:val="22"/>
+              </w:rPr>
+              <w:t xml:space="preserve">, </w:t>
+            </w:r>
+            <w:r>
+              <w:rPr>
+                <w:rStyle w:val="HTMLCode"/>
+                <w:color w:val="1A1A1A"/>
+              </w:rPr>
+              <w:t>inquiries</w:t>
             </w:r>
           </w:p>
         </w:tc>
@@ -7648,26 +7747,35 @@
           <w:szCs w:val="19"/>
           <w:shd w:val="clear" w:color="auto" w:fill="F2F2F2"/>
         </w:rPr>
-        <w:t xml:space="preserve">   employees &lt;---- users          (a login belongs to an employee)</w:t>
-      </w:r>
-    </w:p>
-    <w:p>
-      <w:pPr>
-        <w:pStyle w:val="HTMLPreformatted"/>
+        <w:t xml:space="preserve">   employees &lt;---- users          </w:t>
+      </w:r>
+      <w:r>
         <w:rPr>
           <w:color w:val="1A1A1A"/>
           <w:sz w:val="19"/>
           <w:szCs w:val="19"/>
           <w:shd w:val="clear" w:color="auto" w:fill="F2F2F2"/>
         </w:rPr>
-      </w:pPr>
-      <w:r>
+        <w:t>(a login belongs to an employee)</w:t>
+      </w:r>
+    </w:p>
+    <w:p>
+      <w:pPr>
+        <w:pStyle w:val="HTMLPreformatted"/>
         <w:rPr>
           <w:color w:val="1A1A1A"/>
           <w:sz w:val="19"/>
           <w:szCs w:val="19"/>
           <w:shd w:val="clear" w:color="auto" w:fill="F2F2F2"/>
         </w:rPr>
+      </w:pPr>
+      <w:r>
+        <w:rPr>
+          <w:color w:val="1A1A1A"/>
+          <w:sz w:val="19"/>
+          <w:szCs w:val="19"/>
+          <w:shd w:val="clear" w:color="auto" w:fill="F2F2F2"/>
+        </w:rPr>
         <w:t xml:space="preserve">   employees &lt;---- employee_rates (rate history)</w:t>
       </w:r>
     </w:p>
@@ -7740,13 +7848,7 @@
         <w:rPr>
           <w:rFonts w:ascii="Calibri" w:eastAsia="Times New Roman" w:hAnsi="Calibri" w:cs="Calibri"/>
         </w:rPr>
-        <w:t xml:space="preserve">5. Login </w:t>
-      </w:r>
-      <w:r>
-        <w:rPr>
-          <w:rFonts w:ascii="Calibri" w:eastAsia="Times New Roman" w:hAnsi="Calibri" w:cs="Calibri"/>
-        </w:rPr>
-        <w:t>&amp; security tables</w:t>
+        <w:t>5. Login &amp; security tables</w:t>
       </w:r>
     </w:p>
     <w:p>
@@ -8208,7 +8310,16 @@
                 <w:sz w:val="22"/>
                 <w:szCs w:val="22"/>
               </w:rPr>
-              <w:t xml:space="preserve"> with bcrypt. The real password is never stored, so nobody can read it, not even an Admin.</w:t>
+              <w:t xml:space="preserve"> </w:t>
+            </w:r>
+            <w:r>
+              <w:rPr>
+                <w:rFonts w:ascii="Calibri" w:eastAsia="Times New Roman" w:hAnsi="Calibri" w:cs="Calibri"/>
+                <w:color w:val="1A1A1A"/>
+                <w:sz w:val="22"/>
+                <w:szCs w:val="22"/>
+              </w:rPr>
+              <w:t>with bcrypt. The real password is never stored, so nobody can read it, not even an Admin.</w:t>
             </w:r>
           </w:p>
         </w:tc>
@@ -8436,16 +8547,7 @@
                 <w:sz w:val="22"/>
                 <w:szCs w:val="22"/>
               </w:rPr>
-              <w:t xml:space="preserve">HR &amp; </w:t>
-            </w:r>
-            <w:r>
-              <w:rPr>
-                <w:rFonts w:ascii="Calibri" w:eastAsia="Times New Roman" w:hAnsi="Calibri" w:cs="Calibri"/>
-                <w:color w:val="1A1A1A"/>
-                <w:sz w:val="22"/>
-                <w:szCs w:val="22"/>
-              </w:rPr>
-              <w:t>Payroll / Inventory / Subcontractors / Receipts; empty for Admins (check rule)</w:t>
+              <w:t>HR &amp; Payroll / Inventory / Subcontractors / Receipts; empty for Admins (check rule)</w:t>
             </w:r>
           </w:p>
         </w:tc>
@@ -8798,16 +8900,7 @@
           <w:sz w:val="22"/>
           <w:szCs w:val="22"/>
         </w:rPr>
-        <w:t xml:space="preserve"> when you sign in, the app scrambles what you typed the same way and compares the two scrambled r</w:t>
-      </w:r>
-      <w:r>
-        <w:rPr>
-          <w:rFonts w:ascii="Calibri" w:hAnsi="Calibri" w:cs="Calibri"/>
-          <w:color w:val="1A1A1A"/>
-          <w:sz w:val="22"/>
-          <w:szCs w:val="22"/>
-        </w:rPr>
-        <w:t>esults. If they match, the password is right. The scrambling can't be reversed.</w:t>
+        <w:t xml:space="preserve"> when you sign in, the app scrambles what you typed the same way and compares the two scrambled results. If they match, the password is right. The scrambling can't be reversed.</w:t>
       </w:r>
     </w:p>
     <w:p>
@@ -9196,7 +9289,7 @@
         <w:rPr>
           <w:rFonts w:ascii="Calibri" w:eastAsia="Times New Roman" w:hAnsi="Calibri" w:cs="Calibri"/>
         </w:rPr>
-        <w:t>password_requests</w:t>
+        <w:t>inquiries: website Contact form messages</w:t>
       </w:r>
     </w:p>
     <w:p>
@@ -9211,6 +9304,242 @@
       </w:pPr>
       <w:r>
         <w:rPr>
+          <w:rStyle w:val="HTMLCode"/>
+          <w:color w:val="1A1A1A"/>
+        </w:rPr>
+        <w:t>inquiry_id</w:t>
+      </w:r>
+      <w:r>
+        <w:rPr>
+          <w:rFonts w:ascii="Calibri" w:hAnsi="Calibri" w:cs="Calibri"/>
+          <w:color w:val="1A1A1A"/>
+          <w:sz w:val="22"/>
+          <w:szCs w:val="22"/>
+        </w:rPr>
+        <w:t xml:space="preserve">, </w:t>
+      </w:r>
+      <w:r>
+        <w:rPr>
+          <w:rStyle w:val="HTMLCode"/>
+          <w:color w:val="1A1A1A"/>
+        </w:rPr>
+        <w:t>received_at</w:t>
+      </w:r>
+      <w:r>
+        <w:rPr>
+          <w:rFonts w:ascii="Calibri" w:hAnsi="Calibri" w:cs="Calibri"/>
+          <w:color w:val="1A1A1A"/>
+          <w:sz w:val="22"/>
+          <w:szCs w:val="22"/>
+        </w:rPr>
+        <w:t xml:space="preserve">, </w:t>
+      </w:r>
+      <w:r>
+        <w:rPr>
+          <w:rStyle w:val="HTMLCode"/>
+          <w:color w:val="1A1A1A"/>
+        </w:rPr>
+        <w:t>full_name</w:t>
+      </w:r>
+      <w:r>
+        <w:rPr>
+          <w:rFonts w:ascii="Calibri" w:hAnsi="Calibri" w:cs="Calibri"/>
+          <w:color w:val="1A1A1A"/>
+          <w:sz w:val="22"/>
+          <w:szCs w:val="22"/>
+        </w:rPr>
+        <w:t xml:space="preserve">, </w:t>
+      </w:r>
+      <w:r>
+        <w:rPr>
+          <w:rStyle w:val="HTMLCode"/>
+          <w:color w:val="1A1A1A"/>
+        </w:rPr>
+        <w:t>email</w:t>
+      </w:r>
+      <w:r>
+        <w:rPr>
+          <w:rFonts w:ascii="Calibri" w:hAnsi="Calibri" w:cs="Calibri"/>
+          <w:color w:val="1A1A1A"/>
+          <w:sz w:val="22"/>
+          <w:szCs w:val="22"/>
+        </w:rPr>
+        <w:t xml:space="preserve">, </w:t>
+      </w:r>
+      <w:r>
+        <w:rPr>
+          <w:rStyle w:val="HTMLCode"/>
+          <w:color w:val="1A1A1A"/>
+        </w:rPr>
+        <w:t>phone</w:t>
+      </w:r>
+      <w:r>
+        <w:rPr>
+          <w:rFonts w:ascii="Calibri" w:hAnsi="Calibri" w:cs="Calibri"/>
+          <w:color w:val="1A1A1A"/>
+          <w:sz w:val="22"/>
+          <w:szCs w:val="22"/>
+        </w:rPr>
+        <w:t xml:space="preserve">, </w:t>
+      </w:r>
+      <w:r>
+        <w:rPr>
+          <w:rStyle w:val="HTMLCode"/>
+          <w:color w:val="1A1A1A"/>
+        </w:rPr>
+        <w:t>project_location</w:t>
+      </w:r>
+      <w:r>
+        <w:rPr>
+          <w:rFonts w:ascii="Calibri" w:hAnsi="Calibri" w:cs="Calibri"/>
+          <w:color w:val="1A1A1A"/>
+          <w:sz w:val="22"/>
+          <w:szCs w:val="22"/>
+        </w:rPr>
+        <w:t xml:space="preserve">, </w:t>
+      </w:r>
+      <w:r>
+        <w:rPr>
+          <w:rStyle w:val="HTMLCode"/>
+          <w:color w:val="1A1A1A"/>
+        </w:rPr>
+        <w:t>service_required</w:t>
+      </w:r>
+      <w:r>
+        <w:rPr>
+          <w:rFonts w:ascii="Calibri" w:hAnsi="Calibri" w:cs="Calibri"/>
+          <w:color w:val="1A1A1A"/>
+          <w:sz w:val="22"/>
+          <w:szCs w:val="22"/>
+        </w:rPr>
+        <w:t xml:space="preserve"> (optional), </w:t>
+      </w:r>
+      <w:r>
+        <w:rPr>
+          <w:rStyle w:val="HTMLCode"/>
+          <w:color w:val="1A1A1A"/>
+        </w:rPr>
+        <w:t>message</w:t>
+      </w:r>
+      <w:r>
+        <w:rPr>
+          <w:rFonts w:ascii="Calibri" w:hAnsi="Calibri" w:cs="Calibri"/>
+          <w:color w:val="1A1A1A"/>
+          <w:sz w:val="22"/>
+          <w:szCs w:val="22"/>
+        </w:rPr>
+        <w:t xml:space="preserve">, </w:t>
+      </w:r>
+      <w:r>
+        <w:rPr>
+          <w:rStyle w:val="HTMLCode"/>
+          <w:color w:val="1A1A1A"/>
+        </w:rPr>
+        <w:t>status</w:t>
+      </w:r>
+      <w:r>
+        <w:rPr>
+          <w:rFonts w:ascii="Calibri" w:hAnsi="Calibri" w:cs="Calibri"/>
+          <w:color w:val="1A1A1A"/>
+          <w:sz w:val="22"/>
+          <w:szCs w:val="22"/>
+        </w:rPr>
+        <w:t xml:space="preserve"> (New / Contacted / Closed), </w:t>
+      </w:r>
+      <w:r>
+        <w:rPr>
+          <w:rStyle w:val="HTMLCode"/>
+          <w:color w:val="1A1A1A"/>
+        </w:rPr>
+        <w:t>notes</w:t>
+      </w:r>
+      <w:r>
+        <w:rPr>
+          <w:rFonts w:ascii="Calibri" w:hAnsi="Calibri" w:cs="Calibri"/>
+          <w:color w:val="1A1A1A"/>
+          <w:sz w:val="22"/>
+          <w:szCs w:val="22"/>
+        </w:rPr>
+        <w:t xml:space="preserve"> (internal), </w:t>
+      </w:r>
+      <w:r>
+        <w:rPr>
+          <w:rStyle w:val="HTMLCode"/>
+          <w:color w:val="1A1A1A"/>
+        </w:rPr>
+        <w:t>updated_by</w:t>
+      </w:r>
+      <w:r>
+        <w:rPr>
+          <w:rFonts w:ascii="Calibri" w:hAnsi="Calibri" w:cs="Calibri"/>
+          <w:color w:val="1A1A1A"/>
+          <w:sz w:val="22"/>
+          <w:szCs w:val="22"/>
+        </w:rPr>
+        <w:t xml:space="preserve"> (a Website Admin account), </w:t>
+      </w:r>
+      <w:r>
+        <w:rPr>
+          <w:rStyle w:val="HTMLCode"/>
+          <w:color w:val="1A1A1A"/>
+        </w:rPr>
+        <w:t>updated_at</w:t>
+      </w:r>
+      <w:r>
+        <w:rPr>
+          <w:rFonts w:ascii="Calibri" w:hAnsi="Calibri" w:cs="Calibri"/>
+          <w:color w:val="1A1A1A"/>
+          <w:sz w:val="22"/>
+          <w:szCs w:val="22"/>
+        </w:rPr>
+        <w:t xml:space="preserve">. Check rule: an email </w:t>
+      </w:r>
+      <w:r>
+        <w:rPr>
+          <w:rStyle w:val="Strong"/>
+          <w:rFonts w:ascii="Calibri" w:hAnsi="Calibri" w:cs="Calibri"/>
+          <w:color w:val="1A1A1A"/>
+          <w:sz w:val="22"/>
+          <w:szCs w:val="22"/>
+        </w:rPr>
+        <w:t>or</w:t>
+      </w:r>
+      <w:r>
+        <w:rPr>
+          <w:rFonts w:ascii="Calibri" w:hAnsi="Calibri" w:cs="Calibri"/>
+          <w:color w:val="1A1A1A"/>
+          <w:sz w:val="22"/>
+          <w:szCs w:val="22"/>
+        </w:rPr>
+        <w:t xml:space="preserve"> a phone number must be given. Rows are never deleted.</w:t>
+      </w:r>
+    </w:p>
+    <w:p>
+      <w:pPr>
+        <w:pStyle w:val="Heading2"/>
+        <w:rPr>
+          <w:rFonts w:ascii="Calibri" w:eastAsia="Times New Roman" w:hAnsi="Calibri" w:cs="Calibri"/>
+        </w:rPr>
+      </w:pPr>
+      <w:r>
+        <w:rPr>
+          <w:rFonts w:ascii="Calibri" w:eastAsia="Times New Roman" w:hAnsi="Calibri" w:cs="Calibri"/>
+        </w:rPr>
+        <w:t>password_requests</w:t>
+      </w:r>
+    </w:p>
+    <w:p>
+      <w:pPr>
+        <w:pStyle w:val="NormalWeb"/>
+        <w:rPr>
+          <w:rFonts w:ascii="Calibri" w:hAnsi="Calibri" w:cs="Calibri"/>
+          <w:color w:val="1A1A1A"/>
+          <w:sz w:val="22"/>
+          <w:szCs w:val="22"/>
+        </w:rPr>
+      </w:pPr>
+      <w:r>
+        <w:rPr>
           <w:rFonts w:ascii="Calibri" w:hAnsi="Calibri" w:cs="Calibri"/>
           <w:color w:val="1A1A1A"/>
           <w:sz w:val="22"/>
@@ -9264,7 +9593,16 @@
           <w:sz w:val="22"/>
           <w:szCs w:val="22"/>
         </w:rPr>
-        <w:t xml:space="preserve"> (Waiting / Done / Dismissed), </w:t>
+        <w:t xml:space="preserve"> </w:t>
+      </w:r>
+      <w:r>
+        <w:rPr>
+          <w:rFonts w:ascii="Calibri" w:hAnsi="Calibri" w:cs="Calibri"/>
+          <w:color w:val="1A1A1A"/>
+          <w:sz w:val="22"/>
+          <w:szCs w:val="22"/>
+        </w:rPr>
+        <w:t xml:space="preserve">(Waiting / Done / Dismissed), </w:t>
       </w:r>
       <w:r>
         <w:rPr>
@@ -10107,7 +10445,25 @@
           <w:sz w:val="22"/>
           <w:szCs w:val="22"/>
         </w:rPr>
-        <w:t xml:space="preserve"> → employees, </w:t>
+        <w:t xml:space="preserve"> </w:t>
+      </w:r>
+      <w:r>
+        <w:rPr>
+          <w:rFonts w:ascii="Calibri" w:hAnsi="Calibri" w:cs="Calibri"/>
+          <w:color w:val="1A1A1A"/>
+          <w:sz w:val="22"/>
+          <w:szCs w:val="22"/>
+        </w:rPr>
+        <w:t>→ employees,</w:t>
+      </w:r>
+      <w:r>
+        <w:rPr>
+          <w:rFonts w:ascii="Calibri" w:hAnsi="Calibri" w:cs="Calibri"/>
+          <w:color w:val="1A1A1A"/>
+          <w:sz w:val="22"/>
+          <w:szCs w:val="22"/>
+        </w:rPr>
+        <w:t xml:space="preserve"> </w:t>
       </w:r>
       <w:r>
         <w:rPr>
@@ -19186,7 +19542,43 @@
           <w:sz w:val="22"/>
           <w:szCs w:val="22"/>
         </w:rPr>
-        <w:t xml:space="preserve"> → "material usage entry" → </w:t>
+        <w:t xml:space="preserve"> </w:t>
+      </w:r>
+      <w:r>
+        <w:rPr>
+          <w:rFonts w:ascii="Calibri" w:eastAsia="Times New Roman" w:hAnsi="Calibri" w:cs="Calibri"/>
+          <w:color w:val="1A1A1A"/>
+          <w:sz w:val="22"/>
+          <w:szCs w:val="22"/>
+        </w:rPr>
+        <w:t>→</w:t>
+      </w:r>
+      <w:r>
+        <w:rPr>
+          <w:rFonts w:ascii="Calibri" w:eastAsia="Times New Roman" w:hAnsi="Calibri" w:cs="Calibri"/>
+          <w:color w:val="1A1A1A"/>
+          <w:sz w:val="22"/>
+          <w:szCs w:val="22"/>
+        </w:rPr>
+        <w:t xml:space="preserve"> "material usage entry" </w:t>
+      </w:r>
+      <w:r>
+        <w:rPr>
+          <w:rFonts w:ascii="Calibri" w:eastAsia="Times New Roman" w:hAnsi="Calibri" w:cs="Calibri"/>
+          <w:color w:val="1A1A1A"/>
+          <w:sz w:val="22"/>
+          <w:szCs w:val="22"/>
+        </w:rPr>
+        <w:t>→</w:t>
+      </w:r>
+      <w:r>
+        <w:rPr>
+          <w:rFonts w:ascii="Calibri" w:eastAsia="Times New Roman" w:hAnsi="Calibri" w:cs="Calibri"/>
+          <w:color w:val="1A1A1A"/>
+          <w:sz w:val="22"/>
+          <w:szCs w:val="22"/>
+        </w:rPr>
+        <w:t xml:space="preserve"> </w:t>
       </w:r>
       <w:r>
         <w:rPr>
@@ -19205,7 +19597,25 @@
           <w:sz w:val="22"/>
           <w:szCs w:val="22"/>
         </w:rPr>
-        <w:t xml:space="preserve"> → saved in </w:t>
+        <w:t xml:space="preserve"> </w:t>
+      </w:r>
+      <w:r>
+        <w:rPr>
+          <w:rFonts w:ascii="Calibri" w:eastAsia="Times New Roman" w:hAnsi="Calibri" w:cs="Calibri"/>
+          <w:color w:val="1A1A1A"/>
+          <w:sz w:val="22"/>
+          <w:szCs w:val="22"/>
+        </w:rPr>
+        <w:t>→ saved in</w:t>
+      </w:r>
+      <w:r>
+        <w:rPr>
+          <w:rFonts w:ascii="Calibri" w:eastAsia="Times New Roman" w:hAnsi="Calibri" w:cs="Calibri"/>
+          <w:color w:val="1A1A1A"/>
+          <w:sz w:val="22"/>
+          <w:szCs w:val="22"/>
+        </w:rPr>
+        <w:t xml:space="preserve"> </w:t>
       </w:r>
       <w:r>
         <w:rPr>
@@ -19274,7 +19684,25 @@
           <w:sz w:val="22"/>
           <w:szCs w:val="22"/>
         </w:rPr>
-        <w:t xml:space="preserve"> approves → </w:t>
+        <w:t xml:space="preserve"> </w:t>
+      </w:r>
+      <w:r>
+        <w:rPr>
+          <w:rFonts w:ascii="Calibri" w:eastAsia="Times New Roman" w:hAnsi="Calibri" w:cs="Calibri"/>
+          <w:color w:val="1A1A1A"/>
+          <w:sz w:val="22"/>
+          <w:szCs w:val="22"/>
+        </w:rPr>
+        <w:t>approves →</w:t>
+      </w:r>
+      <w:r>
+        <w:rPr>
+          <w:rFonts w:ascii="Calibri" w:eastAsia="Times New Roman" w:hAnsi="Calibri" w:cs="Calibri"/>
+          <w:color w:val="1A1A1A"/>
+          <w:sz w:val="22"/>
+          <w:szCs w:val="22"/>
+        </w:rPr>
+        <w:t xml:space="preserve"> </w:t>
       </w:r>
       <w:r>
         <w:rPr>
@@ -19378,7 +19806,25 @@
           <w:sz w:val="22"/>
           <w:szCs w:val="22"/>
         </w:rPr>
-        <w:t xml:space="preserve"> → the project's expenses now include that cost.</w:t>
+        <w:t xml:space="preserve"> </w:t>
+      </w:r>
+      <w:r>
+        <w:rPr>
+          <w:rFonts w:ascii="Calibri" w:eastAsia="Times New Roman" w:hAnsi="Calibri" w:cs="Calibri"/>
+          <w:color w:val="1A1A1A"/>
+          <w:sz w:val="22"/>
+          <w:szCs w:val="22"/>
+        </w:rPr>
+        <w:t>→ the project</w:t>
+      </w:r>
+      <w:r>
+        <w:rPr>
+          <w:rFonts w:ascii="Calibri" w:eastAsia="Times New Roman" w:hAnsi="Calibri" w:cs="Calibri"/>
+          <w:color w:val="1A1A1A"/>
+          <w:sz w:val="22"/>
+          <w:szCs w:val="22"/>
+        </w:rPr>
+        <w:t>'s expenses now include that cost.</w:t>
       </w:r>
     </w:p>
     <w:p>
@@ -19547,7 +19993,8 @@
       <w:pPr>
         <w:pStyle w:val="NormalWeb"/>
         <w:shd w:val="clear" w:color="auto" w:fill="EEF2F8"/>
-        <w:divId w:val="1163157627"/>
+        <w:ind w:right="720"/>
+        <w:divId w:val="1437868767"/>
         <w:rPr>
           <w:rFonts w:ascii="Calibri" w:hAnsi="Calibri" w:cs="Calibri"/>
           <w:color w:val="404040"/>
@@ -22755,9 +23202,9 @@
 <file path=word/numbering.xml><?xml version="1.0" encoding="utf-8"?>
 <w:numbering xmlns:wpc="http://schemas.microsoft.com/office/word/2010/wordprocessingCanvas" xmlns:cx="http://schemas.microsoft.com/office/drawing/2014/chartex" xmlns:cx1="http://schemas.microsoft.com/office/drawing/2015/9/8/chartex" xmlns:cx2="http://schemas.microsoft.com/office/drawing/2015/10/21/chartex" xmlns:cx3="http://schemas.microsoft.com/office/drawing/2016/5/9/chartex" xmlns:cx4="http://schemas.microsoft.com/office/drawing/2016/5/10/chartex" xmlns:cx5="http://schemas.microsoft.com/office/drawing/2016/5/11/chartex" xmlns:cx6="http://schemas.microsoft.com/office/drawing/2016/5/12/chartex" xmlns:cx7="http://schemas.microsoft.com/office/drawing/2016/5/13/chartex" xmlns:cx8="http://schemas.microsoft.com/office/drawing/2016/5/14/chartex" xmlns:mc="http://schemas.openxmlformats.org/markup-compatibility/2006" xmlns:aink="http://schemas.microsoft.com/office/drawing/2016/ink" xmlns:am3d="http://schemas.microsoft.com/office/drawing/2017/model3d" xmlns:o="urn:schemas-microsoft-com:office:office" xmlns:oel="http://schemas.microsoft.com/office/2019/extlst" xmlns:r="http://schemas.openxmlformats.org/officeDocument/2006/relationships" xmlns:m="http://schemas.openxmlformats.org/officeDocument/2006/math" xmlns:v="urn:schemas-microsoft-com:vml" xmlns:wp14="http://schemas.microsoft.com/office/word/2010/wordprocessingDrawing" xmlns:wp="http://schemas.openxmlformats.org/drawingml/2006/wordprocessingDrawing" xmlns:w10="urn:schemas-microsoft-com:office:word" xmlns:w="http://schemas.openxmlformats.org/wordprocessingml/2006/main" xmlns:w14="http://schemas.microsoft.com/office/word/2010/wordml" xmlns:w15="http://schemas.microsoft.com/office/word/2012/wordml" xmlns:w16cex="http://schemas.microsoft.com/office/word/2018/wordml/cex" xmlns:w16cid="http://schemas.microsoft.com/office/word/2016/wordml/cid" xmlns:w16="http://schemas.microsoft.com/office/word/2018/wordml" xmlns:w16du="http://schemas.microsoft.com/office/word/2023/wordml/word16du" xmlns:w16sdtdh="http://schemas.microsoft.com/office/word/2020/wordml/sdtdatahash" xmlns:w16sdtfl="http://schemas.microsoft.com/office/word/2024/wordml/sdtformatlock" xmlns:w16se="http://schemas.microsoft.com/office/word/2015/wordml/symex" xmlns:wpg="http://schemas.microsoft.com/office/word/2010/wordprocessingGroup" xmlns:wpi="http://schemas.microsoft.com/office/word/2010/wordprocessingInk" xmlns:wne="http://schemas.microsoft.com/office/word/2006/wordml" xmlns:wps="http://schemas.microsoft.com/office/word/2010/wordprocessingShape" mc:Ignorable="w14 w15 w16se w16cid w16 w16cex w16sdtdh w16sdtfl w16du wp14">
   <w:abstractNum w:abstractNumId="0" w15:restartNumberingAfterBreak="0">
-    <w:nsid w:val="01A12286"/>
+    <w:nsid w:val="07FB53B3"/>
     <w:multiLevelType w:val="multilevel"/>
-    <w:tmpl w:val="3C60A238"/>
+    <w:tmpl w:val="A0BA78D0"/>
     <w:lvl w:ilvl="0">
       <w:start w:val="1"/>
       <w:numFmt w:val="bullet"/>
@@ -22904,9 +23351,9 @@
     </w:lvl>
   </w:abstractNum>
   <w:abstractNum w:abstractNumId="1" w15:restartNumberingAfterBreak="0">
-    <w:nsid w:val="27756E35"/>
+    <w:nsid w:val="1AE86514"/>
     <w:multiLevelType w:val="multilevel"/>
-    <w:tmpl w:val="4C04B986"/>
+    <w:tmpl w:val="DBD03F50"/>
     <w:lvl w:ilvl="0">
       <w:start w:val="1"/>
       <w:numFmt w:val="bullet"/>
@@ -23053,9 +23500,9 @@
     </w:lvl>
   </w:abstractNum>
   <w:abstractNum w:abstractNumId="2" w15:restartNumberingAfterBreak="0">
-    <w:nsid w:val="41B917B2"/>
+    <w:nsid w:val="22C773F7"/>
     <w:multiLevelType w:val="multilevel"/>
-    <w:tmpl w:val="86DE734E"/>
+    <w:tmpl w:val="49165CFC"/>
     <w:lvl w:ilvl="0">
       <w:start w:val="1"/>
       <w:numFmt w:val="bullet"/>
@@ -23202,9 +23649,122 @@
     </w:lvl>
   </w:abstractNum>
   <w:abstractNum w:abstractNumId="3" w15:restartNumberingAfterBreak="0">
-    <w:nsid w:val="51B95E59"/>
+    <w:nsid w:val="4F0E7FAA"/>
     <w:multiLevelType w:val="multilevel"/>
-    <w:tmpl w:val="464E8F8C"/>
+    <w:tmpl w:val="DFF09E7C"/>
+    <w:lvl w:ilvl="0">
+      <w:start w:val="1"/>
+      <w:numFmt w:val="decimal"/>
+      <w:lvlText w:val="%1."/>
+      <w:lvlJc w:val="left"/>
+      <w:pPr>
+        <w:tabs>
+          <w:tab w:val="num" w:pos="720"/>
+        </w:tabs>
+        <w:ind w:left="720" w:hanging="360"/>
+      </w:pPr>
+    </w:lvl>
+    <w:lvl w:ilvl="1" w:tentative="1">
+      <w:start w:val="1"/>
+      <w:numFmt w:val="decimal"/>
+      <w:lvlText w:val="%2."/>
+      <w:lvlJc w:val="left"/>
+      <w:pPr>
+        <w:tabs>
+          <w:tab w:val="num" w:pos="1440"/>
+        </w:tabs>
+        <w:ind w:left="1440" w:hanging="360"/>
+      </w:pPr>
+    </w:lvl>
+    <w:lvl w:ilvl="2" w:tentative="1">
+      <w:start w:val="1"/>
+      <w:numFmt w:val="decimal"/>
+      <w:lvlText w:val="%3."/>
+      <w:lvlJc w:val="left"/>
+      <w:pPr>
+        <w:tabs>
+          <w:tab w:val="num" w:pos="2160"/>
+        </w:tabs>
+        <w:ind w:left="2160" w:hanging="360"/>
+      </w:pPr>
+    </w:lvl>
+    <w:lvl w:ilvl="3" w:tentative="1">
+      <w:start w:val="1"/>
+      <w:numFmt w:val="decimal"/>
+      <w:lvlText w:val="%4."/>
+      <w:lvlJc w:val="left"/>
+      <w:pPr>
+        <w:tabs>
+          <w:tab w:val="num" w:pos="2880"/>
+        </w:tabs>
+        <w:ind w:left="2880" w:hanging="360"/>
+      </w:pPr>
+    </w:lvl>
+    <w:lvl w:ilvl="4" w:tentative="1">
+      <w:start w:val="1"/>
+      <w:numFmt w:val="decimal"/>
+      <w:lvlText w:val="%5."/>
+      <w:lvlJc w:val="left"/>
+      <w:pPr>
+        <w:tabs>
+          <w:tab w:val="num" w:pos="3600"/>
+        </w:tabs>
+        <w:ind w:left="3600" w:hanging="360"/>
+      </w:pPr>
+    </w:lvl>
+    <w:lvl w:ilvl="5" w:tentative="1">
+      <w:start w:val="1"/>
+      <w:numFmt w:val="decimal"/>
+      <w:lvlText w:val="%6."/>
+      <w:lvlJc w:val="left"/>
+      <w:pPr>
+        <w:tabs>
+          <w:tab w:val="num" w:pos="4320"/>
+        </w:tabs>
+        <w:ind w:left="4320" w:hanging="360"/>
+      </w:pPr>
+    </w:lvl>
+    <w:lvl w:ilvl="6" w:tentative="1">
+      <w:start w:val="1"/>
+      <w:numFmt w:val="decimal"/>
+      <w:lvlText w:val="%7."/>
+      <w:lvlJc w:val="left"/>
+      <w:pPr>
+        <w:tabs>
+          <w:tab w:val="num" w:pos="5040"/>
+        </w:tabs>
+        <w:ind w:left="5040" w:hanging="360"/>
+      </w:pPr>
+    </w:lvl>
+    <w:lvl w:ilvl="7" w:tentative="1">
+      <w:start w:val="1"/>
+      <w:numFmt w:val="decimal"/>
+      <w:lvlText w:val="%8."/>
+      <w:lvlJc w:val="left"/>
+      <w:pPr>
+        <w:tabs>
+          <w:tab w:val="num" w:pos="5760"/>
+        </w:tabs>
+        <w:ind w:left="5760" w:hanging="360"/>
+      </w:pPr>
+    </w:lvl>
+    <w:lvl w:ilvl="8" w:tentative="1">
+      <w:start w:val="1"/>
+      <w:numFmt w:val="decimal"/>
+      <w:lvlText w:val="%9."/>
+      <w:lvlJc w:val="left"/>
+      <w:pPr>
+        <w:tabs>
+          <w:tab w:val="num" w:pos="6480"/>
+        </w:tabs>
+        <w:ind w:left="6480" w:hanging="360"/>
+      </w:pPr>
+    </w:lvl>
+  </w:abstractNum>
+  <w:abstractNum w:abstractNumId="4" w15:restartNumberingAfterBreak="0">
+    <w:nsid w:val="4F5947C5"/>
+    <w:multiLevelType w:val="multilevel"/>
+    <w:tmpl w:val="0D50F432"/>
     <w:lvl w:ilvl="0">
       <w:start w:val="1"/>
       <w:numFmt w:val="bullet"/>
@@ -23350,10 +23910,10 @@
       </w:rPr>
     </w:lvl>
   </w:abstractNum>
-  <w:abstractNum w:abstractNumId="4" w15:restartNumberingAfterBreak="0">
-    <w:nsid w:val="529C679F"/>
+  <w:abstractNum w:abstractNumId="5" w15:restartNumberingAfterBreak="0">
+    <w:nsid w:val="61751594"/>
     <w:multiLevelType w:val="multilevel"/>
-    <w:tmpl w:val="1B48E008"/>
+    <w:tmpl w:val="E59AD50A"/>
     <w:lvl w:ilvl="0">
       <w:start w:val="1"/>
       <w:numFmt w:val="decimal"/>
@@ -23463,10 +24023,10 @@
       </w:pPr>
     </w:lvl>
   </w:abstractNum>
-  <w:abstractNum w:abstractNumId="5" w15:restartNumberingAfterBreak="0">
-    <w:nsid w:val="60E90884"/>
+  <w:abstractNum w:abstractNumId="6" w15:restartNumberingAfterBreak="0">
+    <w:nsid w:val="62F05937"/>
     <w:multiLevelType w:val="multilevel"/>
-    <w:tmpl w:val="A3F802B6"/>
+    <w:tmpl w:val="A6E8B72A"/>
     <w:lvl w:ilvl="0">
       <w:start w:val="1"/>
       <w:numFmt w:val="bullet"/>
@@ -23612,10 +24172,10 @@
       </w:rPr>
     </w:lvl>
   </w:abstractNum>
-  <w:abstractNum w:abstractNumId="6" w15:restartNumberingAfterBreak="0">
-    <w:nsid w:val="6B7A0535"/>
+  <w:abstractNum w:abstractNumId="7" w15:restartNumberingAfterBreak="0">
+    <w:nsid w:val="71BD3FB2"/>
     <w:multiLevelType w:val="multilevel"/>
-    <w:tmpl w:val="EA0C526A"/>
+    <w:tmpl w:val="C5CA68AA"/>
     <w:lvl w:ilvl="0">
       <w:start w:val="1"/>
       <w:numFmt w:val="bullet"/>
@@ -23761,123 +24321,10 @@
       </w:rPr>
     </w:lvl>
   </w:abstractNum>
-  <w:abstractNum w:abstractNumId="7" w15:restartNumberingAfterBreak="0">
-    <w:nsid w:val="6F1717AC"/>
+  <w:abstractNum w:abstractNumId="8" w15:restartNumberingAfterBreak="0">
+    <w:nsid w:val="7ADE5CE3"/>
     <w:multiLevelType w:val="multilevel"/>
-    <w:tmpl w:val="A296C7C4"/>
-    <w:lvl w:ilvl="0">
-      <w:start w:val="1"/>
-      <w:numFmt w:val="decimal"/>
-      <w:lvlText w:val="%1."/>
-      <w:lvlJc w:val="left"/>
-      <w:pPr>
-        <w:tabs>
-          <w:tab w:val="num" w:pos="720"/>
-        </w:tabs>
-        <w:ind w:left="720" w:hanging="360"/>
-      </w:pPr>
-    </w:lvl>
-    <w:lvl w:ilvl="1" w:tentative="1">
-      <w:start w:val="1"/>
-      <w:numFmt w:val="decimal"/>
-      <w:lvlText w:val="%2."/>
-      <w:lvlJc w:val="left"/>
-      <w:pPr>
-        <w:tabs>
-          <w:tab w:val="num" w:pos="1440"/>
-        </w:tabs>
-        <w:ind w:left="1440" w:hanging="360"/>
-      </w:pPr>
-    </w:lvl>
-    <w:lvl w:ilvl="2" w:tentative="1">
-      <w:start w:val="1"/>
-      <w:numFmt w:val="decimal"/>
-      <w:lvlText w:val="%3."/>
-      <w:lvlJc w:val="left"/>
-      <w:pPr>
-        <w:tabs>
-          <w:tab w:val="num" w:pos="2160"/>
-        </w:tabs>
-        <w:ind w:left="2160" w:hanging="360"/>
-      </w:pPr>
-    </w:lvl>
-    <w:lvl w:ilvl="3" w:tentative="1">
-      <w:start w:val="1"/>
-      <w:numFmt w:val="decimal"/>
-      <w:lvlText w:val="%4."/>
-      <w:lvlJc w:val="left"/>
-      <w:pPr>
-        <w:tabs>
-          <w:tab w:val="num" w:pos="2880"/>
-        </w:tabs>
-        <w:ind w:left="2880" w:hanging="360"/>
-      </w:pPr>
-    </w:lvl>
-    <w:lvl w:ilvl="4" w:tentative="1">
-      <w:start w:val="1"/>
-      <w:numFmt w:val="decimal"/>
-      <w:lvlText w:val="%5."/>
-      <w:lvlJc w:val="left"/>
-      <w:pPr>
-        <w:tabs>
-          <w:tab w:val="num" w:pos="3600"/>
-        </w:tabs>
-        <w:ind w:left="3600" w:hanging="360"/>
-      </w:pPr>
-    </w:lvl>
-    <w:lvl w:ilvl="5" w:tentative="1">
-      <w:start w:val="1"/>
-      <w:numFmt w:val="decimal"/>
-      <w:lvlText w:val="%6."/>
-      <w:lvlJc w:val="left"/>
-      <w:pPr>
-        <w:tabs>
-          <w:tab w:val="num" w:pos="4320"/>
-        </w:tabs>
-        <w:ind w:left="4320" w:hanging="360"/>
-      </w:pPr>
-    </w:lvl>
-    <w:lvl w:ilvl="6" w:tentative="1">
-      <w:start w:val="1"/>
-      <w:numFmt w:val="decimal"/>
-      <w:lvlText w:val="%7."/>
-      <w:lvlJc w:val="left"/>
-      <w:pPr>
-        <w:tabs>
-          <w:tab w:val="num" w:pos="5040"/>
-        </w:tabs>
-        <w:ind w:left="5040" w:hanging="360"/>
-      </w:pPr>
-    </w:lvl>
-    <w:lvl w:ilvl="7" w:tentative="1">
-      <w:start w:val="1"/>
-      <w:numFmt w:val="decimal"/>
-      <w:lvlText w:val="%8."/>
-      <w:lvlJc w:val="left"/>
-      <w:pPr>
-        <w:tabs>
-          <w:tab w:val="num" w:pos="5760"/>
-        </w:tabs>
-        <w:ind w:left="5760" w:hanging="360"/>
-      </w:pPr>
-    </w:lvl>
-    <w:lvl w:ilvl="8" w:tentative="1">
-      <w:start w:val="1"/>
-      <w:numFmt w:val="decimal"/>
-      <w:lvlText w:val="%9."/>
-      <w:lvlJc w:val="left"/>
-      <w:pPr>
-        <w:tabs>
-          <w:tab w:val="num" w:pos="6480"/>
-        </w:tabs>
-        <w:ind w:left="6480" w:hanging="360"/>
-      </w:pPr>
-    </w:lvl>
-  </w:abstractNum>
-  <w:abstractNum w:abstractNumId="8" w15:restartNumberingAfterBreak="0">
-    <w:nsid w:val="71ED646C"/>
-    <w:multiLevelType w:val="multilevel"/>
-    <w:tmpl w:val="C1C2A330"/>
+    <w:tmpl w:val="611842DE"/>
     <w:lvl w:ilvl="0">
       <w:start w:val="1"/>
       <w:numFmt w:val="bullet"/>
@@ -24024,9 +24471,9 @@
     </w:lvl>
   </w:abstractNum>
   <w:abstractNum w:abstractNumId="9" w15:restartNumberingAfterBreak="0">
-    <w:nsid w:val="72560FDA"/>
+    <w:nsid w:val="7F054909"/>
     <w:multiLevelType w:val="multilevel"/>
-    <w:tmpl w:val="BE8C7050"/>
+    <w:tmpl w:val="654ECD94"/>
     <w:lvl w:ilvl="0">
       <w:start w:val="1"/>
       <w:numFmt w:val="bullet"/>
@@ -24172,35 +24619,35 @@
       </w:rPr>
     </w:lvl>
   </w:abstractNum>
-  <w:num w:numId="1" w16cid:durableId="1101535328">
+  <w:num w:numId="1" w16cid:durableId="1764572920">
+    <w:abstractNumId w:val="7"/>
+  </w:num>
+  <w:num w:numId="2" w16cid:durableId="781191351">
+    <w:abstractNumId w:val="0"/>
+  </w:num>
+  <w:num w:numId="3" w16cid:durableId="507214909">
+    <w:abstractNumId w:val="6"/>
+  </w:num>
+  <w:num w:numId="4" w16cid:durableId="1523937179">
+    <w:abstractNumId w:val="4"/>
+  </w:num>
+  <w:num w:numId="5" w16cid:durableId="1247957373">
+    <w:abstractNumId w:val="2"/>
+  </w:num>
+  <w:num w:numId="6" w16cid:durableId="1261832537">
+    <w:abstractNumId w:val="8"/>
+  </w:num>
+  <w:num w:numId="7" w16cid:durableId="929236213">
+    <w:abstractNumId w:val="1"/>
+  </w:num>
+  <w:num w:numId="8" w16cid:durableId="1187669110">
+    <w:abstractNumId w:val="5"/>
+  </w:num>
+  <w:num w:numId="9" w16cid:durableId="1377242017">
     <w:abstractNumId w:val="3"/>
   </w:num>
-  <w:num w:numId="2" w16cid:durableId="834879587">
-    <w:abstractNumId w:val="5"/>
-  </w:num>
-  <w:num w:numId="3" w16cid:durableId="1936788350">
-    <w:abstractNumId w:val="2"/>
-  </w:num>
-  <w:num w:numId="4" w16cid:durableId="2017730422">
-    <w:abstractNumId w:val="0"/>
-  </w:num>
-  <w:num w:numId="5" w16cid:durableId="2136213845">
-    <w:abstractNumId w:val="6"/>
-  </w:num>
-  <w:num w:numId="6" w16cid:durableId="567811639">
+  <w:num w:numId="10" w16cid:durableId="645863975">
     <w:abstractNumId w:val="9"/>
-  </w:num>
-  <w:num w:numId="7" w16cid:durableId="2125079033">
-    <w:abstractNumId w:val="1"/>
-  </w:num>
-  <w:num w:numId="8" w16cid:durableId="569191835">
-    <w:abstractNumId w:val="7"/>
-  </w:num>
-  <w:num w:numId="9" w16cid:durableId="169174514">
-    <w:abstractNumId w:val="4"/>
-  </w:num>
-  <w:num w:numId="10" w16cid:durableId="121193665">
-    <w:abstractNumId w:val="8"/>
   </w:num>
 </w:numbering>
 </file>

</xml_diff>

<commit_message>
Docs: bring every guide, the outline and the flowchart up to Tri-Stone
- Developer Guide: folder layout with Company.Launcher / WebsiteAdmin /
  Apps\Tri-Stone, start-up through the launcher, where things live,
  Website Admin level in User Accounts.
- User Manual / Feature Guide: titles cover both sets of screens; sign in
  through Tri-Stone; installing section; idle check in both.
- Database Guide: users holds all logins incl. Website Admins; DFD notes.
- UI Elements Guide: Sign In and main window entries name Tri-Stone.
- Project Outline: part_oct30.ps1 (Website Admin as separate screens with
  the same Sign In, Website Admin level, one account list), also added to
  rebuild_outline.ps1.
- Flowchart: Website Admin labels updated to the Tri-Stone Sign In.
- CLAUDE.md: status as of 2026-10-30, docs list, home-PC to-dos.

Co-Authored-By: Claude Opus 5.5 <noreply@anthropic.com>
</commit_message>
<xml_diff>
--- a/docs/Database Guide.docx
+++ b/docs/Database Guide.docx
@@ -40,7 +40,7 @@
       <w:pPr>
         <w:pStyle w:val="NormalWeb"/>
         <w:shd w:val="clear" w:color="auto" w:fill="EEF2F8"/>
-        <w:divId w:val="1109202861"/>
+        <w:divId w:val="322319731"/>
         <w:rPr>
           <w:rFonts w:ascii="Calibri" w:hAnsi="Calibri" w:cs="Calibri"/>
           <w:color w:val="404040"/>
@@ -10475,25 +10475,7 @@
           <w:sz w:val="22"/>
           <w:szCs w:val="22"/>
         </w:rPr>
-        <w:t xml:space="preserve"> </w:t>
-      </w:r>
-      <w:r>
-        <w:rPr>
-          <w:rFonts w:ascii="Calibri" w:hAnsi="Calibri" w:cs="Calibri"/>
-          <w:color w:val="1A1A1A"/>
-          <w:sz w:val="22"/>
-          <w:szCs w:val="22"/>
-        </w:rPr>
-        <w:t>→ employees,</w:t>
-      </w:r>
-      <w:r>
-        <w:rPr>
-          <w:rFonts w:ascii="Calibri" w:hAnsi="Calibri" w:cs="Calibri"/>
-          <w:color w:val="1A1A1A"/>
-          <w:sz w:val="22"/>
-          <w:szCs w:val="22"/>
-        </w:rPr>
-        <w:t xml:space="preserve"> </w:t>
+        <w:t xml:space="preserve"> → employees, </w:t>
       </w:r>
       <w:r>
         <w:rPr>
@@ -17506,8 +17488,8 @@
         <w:tblLook w:val="04A0" w:firstRow="1" w:lastRow="0" w:firstColumn="1" w:lastColumn="0" w:noHBand="0" w:noVBand="1"/>
       </w:tblPr>
       <w:tblGrid>
-        <w:gridCol w:w="3468"/>
-        <w:gridCol w:w="5876"/>
+        <w:gridCol w:w="3354"/>
+        <w:gridCol w:w="5990"/>
       </w:tblGrid>
       <w:tr>
         <w:trPr>
@@ -18023,7 +18005,7 @@
                 <w:sz w:val="22"/>
                 <w:szCs w:val="22"/>
               </w:rPr>
-              <w:t xml:space="preserve">, </w:t>
+              <w:t xml:space="preserve"> (all logins, including Website Admins), </w:t>
             </w:r>
             <w:r>
               <w:rPr>
@@ -19148,16 +19130,7 @@
                 <w:sz w:val="22"/>
                 <w:szCs w:val="22"/>
               </w:rPr>
-              <w:t xml:space="preserve"> </w:t>
-            </w:r>
-            <w:r>
-              <w:rPr>
-                <w:rFonts w:ascii="Calibri" w:eastAsia="Times New Roman" w:hAnsi="Calibri" w:cs="Calibri"/>
-                <w:color w:val="1A1A1A"/>
-                <w:sz w:val="22"/>
-                <w:szCs w:val="22"/>
-              </w:rPr>
-              <w:t xml:space="preserve">(+ delivery receipts read from </w:t>
+              <w:t xml:space="preserve"> (+ delivery receipts read from </w:t>
             </w:r>
             <w:r>
               <w:rPr>
@@ -19485,7 +19458,7 @@
           <w:sz w:val="22"/>
           <w:szCs w:val="22"/>
         </w:rPr>
-        <w:t>account statuses became Active / Locked / Disabled. If the DFD is used for a presentation, update those parts so it matches.</w:t>
+        <w:t>account statuses became Active / Locked / Disabled. Website Admin is no longer part of the office app: it has its own screens, opened by the same Tri-Stone Sign In with Website Admin logins (one account list). If the DFD is used for a presentation, update those parts so it matches.</w:t>
       </w:r>
     </w:p>
     <w:p>
@@ -20024,7 +19997,7 @@
         <w:pStyle w:val="NormalWeb"/>
         <w:shd w:val="clear" w:color="auto" w:fill="EEF2F8"/>
         <w:ind w:right="720"/>
-        <w:divId w:val="1749305157"/>
+        <w:divId w:val="1620182216"/>
         <w:rPr>
           <w:rFonts w:ascii="Calibri" w:hAnsi="Calibri" w:cs="Calibri"/>
           <w:color w:val="404040"/>
@@ -20602,7 +20575,16 @@
           <w:szCs w:val="19"/>
           <w:shd w:val="clear" w:color="auto" w:fill="F2F2F2"/>
         </w:rPr>
-        <w:t>FROM receipts WHERE status = 'Approved'</w:t>
+        <w:t>FROM receipts WHERE status = '</w:t>
+      </w:r>
+      <w:r>
+        <w:rPr>
+          <w:color w:val="1A1A1A"/>
+          <w:sz w:val="19"/>
+          <w:szCs w:val="19"/>
+          <w:shd w:val="clear" w:color="auto" w:fill="F2F2F2"/>
+        </w:rPr>
+        <w:t>Approved'</w:t>
       </w:r>
     </w:p>
     <w:p>
@@ -23232,9 +23214,9 @@
 <file path=word/numbering.xml><?xml version="1.0" encoding="utf-8"?>
 <w:numbering xmlns:wpc="http://schemas.microsoft.com/office/word/2010/wordprocessingCanvas" xmlns:cx="http://schemas.microsoft.com/office/drawing/2014/chartex" xmlns:cx1="http://schemas.microsoft.com/office/drawing/2015/9/8/chartex" xmlns:cx2="http://schemas.microsoft.com/office/drawing/2015/10/21/chartex" xmlns:cx3="http://schemas.microsoft.com/office/drawing/2016/5/9/chartex" xmlns:cx4="http://schemas.microsoft.com/office/drawing/2016/5/10/chartex" xmlns:cx5="http://schemas.microsoft.com/office/drawing/2016/5/11/chartex" xmlns:cx6="http://schemas.microsoft.com/office/drawing/2016/5/12/chartex" xmlns:cx7="http://schemas.microsoft.com/office/drawing/2016/5/13/chartex" xmlns:cx8="http://schemas.microsoft.com/office/drawing/2016/5/14/chartex" xmlns:mc="http://schemas.openxmlformats.org/markup-compatibility/2006" xmlns:aink="http://schemas.microsoft.com/office/drawing/2016/ink" xmlns:am3d="http://schemas.microsoft.com/office/drawing/2017/model3d" xmlns:o="urn:schemas-microsoft-com:office:office" xmlns:oel="http://schemas.microsoft.com/office/2019/extlst" xmlns:r="http://schemas.openxmlformats.org/officeDocument/2006/relationships" xmlns:m="http://schemas.openxmlformats.org/officeDocument/2006/math" xmlns:v="urn:schemas-microsoft-com:vml" xmlns:wp14="http://schemas.microsoft.com/office/word/2010/wordprocessingDrawing" xmlns:wp="http://schemas.openxmlformats.org/drawingml/2006/wordprocessingDrawing" xmlns:w10="urn:schemas-microsoft-com:office:word" xmlns:w="http://schemas.openxmlformats.org/wordprocessingml/2006/main" xmlns:w14="http://schemas.microsoft.com/office/word/2010/wordml" xmlns:w15="http://schemas.microsoft.com/office/word/2012/wordml" xmlns:w16cex="http://schemas.microsoft.com/office/word/2018/wordml/cex" xmlns:w16cid="http://schemas.microsoft.com/office/word/2016/wordml/cid" xmlns:w16="http://schemas.microsoft.com/office/word/2018/wordml" xmlns:w16du="http://schemas.microsoft.com/office/word/2023/wordml/word16du" xmlns:w16sdtdh="http://schemas.microsoft.com/office/word/2020/wordml/sdtdatahash" xmlns:w16sdtfl="http://schemas.microsoft.com/office/word/2024/wordml/sdtformatlock" xmlns:w16se="http://schemas.microsoft.com/office/word/2015/wordml/symex" xmlns:wpg="http://schemas.microsoft.com/office/word/2010/wordprocessingGroup" xmlns:wpi="http://schemas.microsoft.com/office/word/2010/wordprocessingInk" xmlns:wne="http://schemas.microsoft.com/office/word/2006/wordml" xmlns:wps="http://schemas.microsoft.com/office/word/2010/wordprocessingShape" mc:Ignorable="w14 w15 w16se w16cid w16 w16cex w16sdtdh w16sdtfl w16du wp14">
   <w:abstractNum w:abstractNumId="0" w15:restartNumberingAfterBreak="0">
-    <w:nsid w:val="058C7BC6"/>
+    <w:nsid w:val="03D9495D"/>
     <w:multiLevelType w:val="multilevel"/>
-    <w:tmpl w:val="7018D328"/>
+    <w:tmpl w:val="562E8522"/>
     <w:lvl w:ilvl="0">
       <w:start w:val="1"/>
       <w:numFmt w:val="bullet"/>
@@ -23381,9 +23363,9 @@
     </w:lvl>
   </w:abstractNum>
   <w:abstractNum w:abstractNumId="1" w15:restartNumberingAfterBreak="0">
-    <w:nsid w:val="0F4276B9"/>
+    <w:nsid w:val="12950F0D"/>
     <w:multiLevelType w:val="multilevel"/>
-    <w:tmpl w:val="ACD2746A"/>
+    <w:tmpl w:val="2F342874"/>
     <w:lvl w:ilvl="0">
       <w:start w:val="1"/>
       <w:numFmt w:val="bullet"/>
@@ -23530,9 +23512,9 @@
     </w:lvl>
   </w:abstractNum>
   <w:abstractNum w:abstractNumId="2" w15:restartNumberingAfterBreak="0">
-    <w:nsid w:val="28061A48"/>
+    <w:nsid w:val="173E57F3"/>
     <w:multiLevelType w:val="multilevel"/>
-    <w:tmpl w:val="FDF8CDCE"/>
+    <w:tmpl w:val="944EF728"/>
     <w:lvl w:ilvl="0">
       <w:start w:val="1"/>
       <w:numFmt w:val="bullet"/>
@@ -23679,9 +23661,9 @@
     </w:lvl>
   </w:abstractNum>
   <w:abstractNum w:abstractNumId="3" w15:restartNumberingAfterBreak="0">
-    <w:nsid w:val="30346A16"/>
+    <w:nsid w:val="27372774"/>
     <w:multiLevelType w:val="multilevel"/>
-    <w:tmpl w:val="4DB23204"/>
+    <w:tmpl w:val="73169FE6"/>
     <w:lvl w:ilvl="0">
       <w:start w:val="1"/>
       <w:numFmt w:val="decimal"/>
@@ -23792,9 +23774,122 @@
     </w:lvl>
   </w:abstractNum>
   <w:abstractNum w:abstractNumId="4" w15:restartNumberingAfterBreak="0">
-    <w:nsid w:val="4DA62320"/>
+    <w:nsid w:val="3A103980"/>
     <w:multiLevelType w:val="multilevel"/>
-    <w:tmpl w:val="29C00B46"/>
+    <w:tmpl w:val="49B63684"/>
+    <w:lvl w:ilvl="0">
+      <w:start w:val="1"/>
+      <w:numFmt w:val="decimal"/>
+      <w:lvlText w:val="%1."/>
+      <w:lvlJc w:val="left"/>
+      <w:pPr>
+        <w:tabs>
+          <w:tab w:val="num" w:pos="720"/>
+        </w:tabs>
+        <w:ind w:left="720" w:hanging="360"/>
+      </w:pPr>
+    </w:lvl>
+    <w:lvl w:ilvl="1" w:tentative="1">
+      <w:start w:val="1"/>
+      <w:numFmt w:val="decimal"/>
+      <w:lvlText w:val="%2."/>
+      <w:lvlJc w:val="left"/>
+      <w:pPr>
+        <w:tabs>
+          <w:tab w:val="num" w:pos="1440"/>
+        </w:tabs>
+        <w:ind w:left="1440" w:hanging="360"/>
+      </w:pPr>
+    </w:lvl>
+    <w:lvl w:ilvl="2" w:tentative="1">
+      <w:start w:val="1"/>
+      <w:numFmt w:val="decimal"/>
+      <w:lvlText w:val="%3."/>
+      <w:lvlJc w:val="left"/>
+      <w:pPr>
+        <w:tabs>
+          <w:tab w:val="num" w:pos="2160"/>
+        </w:tabs>
+        <w:ind w:left="2160" w:hanging="360"/>
+      </w:pPr>
+    </w:lvl>
+    <w:lvl w:ilvl="3" w:tentative="1">
+      <w:start w:val="1"/>
+      <w:numFmt w:val="decimal"/>
+      <w:lvlText w:val="%4."/>
+      <w:lvlJc w:val="left"/>
+      <w:pPr>
+        <w:tabs>
+          <w:tab w:val="num" w:pos="2880"/>
+        </w:tabs>
+        <w:ind w:left="2880" w:hanging="360"/>
+      </w:pPr>
+    </w:lvl>
+    <w:lvl w:ilvl="4" w:tentative="1">
+      <w:start w:val="1"/>
+      <w:numFmt w:val="decimal"/>
+      <w:lvlText w:val="%5."/>
+      <w:lvlJc w:val="left"/>
+      <w:pPr>
+        <w:tabs>
+          <w:tab w:val="num" w:pos="3600"/>
+        </w:tabs>
+        <w:ind w:left="3600" w:hanging="360"/>
+      </w:pPr>
+    </w:lvl>
+    <w:lvl w:ilvl="5" w:tentative="1">
+      <w:start w:val="1"/>
+      <w:numFmt w:val="decimal"/>
+      <w:lvlText w:val="%6."/>
+      <w:lvlJc w:val="left"/>
+      <w:pPr>
+        <w:tabs>
+          <w:tab w:val="num" w:pos="4320"/>
+        </w:tabs>
+        <w:ind w:left="4320" w:hanging="360"/>
+      </w:pPr>
+    </w:lvl>
+    <w:lvl w:ilvl="6" w:tentative="1">
+      <w:start w:val="1"/>
+      <w:numFmt w:val="decimal"/>
+      <w:lvlText w:val="%7."/>
+      <w:lvlJc w:val="left"/>
+      <w:pPr>
+        <w:tabs>
+          <w:tab w:val="num" w:pos="5040"/>
+        </w:tabs>
+        <w:ind w:left="5040" w:hanging="360"/>
+      </w:pPr>
+    </w:lvl>
+    <w:lvl w:ilvl="7" w:tentative="1">
+      <w:start w:val="1"/>
+      <w:numFmt w:val="decimal"/>
+      <w:lvlText w:val="%8."/>
+      <w:lvlJc w:val="left"/>
+      <w:pPr>
+        <w:tabs>
+          <w:tab w:val="num" w:pos="5760"/>
+        </w:tabs>
+        <w:ind w:left="5760" w:hanging="360"/>
+      </w:pPr>
+    </w:lvl>
+    <w:lvl w:ilvl="8" w:tentative="1">
+      <w:start w:val="1"/>
+      <w:numFmt w:val="decimal"/>
+      <w:lvlText w:val="%9."/>
+      <w:lvlJc w:val="left"/>
+      <w:pPr>
+        <w:tabs>
+          <w:tab w:val="num" w:pos="6480"/>
+        </w:tabs>
+        <w:ind w:left="6480" w:hanging="360"/>
+      </w:pPr>
+    </w:lvl>
+  </w:abstractNum>
+  <w:abstractNum w:abstractNumId="5" w15:restartNumberingAfterBreak="0">
+    <w:nsid w:val="4A2E0031"/>
+    <w:multiLevelType w:val="multilevel"/>
+    <w:tmpl w:val="FF284D84"/>
     <w:lvl w:ilvl="0">
       <w:start w:val="1"/>
       <w:numFmt w:val="bullet"/>
@@ -23940,10 +24035,10 @@
       </w:rPr>
     </w:lvl>
   </w:abstractNum>
-  <w:abstractNum w:abstractNumId="5" w15:restartNumberingAfterBreak="0">
-    <w:nsid w:val="52BE0B69"/>
+  <w:abstractNum w:abstractNumId="6" w15:restartNumberingAfterBreak="0">
+    <w:nsid w:val="4D97510F"/>
     <w:multiLevelType w:val="multilevel"/>
-    <w:tmpl w:val="EDDEE926"/>
+    <w:tmpl w:val="054CA0AC"/>
     <w:lvl w:ilvl="0">
       <w:start w:val="1"/>
       <w:numFmt w:val="bullet"/>
@@ -24089,123 +24184,10 @@
       </w:rPr>
     </w:lvl>
   </w:abstractNum>
-  <w:abstractNum w:abstractNumId="6" w15:restartNumberingAfterBreak="0">
-    <w:nsid w:val="538274A5"/>
+  <w:abstractNum w:abstractNumId="7" w15:restartNumberingAfterBreak="0">
+    <w:nsid w:val="5DEB3C0A"/>
     <w:multiLevelType w:val="multilevel"/>
-    <w:tmpl w:val="78C0D308"/>
-    <w:lvl w:ilvl="0">
-      <w:start w:val="1"/>
-      <w:numFmt w:val="decimal"/>
-      <w:lvlText w:val="%1."/>
-      <w:lvlJc w:val="left"/>
-      <w:pPr>
-        <w:tabs>
-          <w:tab w:val="num" w:pos="720"/>
-        </w:tabs>
-        <w:ind w:left="720" w:hanging="360"/>
-      </w:pPr>
-    </w:lvl>
-    <w:lvl w:ilvl="1" w:tentative="1">
-      <w:start w:val="1"/>
-      <w:numFmt w:val="decimal"/>
-      <w:lvlText w:val="%2."/>
-      <w:lvlJc w:val="left"/>
-      <w:pPr>
-        <w:tabs>
-          <w:tab w:val="num" w:pos="1440"/>
-        </w:tabs>
-        <w:ind w:left="1440" w:hanging="360"/>
-      </w:pPr>
-    </w:lvl>
-    <w:lvl w:ilvl="2" w:tentative="1">
-      <w:start w:val="1"/>
-      <w:numFmt w:val="decimal"/>
-      <w:lvlText w:val="%3."/>
-      <w:lvlJc w:val="left"/>
-      <w:pPr>
-        <w:tabs>
-          <w:tab w:val="num" w:pos="2160"/>
-        </w:tabs>
-        <w:ind w:left="2160" w:hanging="360"/>
-      </w:pPr>
-    </w:lvl>
-    <w:lvl w:ilvl="3" w:tentative="1">
-      <w:start w:val="1"/>
-      <w:numFmt w:val="decimal"/>
-      <w:lvlText w:val="%4."/>
-      <w:lvlJc w:val="left"/>
-      <w:pPr>
-        <w:tabs>
-          <w:tab w:val="num" w:pos="2880"/>
-        </w:tabs>
-        <w:ind w:left="2880" w:hanging="360"/>
-      </w:pPr>
-    </w:lvl>
-    <w:lvl w:ilvl="4" w:tentative="1">
-      <w:start w:val="1"/>
-      <w:numFmt w:val="decimal"/>
-      <w:lvlText w:val="%5."/>
-      <w:lvlJc w:val="left"/>
-      <w:pPr>
-        <w:tabs>
-          <w:tab w:val="num" w:pos="3600"/>
-        </w:tabs>
-        <w:ind w:left="3600" w:hanging="360"/>
-      </w:pPr>
-    </w:lvl>
-    <w:lvl w:ilvl="5" w:tentative="1">
-      <w:start w:val="1"/>
-      <w:numFmt w:val="decimal"/>
-      <w:lvlText w:val="%6."/>
-      <w:lvlJc w:val="left"/>
-      <w:pPr>
-        <w:tabs>
-          <w:tab w:val="num" w:pos="4320"/>
-        </w:tabs>
-        <w:ind w:left="4320" w:hanging="360"/>
-      </w:pPr>
-    </w:lvl>
-    <w:lvl w:ilvl="6" w:tentative="1">
-      <w:start w:val="1"/>
-      <w:numFmt w:val="decimal"/>
-      <w:lvlText w:val="%7."/>
-      <w:lvlJc w:val="left"/>
-      <w:pPr>
-        <w:tabs>
-          <w:tab w:val="num" w:pos="5040"/>
-        </w:tabs>
-        <w:ind w:left="5040" w:hanging="360"/>
-      </w:pPr>
-    </w:lvl>
-    <w:lvl w:ilvl="7" w:tentative="1">
-      <w:start w:val="1"/>
-      <w:numFmt w:val="decimal"/>
-      <w:lvlText w:val="%8."/>
-      <w:lvlJc w:val="left"/>
-      <w:pPr>
-        <w:tabs>
-          <w:tab w:val="num" w:pos="5760"/>
-        </w:tabs>
-        <w:ind w:left="5760" w:hanging="360"/>
-      </w:pPr>
-    </w:lvl>
-    <w:lvl w:ilvl="8" w:tentative="1">
-      <w:start w:val="1"/>
-      <w:numFmt w:val="decimal"/>
-      <w:lvlText w:val="%9."/>
-      <w:lvlJc w:val="left"/>
-      <w:pPr>
-        <w:tabs>
-          <w:tab w:val="num" w:pos="6480"/>
-        </w:tabs>
-        <w:ind w:left="6480" w:hanging="360"/>
-      </w:pPr>
-    </w:lvl>
-  </w:abstractNum>
-  <w:abstractNum w:abstractNumId="7" w15:restartNumberingAfterBreak="0">
-    <w:nsid w:val="653914D9"/>
-    <w:multiLevelType w:val="multilevel"/>
-    <w:tmpl w:val="DEE45EEC"/>
+    <w:tmpl w:val="F45C073C"/>
     <w:lvl w:ilvl="0">
       <w:start w:val="1"/>
       <w:numFmt w:val="bullet"/>
@@ -24352,9 +24334,9 @@
     </w:lvl>
   </w:abstractNum>
   <w:abstractNum w:abstractNumId="8" w15:restartNumberingAfterBreak="0">
-    <w:nsid w:val="6FCA68B2"/>
+    <w:nsid w:val="67DF2ABC"/>
     <w:multiLevelType w:val="multilevel"/>
-    <w:tmpl w:val="79B2388E"/>
+    <w:tmpl w:val="3142139C"/>
     <w:lvl w:ilvl="0">
       <w:start w:val="1"/>
       <w:numFmt w:val="bullet"/>
@@ -24501,9 +24483,9 @@
     </w:lvl>
   </w:abstractNum>
   <w:abstractNum w:abstractNumId="9" w15:restartNumberingAfterBreak="0">
-    <w:nsid w:val="75D41FE1"/>
+    <w:nsid w:val="6FC82075"/>
     <w:multiLevelType w:val="multilevel"/>
-    <w:tmpl w:val="5F781012"/>
+    <w:tmpl w:val="B7C47BFE"/>
     <w:lvl w:ilvl="0">
       <w:start w:val="1"/>
       <w:numFmt w:val="bullet"/>
@@ -24649,35 +24631,35 @@
       </w:rPr>
     </w:lvl>
   </w:abstractNum>
-  <w:num w:numId="1" w16cid:durableId="1546679543">
+  <w:num w:numId="1" w16cid:durableId="991954790">
+    <w:abstractNumId w:val="1"/>
+  </w:num>
+  <w:num w:numId="2" w16cid:durableId="677655793">
+    <w:abstractNumId w:val="9"/>
+  </w:num>
+  <w:num w:numId="3" w16cid:durableId="766929820">
+    <w:abstractNumId w:val="2"/>
+  </w:num>
+  <w:num w:numId="4" w16cid:durableId="56631826">
+    <w:abstractNumId w:val="0"/>
+  </w:num>
+  <w:num w:numId="5" w16cid:durableId="1307584635">
+    <w:abstractNumId w:val="8"/>
+  </w:num>
+  <w:num w:numId="6" w16cid:durableId="885145315">
+    <w:abstractNumId w:val="6"/>
+  </w:num>
+  <w:num w:numId="7" w16cid:durableId="757212445">
+    <w:abstractNumId w:val="5"/>
+  </w:num>
+  <w:num w:numId="8" w16cid:durableId="1935287225">
+    <w:abstractNumId w:val="3"/>
+  </w:num>
+  <w:num w:numId="9" w16cid:durableId="1987200330">
     <w:abstractNumId w:val="4"/>
   </w:num>
-  <w:num w:numId="2" w16cid:durableId="1905947473">
-    <w:abstractNumId w:val="5"/>
-  </w:num>
-  <w:num w:numId="3" w16cid:durableId="1717899269">
-    <w:abstractNumId w:val="2"/>
-  </w:num>
-  <w:num w:numId="4" w16cid:durableId="95057138">
+  <w:num w:numId="10" w16cid:durableId="2037080929">
     <w:abstractNumId w:val="7"/>
-  </w:num>
-  <w:num w:numId="5" w16cid:durableId="2029208088">
-    <w:abstractNumId w:val="9"/>
-  </w:num>
-  <w:num w:numId="6" w16cid:durableId="150610235">
-    <w:abstractNumId w:val="8"/>
-  </w:num>
-  <w:num w:numId="7" w16cid:durableId="901793855">
-    <w:abstractNumId w:val="1"/>
-  </w:num>
-  <w:num w:numId="8" w16cid:durableId="492725920">
-    <w:abstractNumId w:val="3"/>
-  </w:num>
-  <w:num w:numId="9" w16cid:durableId="712119933">
-    <w:abstractNumId w:val="6"/>
-  </w:num>
-  <w:num w:numId="10" w16cid:durableId="713240338">
-    <w:abstractNumId w:val="0"/>
   </w:num>
 </w:numbering>
 </file>

</xml_diff>

<commit_message>
Attendance: Make Scanner Employee File (load the employee list on the scanner by USB)
- ScannerEmployeeFile fills the scanner's own "Employee Form" with every
  active employee who has a numeric Biometric ID: ID, name, department
  number (Site 1, Administration 3, HR & Payroll 4, Inventory 5,
  Subcontractors 6, Receipts 7), authority 0. Employees left out are
  listed with the reason.
- The scanner's blank form is embedded (Resources/ScannerEmployeeForm.xls);
  it is read with ExcelDataReader and written as a normal .xls with NPOI
  (the scanner's own file can't be opened by NPOI). Compared in Excel:
  rules sheet identical, employee sheet identical except the date.
- Button on the Attendance tab. 9 checks passed; not yet tried on the
  real scanner (added to Check at home). Guides, outline, notes updated.

Co-Authored-By: Claude Opus 5.5 <noreply@anthropic.com>
</commit_message>
<xml_diff>
--- a/docs/Database Guide.docx
+++ b/docs/Database Guide.docx
@@ -40,7 +40,7 @@
       <w:pPr>
         <w:pStyle w:val="NormalWeb"/>
         <w:shd w:val="clear" w:color="auto" w:fill="EEF2F8"/>
-        <w:divId w:val="827481223"/>
+        <w:divId w:val="1563642342"/>
         <w:rPr>
           <w:rFonts w:ascii="Calibri" w:hAnsi="Calibri" w:cs="Calibri"/>
           <w:color w:val="404040"/>
@@ -20633,7 +20633,7 @@
       <w:pPr>
         <w:pStyle w:val="NormalWeb"/>
         <w:shd w:val="clear" w:color="auto" w:fill="EEF2F8"/>
-        <w:divId w:val="1198620126"/>
+        <w:divId w:val="1980105882"/>
         <w:rPr>
           <w:rFonts w:ascii="Calibri" w:hAnsi="Calibri" w:cs="Calibri"/>
           <w:color w:val="404040"/>
@@ -23868,9 +23868,9 @@
 <file path=word/numbering.xml><?xml version="1.0" encoding="utf-8"?>
 <w:numbering xmlns:wpc="http://schemas.microsoft.com/office/word/2010/wordprocessingCanvas" xmlns:cx="http://schemas.microsoft.com/office/drawing/2014/chartex" xmlns:cx1="http://schemas.microsoft.com/office/drawing/2015/9/8/chartex" xmlns:cx2="http://schemas.microsoft.com/office/drawing/2015/10/21/chartex" xmlns:cx3="http://schemas.microsoft.com/office/drawing/2016/5/9/chartex" xmlns:cx4="http://schemas.microsoft.com/office/drawing/2016/5/10/chartex" xmlns:cx5="http://schemas.microsoft.com/office/drawing/2016/5/11/chartex" xmlns:cx6="http://schemas.microsoft.com/office/drawing/2016/5/12/chartex" xmlns:cx7="http://schemas.microsoft.com/office/drawing/2016/5/13/chartex" xmlns:cx8="http://schemas.microsoft.com/office/drawing/2016/5/14/chartex" xmlns:mc="http://schemas.openxmlformats.org/markup-compatibility/2006" xmlns:aink="http://schemas.microsoft.com/office/drawing/2016/ink" xmlns:am3d="http://schemas.microsoft.com/office/drawing/2017/model3d" xmlns:o="urn:schemas-microsoft-com:office:office" xmlns:oel="http://schemas.microsoft.com/office/2019/extlst" xmlns:r="http://schemas.openxmlformats.org/officeDocument/2006/relationships" xmlns:m="http://schemas.openxmlformats.org/officeDocument/2006/math" xmlns:v="urn:schemas-microsoft-com:vml" xmlns:wp14="http://schemas.microsoft.com/office/word/2010/wordprocessingDrawing" xmlns:wp="http://schemas.openxmlformats.org/drawingml/2006/wordprocessingDrawing" xmlns:w10="urn:schemas-microsoft-com:office:word" xmlns:w="http://schemas.openxmlformats.org/wordprocessingml/2006/main" xmlns:w14="http://schemas.microsoft.com/office/word/2010/wordml" xmlns:w15="http://schemas.microsoft.com/office/word/2012/wordml" xmlns:w16cex="http://schemas.microsoft.com/office/word/2018/wordml/cex" xmlns:w16cid="http://schemas.microsoft.com/office/word/2016/wordml/cid" xmlns:w16="http://schemas.microsoft.com/office/word/2018/wordml" xmlns:w16du="http://schemas.microsoft.com/office/word/2023/wordml/word16du" xmlns:w16sdtdh="http://schemas.microsoft.com/office/word/2020/wordml/sdtdatahash" xmlns:w16sdtfl="http://schemas.microsoft.com/office/word/2024/wordml/sdtformatlock" xmlns:w16se="http://schemas.microsoft.com/office/word/2015/wordml/symex" xmlns:wpg="http://schemas.microsoft.com/office/word/2010/wordprocessingGroup" xmlns:wpi="http://schemas.microsoft.com/office/word/2010/wordprocessingInk" xmlns:wne="http://schemas.microsoft.com/office/word/2006/wordml" xmlns:wps="http://schemas.microsoft.com/office/word/2010/wordprocessingShape" mc:Ignorable="w14 w15 w16se w16cid w16 w16cex w16sdtdh w16sdtfl w16du wp14">
   <w:abstractNum w:abstractNumId="0" w15:restartNumberingAfterBreak="0">
-    <w:nsid w:val="0604034E"/>
+    <w:nsid w:val="10D03B9B"/>
     <w:multiLevelType w:val="multilevel"/>
-    <w:tmpl w:val="FAB21224"/>
+    <w:tmpl w:val="C462940E"/>
     <w:lvl w:ilvl="0">
       <w:start w:val="1"/>
       <w:numFmt w:val="bullet"/>
@@ -24017,9 +24017,9 @@
     </w:lvl>
   </w:abstractNum>
   <w:abstractNum w:abstractNumId="1" w15:restartNumberingAfterBreak="0">
-    <w:nsid w:val="07672C7D"/>
+    <w:nsid w:val="22083843"/>
     <w:multiLevelType w:val="multilevel"/>
-    <w:tmpl w:val="CD82A00A"/>
+    <w:tmpl w:val="8C7AAB08"/>
     <w:lvl w:ilvl="0">
       <w:start w:val="1"/>
       <w:numFmt w:val="bullet"/>
@@ -24166,9 +24166,9 @@
     </w:lvl>
   </w:abstractNum>
   <w:abstractNum w:abstractNumId="2" w15:restartNumberingAfterBreak="0">
-    <w:nsid w:val="18786977"/>
+    <w:nsid w:val="299D1CD1"/>
     <w:multiLevelType w:val="multilevel"/>
-    <w:tmpl w:val="A8F44864"/>
+    <w:tmpl w:val="7C02D0CC"/>
     <w:lvl w:ilvl="0">
       <w:start w:val="1"/>
       <w:numFmt w:val="bullet"/>
@@ -24315,9 +24315,9 @@
     </w:lvl>
   </w:abstractNum>
   <w:abstractNum w:abstractNumId="3" w15:restartNumberingAfterBreak="0">
-    <w:nsid w:val="2E5F2096"/>
+    <w:nsid w:val="2D194F00"/>
     <w:multiLevelType w:val="multilevel"/>
-    <w:tmpl w:val="AC6C6184"/>
+    <w:tmpl w:val="D954F6C2"/>
     <w:lvl w:ilvl="0">
       <w:start w:val="1"/>
       <w:numFmt w:val="bullet"/>
@@ -24464,235 +24464,9 @@
     </w:lvl>
   </w:abstractNum>
   <w:abstractNum w:abstractNumId="4" w15:restartNumberingAfterBreak="0">
-    <w:nsid w:val="3AC00EA7"/>
+    <w:nsid w:val="3E1269D5"/>
     <w:multiLevelType w:val="multilevel"/>
-    <w:tmpl w:val="90FC973E"/>
-    <w:lvl w:ilvl="0">
-      <w:start w:val="1"/>
-      <w:numFmt w:val="decimal"/>
-      <w:lvlText w:val="%1."/>
-      <w:lvlJc w:val="left"/>
-      <w:pPr>
-        <w:tabs>
-          <w:tab w:val="num" w:pos="720"/>
-        </w:tabs>
-        <w:ind w:left="720" w:hanging="360"/>
-      </w:pPr>
-    </w:lvl>
-    <w:lvl w:ilvl="1" w:tentative="1">
-      <w:start w:val="1"/>
-      <w:numFmt w:val="decimal"/>
-      <w:lvlText w:val="%2."/>
-      <w:lvlJc w:val="left"/>
-      <w:pPr>
-        <w:tabs>
-          <w:tab w:val="num" w:pos="1440"/>
-        </w:tabs>
-        <w:ind w:left="1440" w:hanging="360"/>
-      </w:pPr>
-    </w:lvl>
-    <w:lvl w:ilvl="2" w:tentative="1">
-      <w:start w:val="1"/>
-      <w:numFmt w:val="decimal"/>
-      <w:lvlText w:val="%3."/>
-      <w:lvlJc w:val="left"/>
-      <w:pPr>
-        <w:tabs>
-          <w:tab w:val="num" w:pos="2160"/>
-        </w:tabs>
-        <w:ind w:left="2160" w:hanging="360"/>
-      </w:pPr>
-    </w:lvl>
-    <w:lvl w:ilvl="3" w:tentative="1">
-      <w:start w:val="1"/>
-      <w:numFmt w:val="decimal"/>
-      <w:lvlText w:val="%4."/>
-      <w:lvlJc w:val="left"/>
-      <w:pPr>
-        <w:tabs>
-          <w:tab w:val="num" w:pos="2880"/>
-        </w:tabs>
-        <w:ind w:left="2880" w:hanging="360"/>
-      </w:pPr>
-    </w:lvl>
-    <w:lvl w:ilvl="4" w:tentative="1">
-      <w:start w:val="1"/>
-      <w:numFmt w:val="decimal"/>
-      <w:lvlText w:val="%5."/>
-      <w:lvlJc w:val="left"/>
-      <w:pPr>
-        <w:tabs>
-          <w:tab w:val="num" w:pos="3600"/>
-        </w:tabs>
-        <w:ind w:left="3600" w:hanging="360"/>
-      </w:pPr>
-    </w:lvl>
-    <w:lvl w:ilvl="5" w:tentative="1">
-      <w:start w:val="1"/>
-      <w:numFmt w:val="decimal"/>
-      <w:lvlText w:val="%6."/>
-      <w:lvlJc w:val="left"/>
-      <w:pPr>
-        <w:tabs>
-          <w:tab w:val="num" w:pos="4320"/>
-        </w:tabs>
-        <w:ind w:left="4320" w:hanging="360"/>
-      </w:pPr>
-    </w:lvl>
-    <w:lvl w:ilvl="6" w:tentative="1">
-      <w:start w:val="1"/>
-      <w:numFmt w:val="decimal"/>
-      <w:lvlText w:val="%7."/>
-      <w:lvlJc w:val="left"/>
-      <w:pPr>
-        <w:tabs>
-          <w:tab w:val="num" w:pos="5040"/>
-        </w:tabs>
-        <w:ind w:left="5040" w:hanging="360"/>
-      </w:pPr>
-    </w:lvl>
-    <w:lvl w:ilvl="7" w:tentative="1">
-      <w:start w:val="1"/>
-      <w:numFmt w:val="decimal"/>
-      <w:lvlText w:val="%8."/>
-      <w:lvlJc w:val="left"/>
-      <w:pPr>
-        <w:tabs>
-          <w:tab w:val="num" w:pos="5760"/>
-        </w:tabs>
-        <w:ind w:left="5760" w:hanging="360"/>
-      </w:pPr>
-    </w:lvl>
-    <w:lvl w:ilvl="8" w:tentative="1">
-      <w:start w:val="1"/>
-      <w:numFmt w:val="decimal"/>
-      <w:lvlText w:val="%9."/>
-      <w:lvlJc w:val="left"/>
-      <w:pPr>
-        <w:tabs>
-          <w:tab w:val="num" w:pos="6480"/>
-        </w:tabs>
-        <w:ind w:left="6480" w:hanging="360"/>
-      </w:pPr>
-    </w:lvl>
-  </w:abstractNum>
-  <w:abstractNum w:abstractNumId="5" w15:restartNumberingAfterBreak="0">
-    <w:nsid w:val="43543CBD"/>
-    <w:multiLevelType w:val="multilevel"/>
-    <w:tmpl w:val="BE624E22"/>
-    <w:lvl w:ilvl="0">
-      <w:start w:val="1"/>
-      <w:numFmt w:val="decimal"/>
-      <w:lvlText w:val="%1."/>
-      <w:lvlJc w:val="left"/>
-      <w:pPr>
-        <w:tabs>
-          <w:tab w:val="num" w:pos="720"/>
-        </w:tabs>
-        <w:ind w:left="720" w:hanging="360"/>
-      </w:pPr>
-    </w:lvl>
-    <w:lvl w:ilvl="1" w:tentative="1">
-      <w:start w:val="1"/>
-      <w:numFmt w:val="decimal"/>
-      <w:lvlText w:val="%2."/>
-      <w:lvlJc w:val="left"/>
-      <w:pPr>
-        <w:tabs>
-          <w:tab w:val="num" w:pos="1440"/>
-        </w:tabs>
-        <w:ind w:left="1440" w:hanging="360"/>
-      </w:pPr>
-    </w:lvl>
-    <w:lvl w:ilvl="2" w:tentative="1">
-      <w:start w:val="1"/>
-      <w:numFmt w:val="decimal"/>
-      <w:lvlText w:val="%3."/>
-      <w:lvlJc w:val="left"/>
-      <w:pPr>
-        <w:tabs>
-          <w:tab w:val="num" w:pos="2160"/>
-        </w:tabs>
-        <w:ind w:left="2160" w:hanging="360"/>
-      </w:pPr>
-    </w:lvl>
-    <w:lvl w:ilvl="3" w:tentative="1">
-      <w:start w:val="1"/>
-      <w:numFmt w:val="decimal"/>
-      <w:lvlText w:val="%4."/>
-      <w:lvlJc w:val="left"/>
-      <w:pPr>
-        <w:tabs>
-          <w:tab w:val="num" w:pos="2880"/>
-        </w:tabs>
-        <w:ind w:left="2880" w:hanging="360"/>
-      </w:pPr>
-    </w:lvl>
-    <w:lvl w:ilvl="4" w:tentative="1">
-      <w:start w:val="1"/>
-      <w:numFmt w:val="decimal"/>
-      <w:lvlText w:val="%5."/>
-      <w:lvlJc w:val="left"/>
-      <w:pPr>
-        <w:tabs>
-          <w:tab w:val="num" w:pos="3600"/>
-        </w:tabs>
-        <w:ind w:left="3600" w:hanging="360"/>
-      </w:pPr>
-    </w:lvl>
-    <w:lvl w:ilvl="5" w:tentative="1">
-      <w:start w:val="1"/>
-      <w:numFmt w:val="decimal"/>
-      <w:lvlText w:val="%6."/>
-      <w:lvlJc w:val="left"/>
-      <w:pPr>
-        <w:tabs>
-          <w:tab w:val="num" w:pos="4320"/>
-        </w:tabs>
-        <w:ind w:left="4320" w:hanging="360"/>
-      </w:pPr>
-    </w:lvl>
-    <w:lvl w:ilvl="6" w:tentative="1">
-      <w:start w:val="1"/>
-      <w:numFmt w:val="decimal"/>
-      <w:lvlText w:val="%7."/>
-      <w:lvlJc w:val="left"/>
-      <w:pPr>
-        <w:tabs>
-          <w:tab w:val="num" w:pos="5040"/>
-        </w:tabs>
-        <w:ind w:left="5040" w:hanging="360"/>
-      </w:pPr>
-    </w:lvl>
-    <w:lvl w:ilvl="7" w:tentative="1">
-      <w:start w:val="1"/>
-      <w:numFmt w:val="decimal"/>
-      <w:lvlText w:val="%8."/>
-      <w:lvlJc w:val="left"/>
-      <w:pPr>
-        <w:tabs>
-          <w:tab w:val="num" w:pos="5760"/>
-        </w:tabs>
-        <w:ind w:left="5760" w:hanging="360"/>
-      </w:pPr>
-    </w:lvl>
-    <w:lvl w:ilvl="8" w:tentative="1">
-      <w:start w:val="1"/>
-      <w:numFmt w:val="decimal"/>
-      <w:lvlText w:val="%9."/>
-      <w:lvlJc w:val="left"/>
-      <w:pPr>
-        <w:tabs>
-          <w:tab w:val="num" w:pos="6480"/>
-        </w:tabs>
-        <w:ind w:left="6480" w:hanging="360"/>
-      </w:pPr>
-    </w:lvl>
-  </w:abstractNum>
-  <w:abstractNum w:abstractNumId="6" w15:restartNumberingAfterBreak="0">
-    <w:nsid w:val="45756F6B"/>
-    <w:multiLevelType w:val="multilevel"/>
-    <w:tmpl w:val="FD3C9FB8"/>
+    <w:tmpl w:val="A11ADBB2"/>
     <w:lvl w:ilvl="0">
       <w:start w:val="1"/>
       <w:numFmt w:val="bullet"/>
@@ -24838,10 +24612,10 @@
       </w:rPr>
     </w:lvl>
   </w:abstractNum>
-  <w:abstractNum w:abstractNumId="7" w15:restartNumberingAfterBreak="0">
-    <w:nsid w:val="4B59547D"/>
+  <w:abstractNum w:abstractNumId="5" w15:restartNumberingAfterBreak="0">
+    <w:nsid w:val="4A3B0869"/>
     <w:multiLevelType w:val="multilevel"/>
-    <w:tmpl w:val="15801B1E"/>
+    <w:tmpl w:val="C6D098C4"/>
     <w:lvl w:ilvl="0">
       <w:start w:val="1"/>
       <w:numFmt w:val="bullet"/>
@@ -24987,10 +24761,10 @@
       </w:rPr>
     </w:lvl>
   </w:abstractNum>
-  <w:abstractNum w:abstractNumId="8" w15:restartNumberingAfterBreak="0">
-    <w:nsid w:val="509A685F"/>
+  <w:abstractNum w:abstractNumId="6" w15:restartNumberingAfterBreak="0">
+    <w:nsid w:val="69620FB5"/>
     <w:multiLevelType w:val="multilevel"/>
-    <w:tmpl w:val="B5868524"/>
+    <w:tmpl w:val="8F86AB48"/>
     <w:lvl w:ilvl="0">
       <w:start w:val="1"/>
       <w:numFmt w:val="bullet"/>
@@ -25136,10 +24910,10 @@
       </w:rPr>
     </w:lvl>
   </w:abstractNum>
-  <w:abstractNum w:abstractNumId="9" w15:restartNumberingAfterBreak="0">
-    <w:nsid w:val="6DFE0513"/>
+  <w:abstractNum w:abstractNumId="7" w15:restartNumberingAfterBreak="0">
+    <w:nsid w:val="6C85721E"/>
     <w:multiLevelType w:val="multilevel"/>
-    <w:tmpl w:val="BB6CAC9E"/>
+    <w:tmpl w:val="81CAA4BE"/>
     <w:lvl w:ilvl="0">
       <w:start w:val="1"/>
       <w:numFmt w:val="bullet"/>
@@ -25285,10 +25059,10 @@
       </w:rPr>
     </w:lvl>
   </w:abstractNum>
-  <w:abstractNum w:abstractNumId="10" w15:restartNumberingAfterBreak="0">
-    <w:nsid w:val="75EF2269"/>
+  <w:abstractNum w:abstractNumId="8" w15:restartNumberingAfterBreak="0">
+    <w:nsid w:val="71035E2F"/>
     <w:multiLevelType w:val="multilevel"/>
-    <w:tmpl w:val="85708DD8"/>
+    <w:tmpl w:val="D820F9BA"/>
     <w:lvl w:ilvl="0">
       <w:start w:val="1"/>
       <w:numFmt w:val="bullet"/>
@@ -25434,38 +25208,264 @@
       </w:rPr>
     </w:lvl>
   </w:abstractNum>
-  <w:num w:numId="1" w16cid:durableId="1606157647">
+  <w:abstractNum w:abstractNumId="9" w15:restartNumberingAfterBreak="0">
+    <w:nsid w:val="737B0B01"/>
+    <w:multiLevelType w:val="multilevel"/>
+    <w:tmpl w:val="93549EFA"/>
+    <w:lvl w:ilvl="0">
+      <w:start w:val="1"/>
+      <w:numFmt w:val="decimal"/>
+      <w:lvlText w:val="%1."/>
+      <w:lvlJc w:val="left"/>
+      <w:pPr>
+        <w:tabs>
+          <w:tab w:val="num" w:pos="720"/>
+        </w:tabs>
+        <w:ind w:left="720" w:hanging="360"/>
+      </w:pPr>
+    </w:lvl>
+    <w:lvl w:ilvl="1" w:tentative="1">
+      <w:start w:val="1"/>
+      <w:numFmt w:val="decimal"/>
+      <w:lvlText w:val="%2."/>
+      <w:lvlJc w:val="left"/>
+      <w:pPr>
+        <w:tabs>
+          <w:tab w:val="num" w:pos="1440"/>
+        </w:tabs>
+        <w:ind w:left="1440" w:hanging="360"/>
+      </w:pPr>
+    </w:lvl>
+    <w:lvl w:ilvl="2" w:tentative="1">
+      <w:start w:val="1"/>
+      <w:numFmt w:val="decimal"/>
+      <w:lvlText w:val="%3."/>
+      <w:lvlJc w:val="left"/>
+      <w:pPr>
+        <w:tabs>
+          <w:tab w:val="num" w:pos="2160"/>
+        </w:tabs>
+        <w:ind w:left="2160" w:hanging="360"/>
+      </w:pPr>
+    </w:lvl>
+    <w:lvl w:ilvl="3" w:tentative="1">
+      <w:start w:val="1"/>
+      <w:numFmt w:val="decimal"/>
+      <w:lvlText w:val="%4."/>
+      <w:lvlJc w:val="left"/>
+      <w:pPr>
+        <w:tabs>
+          <w:tab w:val="num" w:pos="2880"/>
+        </w:tabs>
+        <w:ind w:left="2880" w:hanging="360"/>
+      </w:pPr>
+    </w:lvl>
+    <w:lvl w:ilvl="4" w:tentative="1">
+      <w:start w:val="1"/>
+      <w:numFmt w:val="decimal"/>
+      <w:lvlText w:val="%5."/>
+      <w:lvlJc w:val="left"/>
+      <w:pPr>
+        <w:tabs>
+          <w:tab w:val="num" w:pos="3600"/>
+        </w:tabs>
+        <w:ind w:left="3600" w:hanging="360"/>
+      </w:pPr>
+    </w:lvl>
+    <w:lvl w:ilvl="5" w:tentative="1">
+      <w:start w:val="1"/>
+      <w:numFmt w:val="decimal"/>
+      <w:lvlText w:val="%6."/>
+      <w:lvlJc w:val="left"/>
+      <w:pPr>
+        <w:tabs>
+          <w:tab w:val="num" w:pos="4320"/>
+        </w:tabs>
+        <w:ind w:left="4320" w:hanging="360"/>
+      </w:pPr>
+    </w:lvl>
+    <w:lvl w:ilvl="6" w:tentative="1">
+      <w:start w:val="1"/>
+      <w:numFmt w:val="decimal"/>
+      <w:lvlText w:val="%7."/>
+      <w:lvlJc w:val="left"/>
+      <w:pPr>
+        <w:tabs>
+          <w:tab w:val="num" w:pos="5040"/>
+        </w:tabs>
+        <w:ind w:left="5040" w:hanging="360"/>
+      </w:pPr>
+    </w:lvl>
+    <w:lvl w:ilvl="7" w:tentative="1">
+      <w:start w:val="1"/>
+      <w:numFmt w:val="decimal"/>
+      <w:lvlText w:val="%8."/>
+      <w:lvlJc w:val="left"/>
+      <w:pPr>
+        <w:tabs>
+          <w:tab w:val="num" w:pos="5760"/>
+        </w:tabs>
+        <w:ind w:left="5760" w:hanging="360"/>
+      </w:pPr>
+    </w:lvl>
+    <w:lvl w:ilvl="8" w:tentative="1">
+      <w:start w:val="1"/>
+      <w:numFmt w:val="decimal"/>
+      <w:lvlText w:val="%9."/>
+      <w:lvlJc w:val="left"/>
+      <w:pPr>
+        <w:tabs>
+          <w:tab w:val="num" w:pos="6480"/>
+        </w:tabs>
+        <w:ind w:left="6480" w:hanging="360"/>
+      </w:pPr>
+    </w:lvl>
+  </w:abstractNum>
+  <w:abstractNum w:abstractNumId="10" w15:restartNumberingAfterBreak="0">
+    <w:nsid w:val="7BBF31DE"/>
+    <w:multiLevelType w:val="multilevel"/>
+    <w:tmpl w:val="7AF2F866"/>
+    <w:lvl w:ilvl="0">
+      <w:start w:val="1"/>
+      <w:numFmt w:val="decimal"/>
+      <w:lvlText w:val="%1."/>
+      <w:lvlJc w:val="left"/>
+      <w:pPr>
+        <w:tabs>
+          <w:tab w:val="num" w:pos="720"/>
+        </w:tabs>
+        <w:ind w:left="720" w:hanging="360"/>
+      </w:pPr>
+    </w:lvl>
+    <w:lvl w:ilvl="1" w:tentative="1">
+      <w:start w:val="1"/>
+      <w:numFmt w:val="decimal"/>
+      <w:lvlText w:val="%2."/>
+      <w:lvlJc w:val="left"/>
+      <w:pPr>
+        <w:tabs>
+          <w:tab w:val="num" w:pos="1440"/>
+        </w:tabs>
+        <w:ind w:left="1440" w:hanging="360"/>
+      </w:pPr>
+    </w:lvl>
+    <w:lvl w:ilvl="2" w:tentative="1">
+      <w:start w:val="1"/>
+      <w:numFmt w:val="decimal"/>
+      <w:lvlText w:val="%3."/>
+      <w:lvlJc w:val="left"/>
+      <w:pPr>
+        <w:tabs>
+          <w:tab w:val="num" w:pos="2160"/>
+        </w:tabs>
+        <w:ind w:left="2160" w:hanging="360"/>
+      </w:pPr>
+    </w:lvl>
+    <w:lvl w:ilvl="3" w:tentative="1">
+      <w:start w:val="1"/>
+      <w:numFmt w:val="decimal"/>
+      <w:lvlText w:val="%4."/>
+      <w:lvlJc w:val="left"/>
+      <w:pPr>
+        <w:tabs>
+          <w:tab w:val="num" w:pos="2880"/>
+        </w:tabs>
+        <w:ind w:left="2880" w:hanging="360"/>
+      </w:pPr>
+    </w:lvl>
+    <w:lvl w:ilvl="4" w:tentative="1">
+      <w:start w:val="1"/>
+      <w:numFmt w:val="decimal"/>
+      <w:lvlText w:val="%5."/>
+      <w:lvlJc w:val="left"/>
+      <w:pPr>
+        <w:tabs>
+          <w:tab w:val="num" w:pos="3600"/>
+        </w:tabs>
+        <w:ind w:left="3600" w:hanging="360"/>
+      </w:pPr>
+    </w:lvl>
+    <w:lvl w:ilvl="5" w:tentative="1">
+      <w:start w:val="1"/>
+      <w:numFmt w:val="decimal"/>
+      <w:lvlText w:val="%6."/>
+      <w:lvlJc w:val="left"/>
+      <w:pPr>
+        <w:tabs>
+          <w:tab w:val="num" w:pos="4320"/>
+        </w:tabs>
+        <w:ind w:left="4320" w:hanging="360"/>
+      </w:pPr>
+    </w:lvl>
+    <w:lvl w:ilvl="6" w:tentative="1">
+      <w:start w:val="1"/>
+      <w:numFmt w:val="decimal"/>
+      <w:lvlText w:val="%7."/>
+      <w:lvlJc w:val="left"/>
+      <w:pPr>
+        <w:tabs>
+          <w:tab w:val="num" w:pos="5040"/>
+        </w:tabs>
+        <w:ind w:left="5040" w:hanging="360"/>
+      </w:pPr>
+    </w:lvl>
+    <w:lvl w:ilvl="7" w:tentative="1">
+      <w:start w:val="1"/>
+      <w:numFmt w:val="decimal"/>
+      <w:lvlText w:val="%8."/>
+      <w:lvlJc w:val="left"/>
+      <w:pPr>
+        <w:tabs>
+          <w:tab w:val="num" w:pos="5760"/>
+        </w:tabs>
+        <w:ind w:left="5760" w:hanging="360"/>
+      </w:pPr>
+    </w:lvl>
+    <w:lvl w:ilvl="8" w:tentative="1">
+      <w:start w:val="1"/>
+      <w:numFmt w:val="decimal"/>
+      <w:lvlText w:val="%9."/>
+      <w:lvlJc w:val="left"/>
+      <w:pPr>
+        <w:tabs>
+          <w:tab w:val="num" w:pos="6480"/>
+        </w:tabs>
+        <w:ind w:left="6480" w:hanging="360"/>
+      </w:pPr>
+    </w:lvl>
+  </w:abstractNum>
+  <w:num w:numId="1" w16cid:durableId="1957171621">
+    <w:abstractNumId w:val="1"/>
+  </w:num>
+  <w:num w:numId="2" w16cid:durableId="100802977">
+    <w:abstractNumId w:val="3"/>
+  </w:num>
+  <w:num w:numId="3" w16cid:durableId="928730432">
     <w:abstractNumId w:val="6"/>
   </w:num>
-  <w:num w:numId="2" w16cid:durableId="2143887726">
+  <w:num w:numId="4" w16cid:durableId="1964847909">
+    <w:abstractNumId w:val="8"/>
+  </w:num>
+  <w:num w:numId="5" w16cid:durableId="1164323136">
+    <w:abstractNumId w:val="0"/>
+  </w:num>
+  <w:num w:numId="6" w16cid:durableId="1154298169">
+    <w:abstractNumId w:val="7"/>
+  </w:num>
+  <w:num w:numId="7" w16cid:durableId="52122548">
+    <w:abstractNumId w:val="5"/>
+  </w:num>
+  <w:num w:numId="8" w16cid:durableId="1819102667">
+    <w:abstractNumId w:val="4"/>
+  </w:num>
+  <w:num w:numId="9" w16cid:durableId="828520160">
+    <w:abstractNumId w:val="9"/>
+  </w:num>
+  <w:num w:numId="10" w16cid:durableId="2034071913">
     <w:abstractNumId w:val="10"/>
   </w:num>
-  <w:num w:numId="3" w16cid:durableId="1268000294">
-    <w:abstractNumId w:val="7"/>
-  </w:num>
-  <w:num w:numId="4" w16cid:durableId="804590883">
-    <w:abstractNumId w:val="3"/>
-  </w:num>
-  <w:num w:numId="5" w16cid:durableId="76100616">
-    <w:abstractNumId w:val="1"/>
-  </w:num>
-  <w:num w:numId="6" w16cid:durableId="1304965163">
+  <w:num w:numId="11" w16cid:durableId="1492335929">
     <w:abstractNumId w:val="2"/>
-  </w:num>
-  <w:num w:numId="7" w16cid:durableId="428235046">
-    <w:abstractNumId w:val="8"/>
-  </w:num>
-  <w:num w:numId="8" w16cid:durableId="1778327976">
-    <w:abstractNumId w:val="9"/>
-  </w:num>
-  <w:num w:numId="9" w16cid:durableId="1777870438">
-    <w:abstractNumId w:val="4"/>
-  </w:num>
-  <w:num w:numId="10" w16cid:durableId="1925533939">
-    <w:abstractNumId w:val="5"/>
-  </w:num>
-  <w:num w:numId="11" w16cid:durableId="516312062">
-    <w:abstractNumId w:val="0"/>
   </w:num>
 </w:numbering>
 </file>

</xml_diff>